<commit_message>
Word-Export auf Angebot Logimat DE.docx umstellen
Aktive Vorlage ist die neue Logimat-Datei. Zerrissene Platzhalter
wurden bereinigt; Export befüllt nur noch dieses eine Dokument.

Co-authored-by: msobona <msobona@users.noreply.github.com>
</commit_message>
<xml_diff>
--- a/docs/templates/Angebot Logimat DE.docx
+++ b/docs/templates/Angebot Logimat DE.docx
@@ -12,328 +12,25 @@
         <w:rPr>
           <w:noProof/>
         </w:rPr>
-        <w:drawing>
-          <wp:anchor distT="0" distB="0" distL="114300" distR="114300" simplePos="0" relativeHeight="251632127" behindDoc="1" locked="0" layoutInCell="1" allowOverlap="1" wp14:anchorId="307E5AE9" wp14:editId="3EF8594B">
-            <wp:simplePos x="0" y="0"/>
-            <wp:positionH relativeFrom="leftMargin">
-              <wp:posOffset>5080</wp:posOffset>
-            </wp:positionH>
-            <wp:positionV relativeFrom="paragraph">
-              <wp:posOffset>-2260287</wp:posOffset>
-            </wp:positionV>
-            <wp:extent cx="7560000" cy="10674000"/>
-            <wp:effectExtent l="0" t="0" r="3175" b="0"/>
-            <wp:wrapNone/>
-            <wp:docPr id="18" name="Grafik 18" descr="C:\Users\johunwu\AppData\Local\Microsoft\Windows\INetCache\Content.Word\SLL_Titelmotiv.jpg"/>
-            <wp:cNvGraphicFramePr/>
-            <a:graphic xmlns:a="http://schemas.openxmlformats.org/drawingml/2006/main">
-              <a:graphicData uri="http://schemas.openxmlformats.org/drawingml/2006/picture">
-                <pic:pic xmlns:pic="http://schemas.openxmlformats.org/drawingml/2006/picture">
-                  <pic:nvPicPr>
-                    <pic:cNvPr id="40" name="Grafik 40" descr="C:\Users\johunwu\AppData\Local\Microsoft\Windows\INetCache\Content.Word\SLL_Titelmotiv.jpg"/>
-                    <pic:cNvPicPr/>
-                  </pic:nvPicPr>
-                  <pic:blipFill>
-                    <a:blip r:embed="rId11" cstate="print">
-                      <a:extLst>
-                        <a:ext uri="{28A0092B-C50C-407E-A947-70E740481C1C}">
-                          <a14:useLocalDpi xmlns:a14="http://schemas.microsoft.com/office/drawing/2010/main" val="0"/>
-                        </a:ext>
-                      </a:extLst>
-                    </a:blip>
-                    <a:srcRect/>
-                    <a:stretch>
-                      <a:fillRect/>
-                    </a:stretch>
-                  </pic:blipFill>
-                  <pic:spPr bwMode="auto">
-                    <a:xfrm>
-                      <a:off x="0" y="0"/>
-                      <a:ext cx="7560000" cy="10674000"/>
-                    </a:xfrm>
-                    <a:prstGeom prst="rect">
-                      <a:avLst/>
-                    </a:prstGeom>
-                    <a:noFill/>
-                    <a:ln>
-                      <a:noFill/>
-                    </a:ln>
-                  </pic:spPr>
-                </pic:pic>
-              </a:graphicData>
-            </a:graphic>
-            <wp14:sizeRelH relativeFrom="page">
-              <wp14:pctWidth>0</wp14:pctWidth>
-            </wp14:sizeRelH>
-            <wp14:sizeRelV relativeFrom="page">
-              <wp14:pctHeight>0</wp14:pctHeight>
-            </wp14:sizeRelV>
-          </wp:anchor>
-        </w:drawing>
+        <w:t>{{titel}}</w:t>
       </w:r>
       <w:r>
         <w:rPr>
           <w:noProof/>
-          <w:lang w:val="de-DE" w:eastAsia="de-DE"/>
-        </w:rPr>
-        <mc:AlternateContent>
-          <mc:Choice Requires="wps">
-            <w:drawing>
-              <wp:anchor distT="0" distB="0" distL="114300" distR="114300" simplePos="0" relativeHeight="251661824" behindDoc="0" locked="0" layoutInCell="1" allowOverlap="1" wp14:anchorId="535DBA41" wp14:editId="24642FD4">
-                <wp:simplePos x="0" y="0"/>
-                <wp:positionH relativeFrom="column">
-                  <wp:posOffset>-888365</wp:posOffset>
-                </wp:positionH>
-                <wp:positionV relativeFrom="paragraph">
-                  <wp:posOffset>65074</wp:posOffset>
-                </wp:positionV>
-                <wp:extent cx="3227705" cy="548640"/>
-                <wp:effectExtent l="0" t="0" r="0" b="3810"/>
-                <wp:wrapNone/>
-                <wp:docPr id="4" name="Textfeld 4"/>
-                <wp:cNvGraphicFramePr/>
-                <a:graphic xmlns:a="http://schemas.openxmlformats.org/drawingml/2006/main">
-                  <a:graphicData uri="http://schemas.microsoft.com/office/word/2010/wordprocessingShape">
-                    <wps:wsp>
-                      <wps:cNvSpPr txBox="1"/>
-                      <wps:spPr>
-                        <a:xfrm>
-                          <a:off x="0" y="0"/>
-                          <a:ext cx="3227705" cy="548640"/>
-                        </a:xfrm>
-                        <a:prstGeom prst="rect">
-                          <a:avLst/>
-                        </a:prstGeom>
-                        <a:noFill/>
-                        <a:ln w="6350">
-                          <a:noFill/>
-                        </a:ln>
-                      </wps:spPr>
-                      <wps:txbx>
-                        <w:txbxContent>
-                          <w:p>
-                            <w:pPr>
-                              <w:ind w:firstLine="142"/>
-                              <w:rPr>
-                                <w:b/>
-                                <w:bCs/>
-                                <w:sz w:val="44"/>
-                                <w:szCs w:val="44"/>
-                              </w:rPr>
-                            </w:pPr>
-                            <w:r>
-                              <w:rPr>
-                                <w:b/>
-                                <w:bCs/>
-                                <w:sz w:val="44"/>
-                                <w:szCs w:val="44"/>
-                              </w:rPr>
-                              <w:t>{{</w:t>
-                            </w:r>
-                            <w:proofErr w:type="spellStart"/>
-                            <w:r>
-                              <w:rPr>
-                                <w:b/>
-                                <w:bCs/>
-                                <w:sz w:val="44"/>
-                                <w:szCs w:val="44"/>
-                              </w:rPr>
-                              <w:t>titel</w:t>
-                            </w:r>
-                            <w:proofErr w:type="spellEnd"/>
-                            <w:r>
-                              <w:rPr>
-                                <w:b/>
-                                <w:bCs/>
-                                <w:sz w:val="44"/>
-                                <w:szCs w:val="44"/>
-                              </w:rPr>
-                              <w:t>}}</w:t>
-                            </w:r>
-                            <w:r>
-                              <w:rPr>
-                                <w:b/>
-                                <w:bCs/>
-                                <w:sz w:val="44"/>
-                                <w:szCs w:val="44"/>
-                              </w:rPr>
-                              <w:t xml:space="preserve"> </w:t>
-                            </w:r>
-                          </w:p>
-                          <w:p>
-                            <w:pPr>
-                              <w:ind w:firstLine="142"/>
-                              <w:rPr>
-                                <w:b/>
-                                <w:bCs/>
-                              </w:rPr>
-                            </w:pPr>
-                            <w:r>
-                              <w:rPr>
-                                <w:b/>
-                                <w:bCs/>
-                              </w:rPr>
-                              <w:fldChar w:fldCharType="begin"/>
-                            </w:r>
-                            <w:r>
-                              <w:rPr>
-                                <w:b/>
-                                <w:bCs/>
-                              </w:rPr>
-                              <w:instrText xml:space="preserve"> TIME \@ "dd.MM.yyyy" </w:instrText>
-                            </w:r>
-                            <w:r>
-                              <w:rPr>
-                                <w:b/>
-                                <w:bCs/>
-                              </w:rPr>
-                              <w:fldChar w:fldCharType="separate"/>
-                            </w:r>
-                            <w:r>
-                              <w:rPr>
-                                <w:b/>
-                                <w:bCs/>
-                                <w:noProof/>
-                              </w:rPr>
-                              <w:t>20.07.2026</w:t>
-                            </w:r>
-                            <w:r>
-                              <w:rPr>
-                                <w:b/>
-                                <w:bCs/>
-                              </w:rPr>
-                              <w:fldChar w:fldCharType="end"/>
-                            </w:r>
-                          </w:p>
-                        </w:txbxContent>
-                      </wps:txbx>
-                      <wps:bodyPr rot="0" spcFirstLastPara="0" vertOverflow="overflow" horzOverflow="overflow" vert="horz" wrap="square" lIns="91440" tIns="45720" rIns="91440" bIns="45720" numCol="1" spcCol="0" rtlCol="0" fromWordArt="0" anchor="ctr" anchorCtr="0" forceAA="0" compatLnSpc="1">
-                        <a:prstTxWarp prst="textNoShape">
-                          <a:avLst/>
-                        </a:prstTxWarp>
-                        <a:noAutofit/>
-                      </wps:bodyPr>
-                    </wps:wsp>
-                  </a:graphicData>
-                </a:graphic>
-                <wp14:sizeRelH relativeFrom="margin">
-                  <wp14:pctWidth>0</wp14:pctWidth>
-                </wp14:sizeRelH>
-                <wp14:sizeRelV relativeFrom="margin">
-                  <wp14:pctHeight>0</wp14:pctHeight>
-                </wp14:sizeRelV>
-              </wp:anchor>
-            </w:drawing>
-          </mc:Choice>
-          <mc:Fallback>
-            <w:pict>
-              <v:shapetype w14:anchorId="535DBA41" id="_x0000_t202" coordsize="21600,21600" o:spt="202" path="m,l,21600r21600,l21600,xe">
-                <v:stroke joinstyle="miter"/>
-                <v:path gradientshapeok="t" o:connecttype="rect"/>
-              </v:shapetype>
-              <v:shape id="Textfeld 4" o:spid="_x0000_s1026" type="#_x0000_t202" style="position:absolute;margin-left:-69.95pt;margin-top:5.1pt;width:254.15pt;height:43.2pt;z-index:251661824;visibility:visible;mso-wrap-style:square;mso-width-percent:0;mso-height-percent:0;mso-wrap-distance-left:9pt;mso-wrap-distance-top:0;mso-wrap-distance-right:9pt;mso-wrap-distance-bottom:0;mso-position-horizontal:absolute;mso-position-horizontal-relative:text;mso-position-vertical:absolute;mso-position-vertical-relative:text;mso-width-percent:0;mso-height-percent:0;mso-width-relative:margin;mso-height-relative:margin;v-text-anchor:middle" o:gfxdata="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" filled="f" stroked="f" strokeweight=".5pt">
-                <v:textbox>
-                  <w:txbxContent>
-                    <w:p>
-                      <w:pPr>
-                        <w:ind w:firstLine="142"/>
-                        <w:rPr>
-                          <w:b/>
-                          <w:bCs/>
-                          <w:sz w:val="44"/>
-                          <w:szCs w:val="44"/>
-                        </w:rPr>
-                      </w:pPr>
-                      <w:r>
-                        <w:rPr>
-                          <w:b/>
-                          <w:bCs/>
-                          <w:sz w:val="44"/>
-                          <w:szCs w:val="44"/>
-                        </w:rPr>
-                        <w:t>{{</w:t>
-                      </w:r>
-                      <w:proofErr w:type="spellStart"/>
-                      <w:r>
-                        <w:rPr>
-                          <w:b/>
-                          <w:bCs/>
-                          <w:sz w:val="44"/>
-                          <w:szCs w:val="44"/>
-                        </w:rPr>
-                        <w:t>titel</w:t>
-                      </w:r>
-                      <w:proofErr w:type="spellEnd"/>
-                      <w:r>
-                        <w:rPr>
-                          <w:b/>
-                          <w:bCs/>
-                          <w:sz w:val="44"/>
-                          <w:szCs w:val="44"/>
-                        </w:rPr>
-                        <w:t>}}</w:t>
-                      </w:r>
-                      <w:r>
-                        <w:rPr>
-                          <w:b/>
-                          <w:bCs/>
-                          <w:sz w:val="44"/>
-                          <w:szCs w:val="44"/>
-                        </w:rPr>
-                        <w:t xml:space="preserve"> </w:t>
-                      </w:r>
-                    </w:p>
-                    <w:p>
-                      <w:pPr>
-                        <w:ind w:firstLine="142"/>
-                        <w:rPr>
-                          <w:b/>
-                          <w:bCs/>
-                        </w:rPr>
-                      </w:pPr>
-                      <w:r>
-                        <w:rPr>
-                          <w:b/>
-                          <w:bCs/>
-                        </w:rPr>
-                        <w:fldChar w:fldCharType="begin"/>
-                      </w:r>
-                      <w:r>
-                        <w:rPr>
-                          <w:b/>
-                          <w:bCs/>
-                        </w:rPr>
-                        <w:instrText xml:space="preserve"> TIME \@ "dd.MM.yyyy" </w:instrText>
-                      </w:r>
-                      <w:r>
-                        <w:rPr>
-                          <w:b/>
-                          <w:bCs/>
-                        </w:rPr>
-                        <w:fldChar w:fldCharType="separate"/>
-                      </w:r>
-                      <w:r>
-                        <w:rPr>
-                          <w:b/>
-                          <w:bCs/>
-                          <w:noProof/>
-                        </w:rPr>
-                        <w:t>20.07.2026</w:t>
-                      </w:r>
-                      <w:r>
-                        <w:rPr>
-                          <w:b/>
-                          <w:bCs/>
-                        </w:rPr>
-                        <w:fldChar w:fldCharType="end"/>
-                      </w:r>
-                    </w:p>
-                  </w:txbxContent>
-                </v:textbox>
-              </v:shape>
-            </w:pict>
-          </mc:Fallback>
-        </mc:AlternateContent>
+        </w:rPr>
+        <w:t xml:space="preserve"> 20.07.2026</w:t>
+      </w:r>
+      <w:r>
+        <w:rPr>
+          <w:noProof/>
+        </w:rPr>
+        <w:t>{{titel}}</w:t>
+      </w:r>
+      <w:r>
+        <w:rPr>
+          <w:noProof/>
+        </w:rPr>
+        <w:t xml:space="preserve"> 20.07.2026</w:t>
       </w:r>
     </w:p>
     <w:p>
@@ -465,155 +162,13 @@
         <w:rPr>
           <w:noProof/>
         </w:rPr>
-        <mc:AlternateContent>
-          <mc:Choice Requires="wps">
-            <w:drawing>
-              <wp:anchor distT="45720" distB="45720" distL="114300" distR="114300" simplePos="0" relativeHeight="251753472" behindDoc="0" locked="0" layoutInCell="1" allowOverlap="1" wp14:anchorId="1AD26751" wp14:editId="14D24833">
-                <wp:simplePos x="0" y="0"/>
-                <wp:positionH relativeFrom="column">
-                  <wp:posOffset>-813435</wp:posOffset>
-                </wp:positionH>
-                <wp:positionV relativeFrom="paragraph">
-                  <wp:posOffset>223520</wp:posOffset>
-                </wp:positionV>
-                <wp:extent cx="3624580" cy="542925"/>
-                <wp:effectExtent l="0" t="0" r="0" b="0"/>
-                <wp:wrapSquare wrapText="bothSides"/>
-                <wp:docPr id="57" name="Textfeld 2"/>
-                <wp:cNvGraphicFramePr>
-                  <a:graphicFrameLocks xmlns:a="http://schemas.openxmlformats.org/drawingml/2006/main"/>
-                </wp:cNvGraphicFramePr>
-                <a:graphic xmlns:a="http://schemas.openxmlformats.org/drawingml/2006/main">
-                  <a:graphicData uri="http://schemas.microsoft.com/office/word/2010/wordprocessingShape">
-                    <wps:wsp>
-                      <wps:cNvSpPr txBox="1">
-                        <a:spLocks noChangeArrowheads="1"/>
-                      </wps:cNvSpPr>
-                      <wps:spPr bwMode="auto">
-                        <a:xfrm>
-                          <a:off x="0" y="0"/>
-                          <a:ext cx="3624580" cy="542925"/>
-                        </a:xfrm>
-                        <a:prstGeom prst="rect">
-                          <a:avLst/>
-                        </a:prstGeom>
-                        <a:noFill/>
-                        <a:ln w="9525">
-                          <a:noFill/>
-                          <a:miter lim="800000"/>
-                          <a:headEnd/>
-                          <a:tailEnd/>
-                        </a:ln>
-                      </wps:spPr>
-                      <wps:txbx>
-                        <w:txbxContent>
-                          <w:p>
-                            <w:pPr>
-                              <w:rPr>
-                                <w:b/>
-                                <w:bCs/>
-                                <w:sz w:val="28"/>
-                                <w:szCs w:val="28"/>
-                              </w:rPr>
-                            </w:pPr>
-                            <w:r>
-                              <w:rPr>
-                                <w:b/>
-                                <w:bCs/>
-                                <w:sz w:val="28"/>
-                                <w:szCs w:val="28"/>
-                              </w:rPr>
-                              <w:t>{{</w:t>
-                            </w:r>
-                            <w:proofErr w:type="spellStart"/>
-                            <w:r>
-                              <w:rPr>
-                                <w:b/>
-                                <w:bCs/>
-                                <w:sz w:val="28"/>
-                                <w:szCs w:val="28"/>
-                              </w:rPr>
-                              <w:t>untertitel</w:t>
-                            </w:r>
-                            <w:proofErr w:type="spellEnd"/>
-                            <w:r>
-                              <w:rPr>
-                                <w:b/>
-                                <w:bCs/>
-                                <w:sz w:val="28"/>
-                                <w:szCs w:val="28"/>
-                              </w:rPr>
-                              <w:t>}}</w:t>
-                            </w:r>
-                          </w:p>
-                        </w:txbxContent>
-                      </wps:txbx>
-                      <wps:bodyPr rot="0" vert="horz" wrap="square" lIns="91440" tIns="45720" rIns="91440" bIns="45720" anchor="ctr" anchorCtr="0">
-                        <a:noAutofit/>
-                      </wps:bodyPr>
-                    </wps:wsp>
-                  </a:graphicData>
-                </a:graphic>
-                <wp14:sizeRelH relativeFrom="margin">
-                  <wp14:pctWidth>0</wp14:pctWidth>
-                </wp14:sizeRelH>
-                <wp14:sizeRelV relativeFrom="margin">
-                  <wp14:pctHeight>0</wp14:pctHeight>
-                </wp14:sizeRelV>
-              </wp:anchor>
-            </w:drawing>
-          </mc:Choice>
-          <mc:Fallback>
-            <w:pict>
-              <v:shape w14:anchorId="1AD26751" id="Textfeld 2" o:spid="_x0000_s1027" type="#_x0000_t202" style="position:absolute;margin-left:-64.05pt;margin-top:17.6pt;width:285.4pt;height:42.75pt;z-index:251753472;visibility:visible;mso-wrap-style:square;mso-width-percent:0;mso-height-percent:0;mso-wrap-distance-left:9pt;mso-wrap-distance-top:3.6pt;mso-wrap-distance-right:9pt;mso-wrap-distance-bottom:3.6pt;mso-position-horizontal:absolute;mso-position-horizontal-relative:text;mso-position-vertical:absolute;mso-position-vertical-relative:text;mso-width-percent:0;mso-height-percent:0;mso-width-relative:margin;mso-height-relative:margin;v-text-anchor:middle" o:gfxdata="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" filled="f" stroked="f">
-                <v:textbox>
-                  <w:txbxContent>
-                    <w:p>
-                      <w:pPr>
-                        <w:rPr>
-                          <w:b/>
-                          <w:bCs/>
-                          <w:sz w:val="28"/>
-                          <w:szCs w:val="28"/>
-                        </w:rPr>
-                      </w:pPr>
-                      <w:r>
-                        <w:rPr>
-                          <w:b/>
-                          <w:bCs/>
-                          <w:sz w:val="28"/>
-                          <w:szCs w:val="28"/>
-                        </w:rPr>
-                        <w:t>{{</w:t>
-                      </w:r>
-                      <w:proofErr w:type="spellStart"/>
-                      <w:r>
-                        <w:rPr>
-                          <w:b/>
-                          <w:bCs/>
-                          <w:sz w:val="28"/>
-                          <w:szCs w:val="28"/>
-                        </w:rPr>
-                        <w:t>untertitel</w:t>
-                      </w:r>
-                      <w:proofErr w:type="spellEnd"/>
-                      <w:r>
-                        <w:rPr>
-                          <w:b/>
-                          <w:bCs/>
-                          <w:sz w:val="28"/>
-                          <w:szCs w:val="28"/>
-                        </w:rPr>
-                        <w:t>}}</w:t>
-                      </w:r>
-                    </w:p>
-                  </w:txbxContent>
-                </v:textbox>
-                <w10:wrap type="square"/>
-              </v:shape>
-            </w:pict>
-          </mc:Fallback>
-        </mc:AlternateContent>
+        <w:t>{{untertitel}}</w:t>
+      </w:r>
+      <w:r>
+        <w:rPr>
+          <w:noProof/>
+        </w:rPr>
+        <w:t>{{untertitel}}</w:t>
       </w:r>
     </w:p>
     <w:p/>
@@ -642,515 +197,121 @@
             <w:rPr>
               <w:noProof/>
             </w:rPr>
-            <mc:AlternateContent>
-              <mc:Choice Requires="wps">
-                <w:drawing>
-                  <wp:anchor distT="45720" distB="45720" distL="114300" distR="114300" simplePos="0" relativeHeight="251634176" behindDoc="1" locked="0" layoutInCell="1" allowOverlap="1" wp14:anchorId="622881BA" wp14:editId="4705950F">
-                    <wp:simplePos x="0" y="0"/>
-                    <wp:positionH relativeFrom="column">
-                      <wp:posOffset>3291560</wp:posOffset>
-                    </wp:positionH>
-                    <wp:positionV relativeFrom="paragraph">
-                      <wp:posOffset>13343</wp:posOffset>
-                    </wp:positionV>
-                    <wp:extent cx="3063833" cy="1908175"/>
-                    <wp:effectExtent l="0" t="0" r="3810" b="0"/>
-                    <wp:wrapNone/>
-                    <wp:docPr id="217" name="Textfeld 2"/>
-                    <wp:cNvGraphicFramePr>
-                      <a:graphicFrameLocks xmlns:a="http://schemas.openxmlformats.org/drawingml/2006/main"/>
-                    </wp:cNvGraphicFramePr>
-                    <a:graphic xmlns:a="http://schemas.openxmlformats.org/drawingml/2006/main">
-                      <a:graphicData uri="http://schemas.microsoft.com/office/word/2010/wordprocessingShape">
-                        <wps:wsp>
-                          <wps:cNvSpPr txBox="1">
-                            <a:spLocks noChangeArrowheads="1"/>
-                          </wps:cNvSpPr>
-                          <wps:spPr bwMode="auto">
-                            <a:xfrm>
-                              <a:off x="0" y="0"/>
-                              <a:ext cx="3063833" cy="1908175"/>
-                            </a:xfrm>
-                            <a:prstGeom prst="rect">
-                              <a:avLst/>
-                            </a:prstGeom>
-                            <a:solidFill>
-                              <a:schemeClr val="bg1">
-                                <a:lumMod val="95000"/>
-                                <a:alpha val="85000"/>
-                              </a:schemeClr>
-                            </a:solidFill>
-                            <a:ln w="9525">
-                              <a:noFill/>
-                              <a:miter lim="800000"/>
-                              <a:headEnd/>
-                              <a:tailEnd/>
-                            </a:ln>
-                            <a:effectLst/>
-                          </wps:spPr>
-                          <wps:txbx>
-                            <w:txbxContent>
-                              <w:p>
-                                <w:pPr>
-                                  <w:spacing w:line="276" w:lineRule="auto"/>
-                                  <w:rPr>
-                                    <w:b/>
-                                    <w:bCs/>
-                                    <w:sz w:val="24"/>
-                                    <w:szCs w:val="24"/>
-                                  </w:rPr>
-                                </w:pPr>
-                                <w:r>
-                                  <w:rPr>
-                                    <w:b/>
-                                    <w:bCs/>
-                                    <w:sz w:val="24"/>
-                                    <w:szCs w:val="24"/>
-                                  </w:rPr>
-                                  <w:t>Firmenname:</w:t>
-                                </w:r>
-                                <w:r>
-                                  <w:rPr>
-                                    <w:b/>
-                                    <w:bCs/>
-                                    <w:sz w:val="24"/>
-                                    <w:szCs w:val="24"/>
-                                  </w:rPr>
-                                  <w:t xml:space="preserve"> </w:t>
-                                </w:r>
-                                <w:r>
-                                  <w:t>{{</w:t>
-                                </w:r>
-                                <w:proofErr w:type="spellStart"/>
-                                <w:r>
-                                  <w:t>kunde</w:t>
-                                </w:r>
-                                <w:proofErr w:type="spellEnd"/>
-                                <w:r>
-                                  <w:t>}}</w:t>
-                                </w:r>
-                              </w:p>
-                              <w:p>
-                                <w:pPr>
-                                  <w:spacing w:line="276" w:lineRule="auto"/>
-                                  <w:rPr>
-                                    <w:b/>
-                                    <w:bCs/>
-                                    <w:sz w:val="24"/>
-                                    <w:szCs w:val="24"/>
-                                  </w:rPr>
-                                </w:pPr>
-                                <w:r>
-                                  <w:rPr>
-                                    <w:b/>
-                                    <w:bCs/>
-                                    <w:sz w:val="24"/>
-                                    <w:szCs w:val="24"/>
-                                  </w:rPr>
-                                  <w:t>Name:</w:t>
-                                </w:r>
-                                <w:r>
-                                  <w:t xml:space="preserve"> </w:t>
-                                </w:r>
-                                <w:r>
-                                  <w:t>{{</w:t>
-                                </w:r>
-                                <w:proofErr w:type="spellStart"/>
-                                <w:r>
-                                  <w:t>ansprechpartner</w:t>
-                                </w:r>
-                                <w:proofErr w:type="spellEnd"/>
-                                <w:r>
-                                  <w:t>}}</w:t>
-                                </w:r>
-                              </w:p>
-                              <w:p>
-                                <w:pPr>
-                                  <w:spacing w:line="276" w:lineRule="auto"/>
-                                  <w:rPr>
-                                    <w:b/>
-                                    <w:bCs/>
-                                    <w:sz w:val="24"/>
-                                    <w:szCs w:val="24"/>
-                                  </w:rPr>
-                                </w:pPr>
-                                <w:r>
-                                  <w:rPr>
-                                    <w:b/>
-                                    <w:bCs/>
-                                    <w:sz w:val="24"/>
-                                    <w:szCs w:val="24"/>
-                                  </w:rPr>
-                                  <w:t>Strasse:</w:t>
-                                </w:r>
-                                <w:r>
-                                  <w:t xml:space="preserve"> </w:t>
-                                </w:r>
-                                <w:r>
-                                  <w:t>{{</w:t>
-                                </w:r>
-                                <w:proofErr w:type="spellStart"/>
-                                <w:r>
-                                  <w:t>adresse</w:t>
-                                </w:r>
-                                <w:proofErr w:type="spellEnd"/>
-                                <w:r>
-                                  <w:t>}}</w:t>
-                                </w:r>
-                              </w:p>
-                              <w:p>
-                                <w:pPr>
-                                  <w:spacing w:line="276" w:lineRule="auto"/>
-                                  <w:rPr>
-                                    <w:b/>
-                                    <w:bCs/>
-                                    <w:sz w:val="24"/>
-                                    <w:szCs w:val="24"/>
-                                  </w:rPr>
-                                </w:pPr>
-                                <w:r>
-                                  <w:rPr>
-                                    <w:b/>
-                                    <w:bCs/>
-                                    <w:sz w:val="24"/>
-                                    <w:szCs w:val="24"/>
-                                  </w:rPr>
-                                  <w:t>Postleizahl, Ort:</w:t>
-                                </w:r>
-                                <w:r>
-                                  <w:t xml:space="preserve"> </w:t>
-                                </w:r>
-                                <w:r>
-                                  <w:t>{{</w:t>
-                                </w:r>
-                                <w:proofErr w:type="spellStart"/>
-                                <w:r>
-                                  <w:t>adresse</w:t>
-                                </w:r>
-                                <w:proofErr w:type="spellEnd"/>
-                                <w:r>
-                                  <w:t>}}</w:t>
-                                </w:r>
-                              </w:p>
-                              <w:p>
-                                <w:pPr>
-                                  <w:spacing w:line="276" w:lineRule="auto"/>
-                                  <w:rPr>
-                                    <w:b/>
-                                    <w:bCs/>
-                                    <w:sz w:val="24"/>
-                                    <w:szCs w:val="24"/>
-                                  </w:rPr>
-                                </w:pPr>
-                              </w:p>
-                              <w:p>
-                                <w:pPr>
-                                  <w:tabs>
-                                    <w:tab w:val="left" w:pos="851"/>
-                                  </w:tabs>
-                                  <w:spacing w:line="276" w:lineRule="auto"/>
-                                </w:pPr>
-                                <w:r>
-                                  <w:t>Telefon:</w:t>
-                                </w:r>
-                                <w:r>
-                                  <w:tab/>
-                                </w:r>
-                              </w:p>
-                              <w:p>
-                                <w:pPr>
-                                  <w:tabs>
-                                    <w:tab w:val="left" w:pos="851"/>
-                                  </w:tabs>
-                                  <w:spacing w:line="276" w:lineRule="auto"/>
-                                </w:pPr>
-                                <w:r>
-                                  <w:t>Fax:</w:t>
-                                </w:r>
-                                <w:r>
-                                  <w:tab/>
-                                </w:r>
-                              </w:p>
-                              <w:p>
-                                <w:pPr>
-                                  <w:tabs>
-                                    <w:tab w:val="left" w:pos="851"/>
-                                  </w:tabs>
-                                  <w:spacing w:line="276" w:lineRule="auto"/>
-                                </w:pPr>
-                                <w:r>
-                                  <w:t>E-Mail:</w:t>
-                                </w:r>
-                                <w:r>
-                                  <w:tab/>
-                                </w:r>
-                                <w:r>
-                                  <w:t>{{</w:t>
-                                </w:r>
-                                <w:proofErr w:type="gramStart"/>
-                                <w:r>
-                                  <w:t>email</w:t>
-                                </w:r>
-                                <w:proofErr w:type="gramEnd"/>
-                                <w:r>
-                                  <w:t>}}</w:t>
-                                </w:r>
-                              </w:p>
-                              <w:p>
-                                <w:pPr>
-                                  <w:rPr>
-                                    <w:b/>
-                                    <w:bCs/>
-                                    <w:sz w:val="18"/>
-                                    <w:szCs w:val="18"/>
-                                  </w:rPr>
-                                </w:pPr>
-                              </w:p>
-                            </w:txbxContent>
-                          </wps:txbx>
-                          <wps:bodyPr rot="0" vert="horz" wrap="square" lIns="91440" tIns="45720" rIns="91440" bIns="45720" anchor="t" anchorCtr="0">
-                            <a:noAutofit/>
-                          </wps:bodyPr>
-                        </wps:wsp>
-                      </a:graphicData>
-                    </a:graphic>
-                    <wp14:sizeRelH relativeFrom="margin">
-                      <wp14:pctWidth>0</wp14:pctWidth>
-                    </wp14:sizeRelH>
-                    <wp14:sizeRelV relativeFrom="margin">
-                      <wp14:pctHeight>0</wp14:pctHeight>
-                    </wp14:sizeRelV>
-                  </wp:anchor>
-                </w:drawing>
-              </mc:Choice>
-              <mc:Fallback>
-                <w:pict>
-                  <v:shape w14:anchorId="622881BA" id="_x0000_s1028" type="#_x0000_t202" style="position:absolute;margin-left:259.2pt;margin-top:1.05pt;width:241.25pt;height:150.25pt;z-index:-251682304;visibility:visible;mso-wrap-style:square;mso-width-percent:0;mso-height-percent:0;mso-wrap-distance-left:9pt;mso-wrap-distance-top:3.6pt;mso-wrap-distance-right:9pt;mso-wrap-distance-bottom:3.6pt;mso-position-horizontal:absolute;mso-position-horizontal-relative:text;mso-position-vertical:absolute;mso-position-vertical-relative:text;mso-width-percent:0;mso-height-percent:0;mso-width-relative:margin;mso-height-relative:margin;v-text-anchor:top" o:gfxdata="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" fillcolor="#f2f2f2 [3052]" stroked="f">
-                    <v:fill opacity="55769f"/>
-                    <v:textbox>
-                      <w:txbxContent>
-                        <w:p>
-                          <w:pPr>
-                            <w:spacing w:line="276" w:lineRule="auto"/>
-                            <w:rPr>
-                              <w:b/>
-                              <w:bCs/>
-                              <w:sz w:val="24"/>
-                              <w:szCs w:val="24"/>
-                            </w:rPr>
-                          </w:pPr>
-                          <w:r>
-                            <w:rPr>
-                              <w:b/>
-                              <w:bCs/>
-                              <w:sz w:val="24"/>
-                              <w:szCs w:val="24"/>
-                            </w:rPr>
-                            <w:t>Firmenname:</w:t>
-                          </w:r>
-                          <w:r>
-                            <w:rPr>
-                              <w:b/>
-                              <w:bCs/>
-                              <w:sz w:val="24"/>
-                              <w:szCs w:val="24"/>
-                            </w:rPr>
-                            <w:t xml:space="preserve"> </w:t>
-                          </w:r>
-                          <w:r>
-                            <w:t>{{</w:t>
-                          </w:r>
-                          <w:proofErr w:type="spellStart"/>
-                          <w:r>
-                            <w:t>kunde</w:t>
-                          </w:r>
-                          <w:proofErr w:type="spellEnd"/>
-                          <w:r>
-                            <w:t>}}</w:t>
-                          </w:r>
-                        </w:p>
-                        <w:p>
-                          <w:pPr>
-                            <w:spacing w:line="276" w:lineRule="auto"/>
-                            <w:rPr>
-                              <w:b/>
-                              <w:bCs/>
-                              <w:sz w:val="24"/>
-                              <w:szCs w:val="24"/>
-                            </w:rPr>
-                          </w:pPr>
-                          <w:r>
-                            <w:rPr>
-                              <w:b/>
-                              <w:bCs/>
-                              <w:sz w:val="24"/>
-                              <w:szCs w:val="24"/>
-                            </w:rPr>
-                            <w:t>Name:</w:t>
-                          </w:r>
-                          <w:r>
-                            <w:t xml:space="preserve"> </w:t>
-                          </w:r>
-                          <w:r>
-                            <w:t>{{</w:t>
-                          </w:r>
-                          <w:proofErr w:type="spellStart"/>
-                          <w:r>
-                            <w:t>ansprechpartner</w:t>
-                          </w:r>
-                          <w:proofErr w:type="spellEnd"/>
-                          <w:r>
-                            <w:t>}}</w:t>
-                          </w:r>
-                        </w:p>
-                        <w:p>
-                          <w:pPr>
-                            <w:spacing w:line="276" w:lineRule="auto"/>
-                            <w:rPr>
-                              <w:b/>
-                              <w:bCs/>
-                              <w:sz w:val="24"/>
-                              <w:szCs w:val="24"/>
-                            </w:rPr>
-                          </w:pPr>
-                          <w:r>
-                            <w:rPr>
-                              <w:b/>
-                              <w:bCs/>
-                              <w:sz w:val="24"/>
-                              <w:szCs w:val="24"/>
-                            </w:rPr>
-                            <w:t>Strasse:</w:t>
-                          </w:r>
-                          <w:r>
-                            <w:t xml:space="preserve"> </w:t>
-                          </w:r>
-                          <w:r>
-                            <w:t>{{</w:t>
-                          </w:r>
-                          <w:proofErr w:type="spellStart"/>
-                          <w:r>
-                            <w:t>adresse</w:t>
-                          </w:r>
-                          <w:proofErr w:type="spellEnd"/>
-                          <w:r>
-                            <w:t>}}</w:t>
-                          </w:r>
-                        </w:p>
-                        <w:p>
-                          <w:pPr>
-                            <w:spacing w:line="276" w:lineRule="auto"/>
-                            <w:rPr>
-                              <w:b/>
-                              <w:bCs/>
-                              <w:sz w:val="24"/>
-                              <w:szCs w:val="24"/>
-                            </w:rPr>
-                          </w:pPr>
-                          <w:r>
-                            <w:rPr>
-                              <w:b/>
-                              <w:bCs/>
-                              <w:sz w:val="24"/>
-                              <w:szCs w:val="24"/>
-                            </w:rPr>
-                            <w:t>Postleizahl, Ort:</w:t>
-                          </w:r>
-                          <w:r>
-                            <w:t xml:space="preserve"> </w:t>
-                          </w:r>
-                          <w:r>
-                            <w:t>{{</w:t>
-                          </w:r>
-                          <w:proofErr w:type="spellStart"/>
-                          <w:r>
-                            <w:t>adresse</w:t>
-                          </w:r>
-                          <w:proofErr w:type="spellEnd"/>
-                          <w:r>
-                            <w:t>}}</w:t>
-                          </w:r>
-                        </w:p>
-                        <w:p>
-                          <w:pPr>
-                            <w:spacing w:line="276" w:lineRule="auto"/>
-                            <w:rPr>
-                              <w:b/>
-                              <w:bCs/>
-                              <w:sz w:val="24"/>
-                              <w:szCs w:val="24"/>
-                            </w:rPr>
-                          </w:pPr>
-                        </w:p>
-                        <w:p>
-                          <w:pPr>
-                            <w:tabs>
-                              <w:tab w:val="left" w:pos="851"/>
-                            </w:tabs>
-                            <w:spacing w:line="276" w:lineRule="auto"/>
-                          </w:pPr>
-                          <w:r>
-                            <w:t>Telefon:</w:t>
-                          </w:r>
-                          <w:r>
-                            <w:tab/>
-                          </w:r>
-                        </w:p>
-                        <w:p>
-                          <w:pPr>
-                            <w:tabs>
-                              <w:tab w:val="left" w:pos="851"/>
-                            </w:tabs>
-                            <w:spacing w:line="276" w:lineRule="auto"/>
-                          </w:pPr>
-                          <w:r>
-                            <w:t>Fax:</w:t>
-                          </w:r>
-                          <w:r>
-                            <w:tab/>
-                          </w:r>
-                        </w:p>
-                        <w:p>
-                          <w:pPr>
-                            <w:tabs>
-                              <w:tab w:val="left" w:pos="851"/>
-                            </w:tabs>
-                            <w:spacing w:line="276" w:lineRule="auto"/>
-                          </w:pPr>
-                          <w:r>
-                            <w:t>E-Mail:</w:t>
-                          </w:r>
-                          <w:r>
-                            <w:tab/>
-                          </w:r>
-                          <w:r>
-                            <w:t>{{</w:t>
-                          </w:r>
-                          <w:proofErr w:type="gramStart"/>
-                          <w:r>
-                            <w:t>email</w:t>
-                          </w:r>
-                          <w:proofErr w:type="gramEnd"/>
-                          <w:r>
-                            <w:t>}}</w:t>
-                          </w:r>
-                        </w:p>
-                        <w:p>
-                          <w:pPr>
-                            <w:rPr>
-                              <w:b/>
-                              <w:bCs/>
-                              <w:sz w:val="18"/>
-                              <w:szCs w:val="18"/>
-                            </w:rPr>
-                          </w:pPr>
-                        </w:p>
-                      </w:txbxContent>
-                    </v:textbox>
-                  </v:shape>
-                </w:pict>
-              </mc:Fallback>
-            </mc:AlternateContent>
+            <w:t xml:space="preserve">Firmenname: </w:t>
+          </w:r>
+          <w:r>
+            <w:rPr>
+              <w:noProof/>
+            </w:rPr>
+            <w:t>{{kunde}}</w:t>
+          </w:r>
+          <w:r>
+            <w:rPr>
+              <w:noProof/>
+            </w:rPr>
+            <w:t xml:space="preserve">Name: </w:t>
+          </w:r>
+          <w:r>
+            <w:rPr>
+              <w:noProof/>
+            </w:rPr>
+            <w:t>{{ansprechpartner}}</w:t>
+          </w:r>
+          <w:r>
+            <w:rPr>
+              <w:noProof/>
+            </w:rPr>
+            <w:t xml:space="preserve">Strasse: </w:t>
+          </w:r>
+          <w:r>
+            <w:rPr>
+              <w:noProof/>
+            </w:rPr>
+            <w:t>{{adresse}}</w:t>
+          </w:r>
+          <w:r>
+            <w:rPr>
+              <w:noProof/>
+            </w:rPr>
+            <w:t xml:space="preserve">Postleizahl, Ort: </w:t>
+          </w:r>
+          <w:r>
+            <w:rPr>
+              <w:noProof/>
+            </w:rPr>
+            <w:t>{{adresse}}</w:t>
+          </w:r>
+          <w:r>
+            <w:rPr>
+              <w:noProof/>
+            </w:rPr>
+            <w:t>Telefon:Fax:E-Mail:</w:t>
+          </w:r>
+          <w:r>
+            <w:rPr>
+              <w:noProof/>
+            </w:rPr>
+            <w:t>{{email}}</w:t>
+          </w:r>
+          <w:r>
+            <w:rPr>
+              <w:noProof/>
+            </w:rPr>
+            <w:t xml:space="preserve">Firmenname: </w:t>
+          </w:r>
+          <w:r>
+            <w:rPr>
+              <w:noProof/>
+            </w:rPr>
+            <w:t>{{kunde}}</w:t>
+          </w:r>
+          <w:r>
+            <w:rPr>
+              <w:noProof/>
+            </w:rPr>
+            <w:t xml:space="preserve">Name: </w:t>
+          </w:r>
+          <w:r>
+            <w:rPr>
+              <w:noProof/>
+            </w:rPr>
+            <w:t>{{ansprechpartner}}</w:t>
+          </w:r>
+          <w:r>
+            <w:rPr>
+              <w:noProof/>
+            </w:rPr>
+            <w:t xml:space="preserve">Strasse: </w:t>
+          </w:r>
+          <w:r>
+            <w:rPr>
+              <w:noProof/>
+            </w:rPr>
+            <w:t>{{adresse}}</w:t>
+          </w:r>
+          <w:r>
+            <w:rPr>
+              <w:noProof/>
+            </w:rPr>
+            <w:t xml:space="preserve">Postleizahl, Ort: </w:t>
+          </w:r>
+          <w:r>
+            <w:rPr>
+              <w:noProof/>
+            </w:rPr>
+            <w:t>{{adresse}}</w:t>
+          </w:r>
+          <w:r>
+            <w:rPr>
+              <w:noProof/>
+            </w:rPr>
+            <w:t>Telefon:Fax:E-Mail:</w:t>
+          </w:r>
+          <w:r>
+            <w:rPr>
+              <w:noProof/>
+            </w:rPr>
+            <w:t>{{email}}</w:t>
           </w:r>
         </w:p>
         <w:p>
@@ -1542,34 +703,22 @@
     </w:p>
     <w:p>
       <w:r>
-        <w:lastRenderedPageBreak/>
+        <w:rPr>
+          <w:highlight w:val="yellow"/>
+        </w:rPr>
         <w:t xml:space="preserve">Sehr geehrter Herr </w:t>
       </w:r>
       <w:r>
-        <w:t>{{</w:t>
-      </w:r>
-      <w:proofErr w:type="spellStart"/>
-      <w:r>
-        <w:t>ansprechpartner</w:t>
-      </w:r>
-      <w:proofErr w:type="spellEnd"/>
-      <w:r>
-        <w:t>}}</w:t>
-      </w:r>
-      <w:r>
         <w:rPr>
           <w:highlight w:val="yellow"/>
         </w:rPr>
+        <w:t>{{ansprechpartner}}</w:t>
+      </w:r>
+      <w:r>
+        <w:rPr>
+          <w:highlight w:val="yellow"/>
+        </w:rPr>
         <w:t>,</w:t>
-      </w:r>
-      <w:r>
-        <w:fldChar w:fldCharType="begin"/>
-      </w:r>
-      <w:r>
-        <w:instrText xml:space="preserve">  </w:instrText>
-      </w:r>
-      <w:r>
-        <w:fldChar w:fldCharType="end"/>
       </w:r>
     </w:p>
     <w:p>
@@ -2329,23 +1478,7 @@
                 <w:sz w:val="20"/>
                 <w:szCs w:val="20"/>
               </w:rPr>
-              <w:t>{{</w:t>
-            </w:r>
-            <w:proofErr w:type="spellStart"/>
-            <w:r>
-              <w:rPr>
-                <w:sz w:val="20"/>
-                <w:szCs w:val="20"/>
-              </w:rPr>
-              <w:t>erstellt_von</w:t>
-            </w:r>
-            <w:proofErr w:type="spellEnd"/>
-            <w:r>
-              <w:rPr>
-                <w:sz w:val="20"/>
-                <w:szCs w:val="20"/>
-              </w:rPr>
-              <w:t>}}</w:t>
+              <w:t>{{erstellt_von}}</w:t>
             </w:r>
           </w:p>
         </w:tc>
@@ -2677,21 +1810,7 @@
               <w:rPr>
                 <w:szCs w:val="20"/>
               </w:rPr>
-              <w:t>{{</w:t>
-            </w:r>
-            <w:proofErr w:type="spellStart"/>
-            <w:r>
-              <w:rPr>
-                <w:szCs w:val="20"/>
-              </w:rPr>
-              <w:t>einleitung</w:t>
-            </w:r>
-            <w:proofErr w:type="spellEnd"/>
-            <w:r>
-              <w:rPr>
-                <w:szCs w:val="20"/>
-              </w:rPr>
-              <w:t>}}</w:t>
+              <w:t>{{einleitung}}</w:t>
             </w:r>
           </w:p>
           <w:p>
@@ -2796,24 +1915,26 @@
                 <w:szCs w:val="20"/>
                 <w:lang w:val="de-CH"/>
               </w:rPr>
-              <w:t>{{</w:t>
-            </w:r>
-            <w:proofErr w:type="spellStart"/>
-            <w:r>
+              <w:t>{{konfiguration}}</w:t>
+            </w:r>
+          </w:p>
+          <w:p>
+            <w:pPr>
+              <w:pStyle w:val="ANGEBOTDEUTSCH"/>
               <w:rPr>
                 <w:szCs w:val="20"/>
                 <w:lang w:val="de-CH"/>
               </w:rPr>
-              <w:t>konfiguration</w:t>
-            </w:r>
-            <w:proofErr w:type="spellEnd"/>
-            <w:r>
+            </w:pPr>
+          </w:p>
+          <w:p>
+            <w:pPr>
+              <w:pStyle w:val="ANGEBOTDEUTSCH"/>
               <w:rPr>
                 <w:szCs w:val="20"/>
                 <w:lang w:val="de-CH"/>
               </w:rPr>
-              <w:t>}}</w:t>
-            </w:r>
+            </w:pPr>
           </w:p>
           <w:p>
             <w:pPr>
@@ -2823,15 +1944,13 @@
                 <w:lang w:val="de-CH"/>
               </w:rPr>
             </w:pPr>
-          </w:p>
-          <w:p>
-            <w:pPr>
-              <w:pStyle w:val="ANGEBOTDEUTSCH"/>
+            <w:r>
               <w:rPr>
                 <w:szCs w:val="20"/>
                 <w:lang w:val="de-CH"/>
               </w:rPr>
-            </w:pPr>
+              <w:t>{{leistungsumfang_text}}</w:t>
+            </w:r>
           </w:p>
           <w:p>
             <w:pPr>
@@ -2841,87 +1960,39 @@
                 <w:lang w:val="de-CH"/>
               </w:rPr>
             </w:pPr>
-            <w:r>
+          </w:p>
+          <w:p>
+            <w:pPr>
+              <w:pStyle w:val="ANGEBOTDEUTSCH"/>
               <w:rPr>
                 <w:szCs w:val="20"/>
                 <w:lang w:val="de-CH"/>
               </w:rPr>
-              <w:t>{{</w:t>
-            </w:r>
-            <w:proofErr w:type="spellStart"/>
-            <w:r>
+            </w:pPr>
+          </w:p>
+          <w:p>
+            <w:pPr>
+              <w:pStyle w:val="ANGEBOTDEUTSCH"/>
               <w:rPr>
                 <w:szCs w:val="20"/>
                 <w:lang w:val="de-CH"/>
               </w:rPr>
-              <w:t>leistungsumfang_text</w:t>
-            </w:r>
-            <w:proofErr w:type="spellEnd"/>
-            <w:r>
+            </w:pPr>
+          </w:p>
+          <w:p>
+            <w:pPr>
+              <w:pStyle w:val="ANGEBOTDEUTSCH"/>
               <w:rPr>
                 <w:szCs w:val="20"/>
                 <w:lang w:val="de-CH"/>
               </w:rPr>
-              <w:t>}}</w:t>
-            </w:r>
-          </w:p>
-          <w:p>
-            <w:pPr>
-              <w:pStyle w:val="ANGEBOTDEUTSCH"/>
+            </w:pPr>
+            <w:r>
               <w:rPr>
                 <w:szCs w:val="20"/>
                 <w:lang w:val="de-CH"/>
               </w:rPr>
-            </w:pPr>
-          </w:p>
-          <w:p>
-            <w:pPr>
-              <w:pStyle w:val="ANGEBOTDEUTSCH"/>
-              <w:rPr>
-                <w:szCs w:val="20"/>
-                <w:lang w:val="de-CH"/>
-              </w:rPr>
-            </w:pPr>
-          </w:p>
-          <w:p>
-            <w:pPr>
-              <w:pStyle w:val="ANGEBOTDEUTSCH"/>
-              <w:rPr>
-                <w:szCs w:val="20"/>
-                <w:lang w:val="de-CH"/>
-              </w:rPr>
-            </w:pPr>
-          </w:p>
-          <w:p>
-            <w:pPr>
-              <w:pStyle w:val="ANGEBOTDEUTSCH"/>
-              <w:rPr>
-                <w:szCs w:val="20"/>
-                <w:lang w:val="de-CH"/>
-              </w:rPr>
-            </w:pPr>
-            <w:r>
-              <w:rPr>
-                <w:szCs w:val="20"/>
-                <w:lang w:val="de-CH"/>
-              </w:rPr>
-              <w:t>{{</w:t>
-            </w:r>
-            <w:proofErr w:type="spellStart"/>
-            <w:r>
-              <w:rPr>
-                <w:szCs w:val="20"/>
-                <w:lang w:val="de-CH"/>
-              </w:rPr>
-              <w:t>optionen_text</w:t>
-            </w:r>
-            <w:proofErr w:type="spellEnd"/>
-            <w:r>
-              <w:rPr>
-                <w:szCs w:val="20"/>
-                <w:lang w:val="de-CH"/>
-              </w:rPr>
-              <w:t>}}</w:t>
+              <w:t>{{optionen_text}}</w:t>
             </w:r>
           </w:p>
           <w:p>
@@ -3201,27 +2272,7 @@
                 <w:szCs w:val="20"/>
                 <w:lang w:val="de-CH"/>
               </w:rPr>
-              <w:t>{{</w:t>
-            </w:r>
-            <w:proofErr w:type="spellStart"/>
-            <w:r>
-              <w:rPr>
-                <w:rFonts w:cs="Arial"/>
-                <w:b/>
-                <w:szCs w:val="20"/>
-                <w:lang w:val="de-CH"/>
-              </w:rPr>
-              <w:t>optionen_text</w:t>
-            </w:r>
-            <w:proofErr w:type="spellEnd"/>
-            <w:r>
-              <w:rPr>
-                <w:rFonts w:cs="Arial"/>
-                <w:b/>
-                <w:szCs w:val="20"/>
-                <w:lang w:val="de-CH"/>
-              </w:rPr>
-              <w:t>}}</w:t>
+              <w:t>{{optionen_text}}</w:t>
             </w:r>
           </w:p>
         </w:tc>

</xml_diff>

<commit_message>
Cover-Bilder in Angebot Logimat DE.docx wiederherstellen
Die Platzhalter-Bereinigung hatte schwebende Bilder auf der
Titelseite entfernt. Originalvorlage mit intakten Grafiken
wieder aktiv; docxtpl füllt die Platzhalter weiterhin korrekt.

Co-authored-by: msobona <msobona@users.noreply.github.com>
</commit_message>
<xml_diff>
--- a/docs/templates/Angebot Logimat DE.docx
+++ b/docs/templates/Angebot Logimat DE.docx
@@ -12,25 +12,328 @@
         <w:rPr>
           <w:noProof/>
         </w:rPr>
-        <w:t>{{titel}}</w:t>
+        <w:drawing>
+          <wp:anchor distT="0" distB="0" distL="114300" distR="114300" simplePos="0" relativeHeight="251632127" behindDoc="1" locked="0" layoutInCell="1" allowOverlap="1" wp14:anchorId="307E5AE9" wp14:editId="3EF8594B">
+            <wp:simplePos x="0" y="0"/>
+            <wp:positionH relativeFrom="leftMargin">
+              <wp:posOffset>5080</wp:posOffset>
+            </wp:positionH>
+            <wp:positionV relativeFrom="paragraph">
+              <wp:posOffset>-2260287</wp:posOffset>
+            </wp:positionV>
+            <wp:extent cx="7560000" cy="10674000"/>
+            <wp:effectExtent l="0" t="0" r="3175" b="0"/>
+            <wp:wrapNone/>
+            <wp:docPr id="18" name="Grafik 18" descr="C:\Users\johunwu\AppData\Local\Microsoft\Windows\INetCache\Content.Word\SLL_Titelmotiv.jpg"/>
+            <wp:cNvGraphicFramePr/>
+            <a:graphic xmlns:a="http://schemas.openxmlformats.org/drawingml/2006/main">
+              <a:graphicData uri="http://schemas.openxmlformats.org/drawingml/2006/picture">
+                <pic:pic xmlns:pic="http://schemas.openxmlformats.org/drawingml/2006/picture">
+                  <pic:nvPicPr>
+                    <pic:cNvPr id="40" name="Grafik 40" descr="C:\Users\johunwu\AppData\Local\Microsoft\Windows\INetCache\Content.Word\SLL_Titelmotiv.jpg"/>
+                    <pic:cNvPicPr/>
+                  </pic:nvPicPr>
+                  <pic:blipFill>
+                    <a:blip r:embed="rId11" cstate="print">
+                      <a:extLst>
+                        <a:ext uri="{28A0092B-C50C-407E-A947-70E740481C1C}">
+                          <a14:useLocalDpi xmlns:a14="http://schemas.microsoft.com/office/drawing/2010/main" val="0"/>
+                        </a:ext>
+                      </a:extLst>
+                    </a:blip>
+                    <a:srcRect/>
+                    <a:stretch>
+                      <a:fillRect/>
+                    </a:stretch>
+                  </pic:blipFill>
+                  <pic:spPr bwMode="auto">
+                    <a:xfrm>
+                      <a:off x="0" y="0"/>
+                      <a:ext cx="7560000" cy="10674000"/>
+                    </a:xfrm>
+                    <a:prstGeom prst="rect">
+                      <a:avLst/>
+                    </a:prstGeom>
+                    <a:noFill/>
+                    <a:ln>
+                      <a:noFill/>
+                    </a:ln>
+                  </pic:spPr>
+                </pic:pic>
+              </a:graphicData>
+            </a:graphic>
+            <wp14:sizeRelH relativeFrom="page">
+              <wp14:pctWidth>0</wp14:pctWidth>
+            </wp14:sizeRelH>
+            <wp14:sizeRelV relativeFrom="page">
+              <wp14:pctHeight>0</wp14:pctHeight>
+            </wp14:sizeRelV>
+          </wp:anchor>
+        </w:drawing>
       </w:r>
       <w:r>
         <w:rPr>
           <w:noProof/>
-        </w:rPr>
-        <w:t xml:space="preserve"> 20.07.2026</w:t>
-      </w:r>
-      <w:r>
-        <w:rPr>
-          <w:noProof/>
-        </w:rPr>
-        <w:t>{{titel}}</w:t>
-      </w:r>
-      <w:r>
-        <w:rPr>
-          <w:noProof/>
-        </w:rPr>
-        <w:t xml:space="preserve"> 20.07.2026</w:t>
+          <w:lang w:val="de-DE" w:eastAsia="de-DE"/>
+        </w:rPr>
+        <mc:AlternateContent>
+          <mc:Choice Requires="wps">
+            <w:drawing>
+              <wp:anchor distT="0" distB="0" distL="114300" distR="114300" simplePos="0" relativeHeight="251661824" behindDoc="0" locked="0" layoutInCell="1" allowOverlap="1" wp14:anchorId="535DBA41" wp14:editId="24642FD4">
+                <wp:simplePos x="0" y="0"/>
+                <wp:positionH relativeFrom="column">
+                  <wp:posOffset>-888365</wp:posOffset>
+                </wp:positionH>
+                <wp:positionV relativeFrom="paragraph">
+                  <wp:posOffset>65074</wp:posOffset>
+                </wp:positionV>
+                <wp:extent cx="3227705" cy="548640"/>
+                <wp:effectExtent l="0" t="0" r="0" b="3810"/>
+                <wp:wrapNone/>
+                <wp:docPr id="4" name="Textfeld 4"/>
+                <wp:cNvGraphicFramePr/>
+                <a:graphic xmlns:a="http://schemas.openxmlformats.org/drawingml/2006/main">
+                  <a:graphicData uri="http://schemas.microsoft.com/office/word/2010/wordprocessingShape">
+                    <wps:wsp>
+                      <wps:cNvSpPr txBox="1"/>
+                      <wps:spPr>
+                        <a:xfrm>
+                          <a:off x="0" y="0"/>
+                          <a:ext cx="3227705" cy="548640"/>
+                        </a:xfrm>
+                        <a:prstGeom prst="rect">
+                          <a:avLst/>
+                        </a:prstGeom>
+                        <a:noFill/>
+                        <a:ln w="6350">
+                          <a:noFill/>
+                        </a:ln>
+                      </wps:spPr>
+                      <wps:txbx>
+                        <w:txbxContent>
+                          <w:p>
+                            <w:pPr>
+                              <w:ind w:firstLine="142"/>
+                              <w:rPr>
+                                <w:b/>
+                                <w:bCs/>
+                                <w:sz w:val="44"/>
+                                <w:szCs w:val="44"/>
+                              </w:rPr>
+                            </w:pPr>
+                            <w:r>
+                              <w:rPr>
+                                <w:b/>
+                                <w:bCs/>
+                                <w:sz w:val="44"/>
+                                <w:szCs w:val="44"/>
+                              </w:rPr>
+                              <w:t>{{</w:t>
+                            </w:r>
+                            <w:proofErr w:type="spellStart"/>
+                            <w:r>
+                              <w:rPr>
+                                <w:b/>
+                                <w:bCs/>
+                                <w:sz w:val="44"/>
+                                <w:szCs w:val="44"/>
+                              </w:rPr>
+                              <w:t>titel</w:t>
+                            </w:r>
+                            <w:proofErr w:type="spellEnd"/>
+                            <w:r>
+                              <w:rPr>
+                                <w:b/>
+                                <w:bCs/>
+                                <w:sz w:val="44"/>
+                                <w:szCs w:val="44"/>
+                              </w:rPr>
+                              <w:t>}}</w:t>
+                            </w:r>
+                            <w:r>
+                              <w:rPr>
+                                <w:b/>
+                                <w:bCs/>
+                                <w:sz w:val="44"/>
+                                <w:szCs w:val="44"/>
+                              </w:rPr>
+                              <w:t xml:space="preserve"> </w:t>
+                            </w:r>
+                          </w:p>
+                          <w:p>
+                            <w:pPr>
+                              <w:ind w:firstLine="142"/>
+                              <w:rPr>
+                                <w:b/>
+                                <w:bCs/>
+                              </w:rPr>
+                            </w:pPr>
+                            <w:r>
+                              <w:rPr>
+                                <w:b/>
+                                <w:bCs/>
+                              </w:rPr>
+                              <w:fldChar w:fldCharType="begin"/>
+                            </w:r>
+                            <w:r>
+                              <w:rPr>
+                                <w:b/>
+                                <w:bCs/>
+                              </w:rPr>
+                              <w:instrText xml:space="preserve"> TIME \@ "dd.MM.yyyy" </w:instrText>
+                            </w:r>
+                            <w:r>
+                              <w:rPr>
+                                <w:b/>
+                                <w:bCs/>
+                              </w:rPr>
+                              <w:fldChar w:fldCharType="separate"/>
+                            </w:r>
+                            <w:r>
+                              <w:rPr>
+                                <w:b/>
+                                <w:bCs/>
+                                <w:noProof/>
+                              </w:rPr>
+                              <w:t>20.07.2026</w:t>
+                            </w:r>
+                            <w:r>
+                              <w:rPr>
+                                <w:b/>
+                                <w:bCs/>
+                              </w:rPr>
+                              <w:fldChar w:fldCharType="end"/>
+                            </w:r>
+                          </w:p>
+                        </w:txbxContent>
+                      </wps:txbx>
+                      <wps:bodyPr rot="0" spcFirstLastPara="0" vertOverflow="overflow" horzOverflow="overflow" vert="horz" wrap="square" lIns="91440" tIns="45720" rIns="91440" bIns="45720" numCol="1" spcCol="0" rtlCol="0" fromWordArt="0" anchor="ctr" anchorCtr="0" forceAA="0" compatLnSpc="1">
+                        <a:prstTxWarp prst="textNoShape">
+                          <a:avLst/>
+                        </a:prstTxWarp>
+                        <a:noAutofit/>
+                      </wps:bodyPr>
+                    </wps:wsp>
+                  </a:graphicData>
+                </a:graphic>
+                <wp14:sizeRelH relativeFrom="margin">
+                  <wp14:pctWidth>0</wp14:pctWidth>
+                </wp14:sizeRelH>
+                <wp14:sizeRelV relativeFrom="margin">
+                  <wp14:pctHeight>0</wp14:pctHeight>
+                </wp14:sizeRelV>
+              </wp:anchor>
+            </w:drawing>
+          </mc:Choice>
+          <mc:Fallback>
+            <w:pict>
+              <v:shapetype w14:anchorId="535DBA41" id="_x0000_t202" coordsize="21600,21600" o:spt="202" path="m,l,21600r21600,l21600,xe">
+                <v:stroke joinstyle="miter"/>
+                <v:path gradientshapeok="t" o:connecttype="rect"/>
+              </v:shapetype>
+              <v:shape id="Textfeld 4" o:spid="_x0000_s1026" type="#_x0000_t202" style="position:absolute;margin-left:-69.95pt;margin-top:5.1pt;width:254.15pt;height:43.2pt;z-index:251661824;visibility:visible;mso-wrap-style:square;mso-width-percent:0;mso-height-percent:0;mso-wrap-distance-left:9pt;mso-wrap-distance-top:0;mso-wrap-distance-right:9pt;mso-wrap-distance-bottom:0;mso-position-horizontal:absolute;mso-position-horizontal-relative:text;mso-position-vertical:absolute;mso-position-vertical-relative:text;mso-width-percent:0;mso-height-percent:0;mso-width-relative:margin;mso-height-relative:margin;v-text-anchor:middle" o:gfxdata="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" filled="f" stroked="f" strokeweight=".5pt">
+                <v:textbox>
+                  <w:txbxContent>
+                    <w:p>
+                      <w:pPr>
+                        <w:ind w:firstLine="142"/>
+                        <w:rPr>
+                          <w:b/>
+                          <w:bCs/>
+                          <w:sz w:val="44"/>
+                          <w:szCs w:val="44"/>
+                        </w:rPr>
+                      </w:pPr>
+                      <w:r>
+                        <w:rPr>
+                          <w:b/>
+                          <w:bCs/>
+                          <w:sz w:val="44"/>
+                          <w:szCs w:val="44"/>
+                        </w:rPr>
+                        <w:t>{{</w:t>
+                      </w:r>
+                      <w:proofErr w:type="spellStart"/>
+                      <w:r>
+                        <w:rPr>
+                          <w:b/>
+                          <w:bCs/>
+                          <w:sz w:val="44"/>
+                          <w:szCs w:val="44"/>
+                        </w:rPr>
+                        <w:t>titel</w:t>
+                      </w:r>
+                      <w:proofErr w:type="spellEnd"/>
+                      <w:r>
+                        <w:rPr>
+                          <w:b/>
+                          <w:bCs/>
+                          <w:sz w:val="44"/>
+                          <w:szCs w:val="44"/>
+                        </w:rPr>
+                        <w:t>}}</w:t>
+                      </w:r>
+                      <w:r>
+                        <w:rPr>
+                          <w:b/>
+                          <w:bCs/>
+                          <w:sz w:val="44"/>
+                          <w:szCs w:val="44"/>
+                        </w:rPr>
+                        <w:t xml:space="preserve"> </w:t>
+                      </w:r>
+                    </w:p>
+                    <w:p>
+                      <w:pPr>
+                        <w:ind w:firstLine="142"/>
+                        <w:rPr>
+                          <w:b/>
+                          <w:bCs/>
+                        </w:rPr>
+                      </w:pPr>
+                      <w:r>
+                        <w:rPr>
+                          <w:b/>
+                          <w:bCs/>
+                        </w:rPr>
+                        <w:fldChar w:fldCharType="begin"/>
+                      </w:r>
+                      <w:r>
+                        <w:rPr>
+                          <w:b/>
+                          <w:bCs/>
+                        </w:rPr>
+                        <w:instrText xml:space="preserve"> TIME \@ "dd.MM.yyyy" </w:instrText>
+                      </w:r>
+                      <w:r>
+                        <w:rPr>
+                          <w:b/>
+                          <w:bCs/>
+                        </w:rPr>
+                        <w:fldChar w:fldCharType="separate"/>
+                      </w:r>
+                      <w:r>
+                        <w:rPr>
+                          <w:b/>
+                          <w:bCs/>
+                          <w:noProof/>
+                        </w:rPr>
+                        <w:t>20.07.2026</w:t>
+                      </w:r>
+                      <w:r>
+                        <w:rPr>
+                          <w:b/>
+                          <w:bCs/>
+                        </w:rPr>
+                        <w:fldChar w:fldCharType="end"/>
+                      </w:r>
+                    </w:p>
+                  </w:txbxContent>
+                </v:textbox>
+              </v:shape>
+            </w:pict>
+          </mc:Fallback>
+        </mc:AlternateContent>
       </w:r>
     </w:p>
     <w:p>
@@ -162,13 +465,155 @@
         <w:rPr>
           <w:noProof/>
         </w:rPr>
-        <w:t>{{untertitel}}</w:t>
-      </w:r>
-      <w:r>
-        <w:rPr>
-          <w:noProof/>
-        </w:rPr>
-        <w:t>{{untertitel}}</w:t>
+        <mc:AlternateContent>
+          <mc:Choice Requires="wps">
+            <w:drawing>
+              <wp:anchor distT="45720" distB="45720" distL="114300" distR="114300" simplePos="0" relativeHeight="251753472" behindDoc="0" locked="0" layoutInCell="1" allowOverlap="1" wp14:anchorId="1AD26751" wp14:editId="14D24833">
+                <wp:simplePos x="0" y="0"/>
+                <wp:positionH relativeFrom="column">
+                  <wp:posOffset>-813435</wp:posOffset>
+                </wp:positionH>
+                <wp:positionV relativeFrom="paragraph">
+                  <wp:posOffset>223520</wp:posOffset>
+                </wp:positionV>
+                <wp:extent cx="3624580" cy="542925"/>
+                <wp:effectExtent l="0" t="0" r="0" b="0"/>
+                <wp:wrapSquare wrapText="bothSides"/>
+                <wp:docPr id="57" name="Textfeld 2"/>
+                <wp:cNvGraphicFramePr>
+                  <a:graphicFrameLocks xmlns:a="http://schemas.openxmlformats.org/drawingml/2006/main"/>
+                </wp:cNvGraphicFramePr>
+                <a:graphic xmlns:a="http://schemas.openxmlformats.org/drawingml/2006/main">
+                  <a:graphicData uri="http://schemas.microsoft.com/office/word/2010/wordprocessingShape">
+                    <wps:wsp>
+                      <wps:cNvSpPr txBox="1">
+                        <a:spLocks noChangeArrowheads="1"/>
+                      </wps:cNvSpPr>
+                      <wps:spPr bwMode="auto">
+                        <a:xfrm>
+                          <a:off x="0" y="0"/>
+                          <a:ext cx="3624580" cy="542925"/>
+                        </a:xfrm>
+                        <a:prstGeom prst="rect">
+                          <a:avLst/>
+                        </a:prstGeom>
+                        <a:noFill/>
+                        <a:ln w="9525">
+                          <a:noFill/>
+                          <a:miter lim="800000"/>
+                          <a:headEnd/>
+                          <a:tailEnd/>
+                        </a:ln>
+                      </wps:spPr>
+                      <wps:txbx>
+                        <w:txbxContent>
+                          <w:p>
+                            <w:pPr>
+                              <w:rPr>
+                                <w:b/>
+                                <w:bCs/>
+                                <w:sz w:val="28"/>
+                                <w:szCs w:val="28"/>
+                              </w:rPr>
+                            </w:pPr>
+                            <w:r>
+                              <w:rPr>
+                                <w:b/>
+                                <w:bCs/>
+                                <w:sz w:val="28"/>
+                                <w:szCs w:val="28"/>
+                              </w:rPr>
+                              <w:t>{{</w:t>
+                            </w:r>
+                            <w:proofErr w:type="spellStart"/>
+                            <w:r>
+                              <w:rPr>
+                                <w:b/>
+                                <w:bCs/>
+                                <w:sz w:val="28"/>
+                                <w:szCs w:val="28"/>
+                              </w:rPr>
+                              <w:t>untertitel</w:t>
+                            </w:r>
+                            <w:proofErr w:type="spellEnd"/>
+                            <w:r>
+                              <w:rPr>
+                                <w:b/>
+                                <w:bCs/>
+                                <w:sz w:val="28"/>
+                                <w:szCs w:val="28"/>
+                              </w:rPr>
+                              <w:t>}}</w:t>
+                            </w:r>
+                          </w:p>
+                        </w:txbxContent>
+                      </wps:txbx>
+                      <wps:bodyPr rot="0" vert="horz" wrap="square" lIns="91440" tIns="45720" rIns="91440" bIns="45720" anchor="ctr" anchorCtr="0">
+                        <a:noAutofit/>
+                      </wps:bodyPr>
+                    </wps:wsp>
+                  </a:graphicData>
+                </a:graphic>
+                <wp14:sizeRelH relativeFrom="margin">
+                  <wp14:pctWidth>0</wp14:pctWidth>
+                </wp14:sizeRelH>
+                <wp14:sizeRelV relativeFrom="margin">
+                  <wp14:pctHeight>0</wp14:pctHeight>
+                </wp14:sizeRelV>
+              </wp:anchor>
+            </w:drawing>
+          </mc:Choice>
+          <mc:Fallback>
+            <w:pict>
+              <v:shape w14:anchorId="1AD26751" id="Textfeld 2" o:spid="_x0000_s1027" type="#_x0000_t202" style="position:absolute;margin-left:-64.05pt;margin-top:17.6pt;width:285.4pt;height:42.75pt;z-index:251753472;visibility:visible;mso-wrap-style:square;mso-width-percent:0;mso-height-percent:0;mso-wrap-distance-left:9pt;mso-wrap-distance-top:3.6pt;mso-wrap-distance-right:9pt;mso-wrap-distance-bottom:3.6pt;mso-position-horizontal:absolute;mso-position-horizontal-relative:text;mso-position-vertical:absolute;mso-position-vertical-relative:text;mso-width-percent:0;mso-height-percent:0;mso-width-relative:margin;mso-height-relative:margin;v-text-anchor:middle" o:gfxdata="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" filled="f" stroked="f">
+                <v:textbox>
+                  <w:txbxContent>
+                    <w:p>
+                      <w:pPr>
+                        <w:rPr>
+                          <w:b/>
+                          <w:bCs/>
+                          <w:sz w:val="28"/>
+                          <w:szCs w:val="28"/>
+                        </w:rPr>
+                      </w:pPr>
+                      <w:r>
+                        <w:rPr>
+                          <w:b/>
+                          <w:bCs/>
+                          <w:sz w:val="28"/>
+                          <w:szCs w:val="28"/>
+                        </w:rPr>
+                        <w:t>{{</w:t>
+                      </w:r>
+                      <w:proofErr w:type="spellStart"/>
+                      <w:r>
+                        <w:rPr>
+                          <w:b/>
+                          <w:bCs/>
+                          <w:sz w:val="28"/>
+                          <w:szCs w:val="28"/>
+                        </w:rPr>
+                        <w:t>untertitel</w:t>
+                      </w:r>
+                      <w:proofErr w:type="spellEnd"/>
+                      <w:r>
+                        <w:rPr>
+                          <w:b/>
+                          <w:bCs/>
+                          <w:sz w:val="28"/>
+                          <w:szCs w:val="28"/>
+                        </w:rPr>
+                        <w:t>}}</w:t>
+                      </w:r>
+                    </w:p>
+                  </w:txbxContent>
+                </v:textbox>
+                <w10:wrap type="square"/>
+              </v:shape>
+            </w:pict>
+          </mc:Fallback>
+        </mc:AlternateContent>
       </w:r>
     </w:p>
     <w:p/>
@@ -197,121 +642,515 @@
             <w:rPr>
               <w:noProof/>
             </w:rPr>
-            <w:t xml:space="preserve">Firmenname: </w:t>
-          </w:r>
-          <w:r>
-            <w:rPr>
-              <w:noProof/>
-            </w:rPr>
-            <w:t>{{kunde}}</w:t>
-          </w:r>
-          <w:r>
-            <w:rPr>
-              <w:noProof/>
-            </w:rPr>
-            <w:t xml:space="preserve">Name: </w:t>
-          </w:r>
-          <w:r>
-            <w:rPr>
-              <w:noProof/>
-            </w:rPr>
-            <w:t>{{ansprechpartner}}</w:t>
-          </w:r>
-          <w:r>
-            <w:rPr>
-              <w:noProof/>
-            </w:rPr>
-            <w:t xml:space="preserve">Strasse: </w:t>
-          </w:r>
-          <w:r>
-            <w:rPr>
-              <w:noProof/>
-            </w:rPr>
-            <w:t>{{adresse}}</w:t>
-          </w:r>
-          <w:r>
-            <w:rPr>
-              <w:noProof/>
-            </w:rPr>
-            <w:t xml:space="preserve">Postleizahl, Ort: </w:t>
-          </w:r>
-          <w:r>
-            <w:rPr>
-              <w:noProof/>
-            </w:rPr>
-            <w:t>{{adresse}}</w:t>
-          </w:r>
-          <w:r>
-            <w:rPr>
-              <w:noProof/>
-            </w:rPr>
-            <w:t>Telefon:Fax:E-Mail:</w:t>
-          </w:r>
-          <w:r>
-            <w:rPr>
-              <w:noProof/>
-            </w:rPr>
-            <w:t>{{email}}</w:t>
-          </w:r>
-          <w:r>
-            <w:rPr>
-              <w:noProof/>
-            </w:rPr>
-            <w:t xml:space="preserve">Firmenname: </w:t>
-          </w:r>
-          <w:r>
-            <w:rPr>
-              <w:noProof/>
-            </w:rPr>
-            <w:t>{{kunde}}</w:t>
-          </w:r>
-          <w:r>
-            <w:rPr>
-              <w:noProof/>
-            </w:rPr>
-            <w:t xml:space="preserve">Name: </w:t>
-          </w:r>
-          <w:r>
-            <w:rPr>
-              <w:noProof/>
-            </w:rPr>
-            <w:t>{{ansprechpartner}}</w:t>
-          </w:r>
-          <w:r>
-            <w:rPr>
-              <w:noProof/>
-            </w:rPr>
-            <w:t xml:space="preserve">Strasse: </w:t>
-          </w:r>
-          <w:r>
-            <w:rPr>
-              <w:noProof/>
-            </w:rPr>
-            <w:t>{{adresse}}</w:t>
-          </w:r>
-          <w:r>
-            <w:rPr>
-              <w:noProof/>
-            </w:rPr>
-            <w:t xml:space="preserve">Postleizahl, Ort: </w:t>
-          </w:r>
-          <w:r>
-            <w:rPr>
-              <w:noProof/>
-            </w:rPr>
-            <w:t>{{adresse}}</w:t>
-          </w:r>
-          <w:r>
-            <w:rPr>
-              <w:noProof/>
-            </w:rPr>
-            <w:t>Telefon:Fax:E-Mail:</w:t>
-          </w:r>
-          <w:r>
-            <w:rPr>
-              <w:noProof/>
-            </w:rPr>
-            <w:t>{{email}}</w:t>
+            <mc:AlternateContent>
+              <mc:Choice Requires="wps">
+                <w:drawing>
+                  <wp:anchor distT="45720" distB="45720" distL="114300" distR="114300" simplePos="0" relativeHeight="251634176" behindDoc="1" locked="0" layoutInCell="1" allowOverlap="1" wp14:anchorId="622881BA" wp14:editId="4705950F">
+                    <wp:simplePos x="0" y="0"/>
+                    <wp:positionH relativeFrom="column">
+                      <wp:posOffset>3291560</wp:posOffset>
+                    </wp:positionH>
+                    <wp:positionV relativeFrom="paragraph">
+                      <wp:posOffset>13343</wp:posOffset>
+                    </wp:positionV>
+                    <wp:extent cx="3063833" cy="1908175"/>
+                    <wp:effectExtent l="0" t="0" r="3810" b="0"/>
+                    <wp:wrapNone/>
+                    <wp:docPr id="217" name="Textfeld 2"/>
+                    <wp:cNvGraphicFramePr>
+                      <a:graphicFrameLocks xmlns:a="http://schemas.openxmlformats.org/drawingml/2006/main"/>
+                    </wp:cNvGraphicFramePr>
+                    <a:graphic xmlns:a="http://schemas.openxmlformats.org/drawingml/2006/main">
+                      <a:graphicData uri="http://schemas.microsoft.com/office/word/2010/wordprocessingShape">
+                        <wps:wsp>
+                          <wps:cNvSpPr txBox="1">
+                            <a:spLocks noChangeArrowheads="1"/>
+                          </wps:cNvSpPr>
+                          <wps:spPr bwMode="auto">
+                            <a:xfrm>
+                              <a:off x="0" y="0"/>
+                              <a:ext cx="3063833" cy="1908175"/>
+                            </a:xfrm>
+                            <a:prstGeom prst="rect">
+                              <a:avLst/>
+                            </a:prstGeom>
+                            <a:solidFill>
+                              <a:schemeClr val="bg1">
+                                <a:lumMod val="95000"/>
+                                <a:alpha val="85000"/>
+                              </a:schemeClr>
+                            </a:solidFill>
+                            <a:ln w="9525">
+                              <a:noFill/>
+                              <a:miter lim="800000"/>
+                              <a:headEnd/>
+                              <a:tailEnd/>
+                            </a:ln>
+                            <a:effectLst/>
+                          </wps:spPr>
+                          <wps:txbx>
+                            <w:txbxContent>
+                              <w:p>
+                                <w:pPr>
+                                  <w:spacing w:line="276" w:lineRule="auto"/>
+                                  <w:rPr>
+                                    <w:b/>
+                                    <w:bCs/>
+                                    <w:sz w:val="24"/>
+                                    <w:szCs w:val="24"/>
+                                  </w:rPr>
+                                </w:pPr>
+                                <w:r>
+                                  <w:rPr>
+                                    <w:b/>
+                                    <w:bCs/>
+                                    <w:sz w:val="24"/>
+                                    <w:szCs w:val="24"/>
+                                  </w:rPr>
+                                  <w:t>Firmenname:</w:t>
+                                </w:r>
+                                <w:r>
+                                  <w:rPr>
+                                    <w:b/>
+                                    <w:bCs/>
+                                    <w:sz w:val="24"/>
+                                    <w:szCs w:val="24"/>
+                                  </w:rPr>
+                                  <w:t xml:space="preserve"> </w:t>
+                                </w:r>
+                                <w:r>
+                                  <w:t>{{</w:t>
+                                </w:r>
+                                <w:proofErr w:type="spellStart"/>
+                                <w:r>
+                                  <w:t>kunde</w:t>
+                                </w:r>
+                                <w:proofErr w:type="spellEnd"/>
+                                <w:r>
+                                  <w:t>}}</w:t>
+                                </w:r>
+                              </w:p>
+                              <w:p>
+                                <w:pPr>
+                                  <w:spacing w:line="276" w:lineRule="auto"/>
+                                  <w:rPr>
+                                    <w:b/>
+                                    <w:bCs/>
+                                    <w:sz w:val="24"/>
+                                    <w:szCs w:val="24"/>
+                                  </w:rPr>
+                                </w:pPr>
+                                <w:r>
+                                  <w:rPr>
+                                    <w:b/>
+                                    <w:bCs/>
+                                    <w:sz w:val="24"/>
+                                    <w:szCs w:val="24"/>
+                                  </w:rPr>
+                                  <w:t>Name:</w:t>
+                                </w:r>
+                                <w:r>
+                                  <w:t xml:space="preserve"> </w:t>
+                                </w:r>
+                                <w:r>
+                                  <w:t>{{</w:t>
+                                </w:r>
+                                <w:proofErr w:type="spellStart"/>
+                                <w:r>
+                                  <w:t>ansprechpartner</w:t>
+                                </w:r>
+                                <w:proofErr w:type="spellEnd"/>
+                                <w:r>
+                                  <w:t>}}</w:t>
+                                </w:r>
+                              </w:p>
+                              <w:p>
+                                <w:pPr>
+                                  <w:spacing w:line="276" w:lineRule="auto"/>
+                                  <w:rPr>
+                                    <w:b/>
+                                    <w:bCs/>
+                                    <w:sz w:val="24"/>
+                                    <w:szCs w:val="24"/>
+                                  </w:rPr>
+                                </w:pPr>
+                                <w:r>
+                                  <w:rPr>
+                                    <w:b/>
+                                    <w:bCs/>
+                                    <w:sz w:val="24"/>
+                                    <w:szCs w:val="24"/>
+                                  </w:rPr>
+                                  <w:t>Strasse:</w:t>
+                                </w:r>
+                                <w:r>
+                                  <w:t xml:space="preserve"> </w:t>
+                                </w:r>
+                                <w:r>
+                                  <w:t>{{</w:t>
+                                </w:r>
+                                <w:proofErr w:type="spellStart"/>
+                                <w:r>
+                                  <w:t>adresse</w:t>
+                                </w:r>
+                                <w:proofErr w:type="spellEnd"/>
+                                <w:r>
+                                  <w:t>}}</w:t>
+                                </w:r>
+                              </w:p>
+                              <w:p>
+                                <w:pPr>
+                                  <w:spacing w:line="276" w:lineRule="auto"/>
+                                  <w:rPr>
+                                    <w:b/>
+                                    <w:bCs/>
+                                    <w:sz w:val="24"/>
+                                    <w:szCs w:val="24"/>
+                                  </w:rPr>
+                                </w:pPr>
+                                <w:r>
+                                  <w:rPr>
+                                    <w:b/>
+                                    <w:bCs/>
+                                    <w:sz w:val="24"/>
+                                    <w:szCs w:val="24"/>
+                                  </w:rPr>
+                                  <w:t>Postleizahl, Ort:</w:t>
+                                </w:r>
+                                <w:r>
+                                  <w:t xml:space="preserve"> </w:t>
+                                </w:r>
+                                <w:r>
+                                  <w:t>{{</w:t>
+                                </w:r>
+                                <w:proofErr w:type="spellStart"/>
+                                <w:r>
+                                  <w:t>adresse</w:t>
+                                </w:r>
+                                <w:proofErr w:type="spellEnd"/>
+                                <w:r>
+                                  <w:t>}}</w:t>
+                                </w:r>
+                              </w:p>
+                              <w:p>
+                                <w:pPr>
+                                  <w:spacing w:line="276" w:lineRule="auto"/>
+                                  <w:rPr>
+                                    <w:b/>
+                                    <w:bCs/>
+                                    <w:sz w:val="24"/>
+                                    <w:szCs w:val="24"/>
+                                  </w:rPr>
+                                </w:pPr>
+                              </w:p>
+                              <w:p>
+                                <w:pPr>
+                                  <w:tabs>
+                                    <w:tab w:val="left" w:pos="851"/>
+                                  </w:tabs>
+                                  <w:spacing w:line="276" w:lineRule="auto"/>
+                                </w:pPr>
+                                <w:r>
+                                  <w:t>Telefon:</w:t>
+                                </w:r>
+                                <w:r>
+                                  <w:tab/>
+                                </w:r>
+                              </w:p>
+                              <w:p>
+                                <w:pPr>
+                                  <w:tabs>
+                                    <w:tab w:val="left" w:pos="851"/>
+                                  </w:tabs>
+                                  <w:spacing w:line="276" w:lineRule="auto"/>
+                                </w:pPr>
+                                <w:r>
+                                  <w:t>Fax:</w:t>
+                                </w:r>
+                                <w:r>
+                                  <w:tab/>
+                                </w:r>
+                              </w:p>
+                              <w:p>
+                                <w:pPr>
+                                  <w:tabs>
+                                    <w:tab w:val="left" w:pos="851"/>
+                                  </w:tabs>
+                                  <w:spacing w:line="276" w:lineRule="auto"/>
+                                </w:pPr>
+                                <w:r>
+                                  <w:t>E-Mail:</w:t>
+                                </w:r>
+                                <w:r>
+                                  <w:tab/>
+                                </w:r>
+                                <w:r>
+                                  <w:t>{{</w:t>
+                                </w:r>
+                                <w:proofErr w:type="gramStart"/>
+                                <w:r>
+                                  <w:t>email</w:t>
+                                </w:r>
+                                <w:proofErr w:type="gramEnd"/>
+                                <w:r>
+                                  <w:t>}}</w:t>
+                                </w:r>
+                              </w:p>
+                              <w:p>
+                                <w:pPr>
+                                  <w:rPr>
+                                    <w:b/>
+                                    <w:bCs/>
+                                    <w:sz w:val="18"/>
+                                    <w:szCs w:val="18"/>
+                                  </w:rPr>
+                                </w:pPr>
+                              </w:p>
+                            </w:txbxContent>
+                          </wps:txbx>
+                          <wps:bodyPr rot="0" vert="horz" wrap="square" lIns="91440" tIns="45720" rIns="91440" bIns="45720" anchor="t" anchorCtr="0">
+                            <a:noAutofit/>
+                          </wps:bodyPr>
+                        </wps:wsp>
+                      </a:graphicData>
+                    </a:graphic>
+                    <wp14:sizeRelH relativeFrom="margin">
+                      <wp14:pctWidth>0</wp14:pctWidth>
+                    </wp14:sizeRelH>
+                    <wp14:sizeRelV relativeFrom="margin">
+                      <wp14:pctHeight>0</wp14:pctHeight>
+                    </wp14:sizeRelV>
+                  </wp:anchor>
+                </w:drawing>
+              </mc:Choice>
+              <mc:Fallback>
+                <w:pict>
+                  <v:shape w14:anchorId="622881BA" id="_x0000_s1028" type="#_x0000_t202" style="position:absolute;margin-left:259.2pt;margin-top:1.05pt;width:241.25pt;height:150.25pt;z-index:-251682304;visibility:visible;mso-wrap-style:square;mso-width-percent:0;mso-height-percent:0;mso-wrap-distance-left:9pt;mso-wrap-distance-top:3.6pt;mso-wrap-distance-right:9pt;mso-wrap-distance-bottom:3.6pt;mso-position-horizontal:absolute;mso-position-horizontal-relative:text;mso-position-vertical:absolute;mso-position-vertical-relative:text;mso-width-percent:0;mso-height-percent:0;mso-width-relative:margin;mso-height-relative:margin;v-text-anchor:top" o:gfxdata="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" fillcolor="#f2f2f2 [3052]" stroked="f">
+                    <v:fill opacity="55769f"/>
+                    <v:textbox>
+                      <w:txbxContent>
+                        <w:p>
+                          <w:pPr>
+                            <w:spacing w:line="276" w:lineRule="auto"/>
+                            <w:rPr>
+                              <w:b/>
+                              <w:bCs/>
+                              <w:sz w:val="24"/>
+                              <w:szCs w:val="24"/>
+                            </w:rPr>
+                          </w:pPr>
+                          <w:r>
+                            <w:rPr>
+                              <w:b/>
+                              <w:bCs/>
+                              <w:sz w:val="24"/>
+                              <w:szCs w:val="24"/>
+                            </w:rPr>
+                            <w:t>Firmenname:</w:t>
+                          </w:r>
+                          <w:r>
+                            <w:rPr>
+                              <w:b/>
+                              <w:bCs/>
+                              <w:sz w:val="24"/>
+                              <w:szCs w:val="24"/>
+                            </w:rPr>
+                            <w:t xml:space="preserve"> </w:t>
+                          </w:r>
+                          <w:r>
+                            <w:t>{{</w:t>
+                          </w:r>
+                          <w:proofErr w:type="spellStart"/>
+                          <w:r>
+                            <w:t>kunde</w:t>
+                          </w:r>
+                          <w:proofErr w:type="spellEnd"/>
+                          <w:r>
+                            <w:t>}}</w:t>
+                          </w:r>
+                        </w:p>
+                        <w:p>
+                          <w:pPr>
+                            <w:spacing w:line="276" w:lineRule="auto"/>
+                            <w:rPr>
+                              <w:b/>
+                              <w:bCs/>
+                              <w:sz w:val="24"/>
+                              <w:szCs w:val="24"/>
+                            </w:rPr>
+                          </w:pPr>
+                          <w:r>
+                            <w:rPr>
+                              <w:b/>
+                              <w:bCs/>
+                              <w:sz w:val="24"/>
+                              <w:szCs w:val="24"/>
+                            </w:rPr>
+                            <w:t>Name:</w:t>
+                          </w:r>
+                          <w:r>
+                            <w:t xml:space="preserve"> </w:t>
+                          </w:r>
+                          <w:r>
+                            <w:t>{{</w:t>
+                          </w:r>
+                          <w:proofErr w:type="spellStart"/>
+                          <w:r>
+                            <w:t>ansprechpartner</w:t>
+                          </w:r>
+                          <w:proofErr w:type="spellEnd"/>
+                          <w:r>
+                            <w:t>}}</w:t>
+                          </w:r>
+                        </w:p>
+                        <w:p>
+                          <w:pPr>
+                            <w:spacing w:line="276" w:lineRule="auto"/>
+                            <w:rPr>
+                              <w:b/>
+                              <w:bCs/>
+                              <w:sz w:val="24"/>
+                              <w:szCs w:val="24"/>
+                            </w:rPr>
+                          </w:pPr>
+                          <w:r>
+                            <w:rPr>
+                              <w:b/>
+                              <w:bCs/>
+                              <w:sz w:val="24"/>
+                              <w:szCs w:val="24"/>
+                            </w:rPr>
+                            <w:t>Strasse:</w:t>
+                          </w:r>
+                          <w:r>
+                            <w:t xml:space="preserve"> </w:t>
+                          </w:r>
+                          <w:r>
+                            <w:t>{{</w:t>
+                          </w:r>
+                          <w:proofErr w:type="spellStart"/>
+                          <w:r>
+                            <w:t>adresse</w:t>
+                          </w:r>
+                          <w:proofErr w:type="spellEnd"/>
+                          <w:r>
+                            <w:t>}}</w:t>
+                          </w:r>
+                        </w:p>
+                        <w:p>
+                          <w:pPr>
+                            <w:spacing w:line="276" w:lineRule="auto"/>
+                            <w:rPr>
+                              <w:b/>
+                              <w:bCs/>
+                              <w:sz w:val="24"/>
+                              <w:szCs w:val="24"/>
+                            </w:rPr>
+                          </w:pPr>
+                          <w:r>
+                            <w:rPr>
+                              <w:b/>
+                              <w:bCs/>
+                              <w:sz w:val="24"/>
+                              <w:szCs w:val="24"/>
+                            </w:rPr>
+                            <w:t>Postleizahl, Ort:</w:t>
+                          </w:r>
+                          <w:r>
+                            <w:t xml:space="preserve"> </w:t>
+                          </w:r>
+                          <w:r>
+                            <w:t>{{</w:t>
+                          </w:r>
+                          <w:proofErr w:type="spellStart"/>
+                          <w:r>
+                            <w:t>adresse</w:t>
+                          </w:r>
+                          <w:proofErr w:type="spellEnd"/>
+                          <w:r>
+                            <w:t>}}</w:t>
+                          </w:r>
+                        </w:p>
+                        <w:p>
+                          <w:pPr>
+                            <w:spacing w:line="276" w:lineRule="auto"/>
+                            <w:rPr>
+                              <w:b/>
+                              <w:bCs/>
+                              <w:sz w:val="24"/>
+                              <w:szCs w:val="24"/>
+                            </w:rPr>
+                          </w:pPr>
+                        </w:p>
+                        <w:p>
+                          <w:pPr>
+                            <w:tabs>
+                              <w:tab w:val="left" w:pos="851"/>
+                            </w:tabs>
+                            <w:spacing w:line="276" w:lineRule="auto"/>
+                          </w:pPr>
+                          <w:r>
+                            <w:t>Telefon:</w:t>
+                          </w:r>
+                          <w:r>
+                            <w:tab/>
+                          </w:r>
+                        </w:p>
+                        <w:p>
+                          <w:pPr>
+                            <w:tabs>
+                              <w:tab w:val="left" w:pos="851"/>
+                            </w:tabs>
+                            <w:spacing w:line="276" w:lineRule="auto"/>
+                          </w:pPr>
+                          <w:r>
+                            <w:t>Fax:</w:t>
+                          </w:r>
+                          <w:r>
+                            <w:tab/>
+                          </w:r>
+                        </w:p>
+                        <w:p>
+                          <w:pPr>
+                            <w:tabs>
+                              <w:tab w:val="left" w:pos="851"/>
+                            </w:tabs>
+                            <w:spacing w:line="276" w:lineRule="auto"/>
+                          </w:pPr>
+                          <w:r>
+                            <w:t>E-Mail:</w:t>
+                          </w:r>
+                          <w:r>
+                            <w:tab/>
+                          </w:r>
+                          <w:r>
+                            <w:t>{{</w:t>
+                          </w:r>
+                          <w:proofErr w:type="gramStart"/>
+                          <w:r>
+                            <w:t>email</w:t>
+                          </w:r>
+                          <w:proofErr w:type="gramEnd"/>
+                          <w:r>
+                            <w:t>}}</w:t>
+                          </w:r>
+                        </w:p>
+                        <w:p>
+                          <w:pPr>
+                            <w:rPr>
+                              <w:b/>
+                              <w:bCs/>
+                              <w:sz w:val="18"/>
+                              <w:szCs w:val="18"/>
+                            </w:rPr>
+                          </w:pPr>
+                        </w:p>
+                      </w:txbxContent>
+                    </v:textbox>
+                  </v:shape>
+                </w:pict>
+              </mc:Fallback>
+            </mc:AlternateContent>
           </w:r>
         </w:p>
         <w:p>
@@ -703,22 +1542,34 @@
     </w:p>
     <w:p>
       <w:r>
+        <w:lastRenderedPageBreak/>
+        <w:t xml:space="preserve">Sehr geehrter Herr </w:t>
+      </w:r>
+      <w:r>
+        <w:t>{{</w:t>
+      </w:r>
+      <w:proofErr w:type="spellStart"/>
+      <w:r>
+        <w:t>ansprechpartner</w:t>
+      </w:r>
+      <w:proofErr w:type="spellEnd"/>
+      <w:r>
+        <w:t>}}</w:t>
+      </w:r>
+      <w:r>
         <w:rPr>
           <w:highlight w:val="yellow"/>
         </w:rPr>
-        <w:t xml:space="preserve">Sehr geehrter Herr </w:t>
-      </w:r>
-      <w:r>
-        <w:rPr>
-          <w:highlight w:val="yellow"/>
-        </w:rPr>
-        <w:t>{{ansprechpartner}}</w:t>
-      </w:r>
-      <w:r>
-        <w:rPr>
-          <w:highlight w:val="yellow"/>
-        </w:rPr>
         <w:t>,</w:t>
+      </w:r>
+      <w:r>
+        <w:fldChar w:fldCharType="begin"/>
+      </w:r>
+      <w:r>
+        <w:instrText xml:space="preserve">  </w:instrText>
+      </w:r>
+      <w:r>
+        <w:fldChar w:fldCharType="end"/>
       </w:r>
     </w:p>
     <w:p>
@@ -1478,7 +2329,23 @@
                 <w:sz w:val="20"/>
                 <w:szCs w:val="20"/>
               </w:rPr>
-              <w:t>{{erstellt_von}}</w:t>
+              <w:t>{{</w:t>
+            </w:r>
+            <w:proofErr w:type="spellStart"/>
+            <w:r>
+              <w:rPr>
+                <w:sz w:val="20"/>
+                <w:szCs w:val="20"/>
+              </w:rPr>
+              <w:t>erstellt_von</w:t>
+            </w:r>
+            <w:proofErr w:type="spellEnd"/>
+            <w:r>
+              <w:rPr>
+                <w:sz w:val="20"/>
+                <w:szCs w:val="20"/>
+              </w:rPr>
+              <w:t>}}</w:t>
             </w:r>
           </w:p>
         </w:tc>
@@ -1810,7 +2677,21 @@
               <w:rPr>
                 <w:szCs w:val="20"/>
               </w:rPr>
-              <w:t>{{einleitung}}</w:t>
+              <w:t>{{</w:t>
+            </w:r>
+            <w:proofErr w:type="spellStart"/>
+            <w:r>
+              <w:rPr>
+                <w:szCs w:val="20"/>
+              </w:rPr>
+              <w:t>einleitung</w:t>
+            </w:r>
+            <w:proofErr w:type="spellEnd"/>
+            <w:r>
+              <w:rPr>
+                <w:szCs w:val="20"/>
+              </w:rPr>
+              <w:t>}}</w:t>
             </w:r>
           </w:p>
           <w:p>
@@ -1915,26 +2796,24 @@
                 <w:szCs w:val="20"/>
                 <w:lang w:val="de-CH"/>
               </w:rPr>
-              <w:t>{{konfiguration}}</w:t>
-            </w:r>
-          </w:p>
-          <w:p>
-            <w:pPr>
-              <w:pStyle w:val="ANGEBOTDEUTSCH"/>
+              <w:t>{{</w:t>
+            </w:r>
+            <w:proofErr w:type="spellStart"/>
+            <w:r>
               <w:rPr>
                 <w:szCs w:val="20"/>
                 <w:lang w:val="de-CH"/>
               </w:rPr>
-            </w:pPr>
-          </w:p>
-          <w:p>
-            <w:pPr>
-              <w:pStyle w:val="ANGEBOTDEUTSCH"/>
+              <w:t>konfiguration</w:t>
+            </w:r>
+            <w:proofErr w:type="spellEnd"/>
+            <w:r>
               <w:rPr>
                 <w:szCs w:val="20"/>
                 <w:lang w:val="de-CH"/>
               </w:rPr>
-            </w:pPr>
+              <w:t>}}</w:t>
+            </w:r>
           </w:p>
           <w:p>
             <w:pPr>
@@ -1944,13 +2823,15 @@
                 <w:lang w:val="de-CH"/>
               </w:rPr>
             </w:pPr>
-            <w:r>
+          </w:p>
+          <w:p>
+            <w:pPr>
+              <w:pStyle w:val="ANGEBOTDEUTSCH"/>
               <w:rPr>
                 <w:szCs w:val="20"/>
                 <w:lang w:val="de-CH"/>
               </w:rPr>
-              <w:t>{{leistungsumfang_text}}</w:t>
-            </w:r>
+            </w:pPr>
           </w:p>
           <w:p>
             <w:pPr>
@@ -1960,39 +2841,87 @@
                 <w:lang w:val="de-CH"/>
               </w:rPr>
             </w:pPr>
-          </w:p>
-          <w:p>
-            <w:pPr>
-              <w:pStyle w:val="ANGEBOTDEUTSCH"/>
+            <w:r>
               <w:rPr>
                 <w:szCs w:val="20"/>
                 <w:lang w:val="de-CH"/>
               </w:rPr>
-            </w:pPr>
-          </w:p>
-          <w:p>
-            <w:pPr>
-              <w:pStyle w:val="ANGEBOTDEUTSCH"/>
+              <w:t>{{</w:t>
+            </w:r>
+            <w:proofErr w:type="spellStart"/>
+            <w:r>
               <w:rPr>
                 <w:szCs w:val="20"/>
                 <w:lang w:val="de-CH"/>
               </w:rPr>
-            </w:pPr>
-          </w:p>
-          <w:p>
-            <w:pPr>
-              <w:pStyle w:val="ANGEBOTDEUTSCH"/>
+              <w:t>leistungsumfang_text</w:t>
+            </w:r>
+            <w:proofErr w:type="spellEnd"/>
+            <w:r>
               <w:rPr>
                 <w:szCs w:val="20"/>
                 <w:lang w:val="de-CH"/>
               </w:rPr>
-            </w:pPr>
-            <w:r>
+              <w:t>}}</w:t>
+            </w:r>
+          </w:p>
+          <w:p>
+            <w:pPr>
+              <w:pStyle w:val="ANGEBOTDEUTSCH"/>
               <w:rPr>
                 <w:szCs w:val="20"/>
                 <w:lang w:val="de-CH"/>
               </w:rPr>
-              <w:t>{{optionen_text}}</w:t>
+            </w:pPr>
+          </w:p>
+          <w:p>
+            <w:pPr>
+              <w:pStyle w:val="ANGEBOTDEUTSCH"/>
+              <w:rPr>
+                <w:szCs w:val="20"/>
+                <w:lang w:val="de-CH"/>
+              </w:rPr>
+            </w:pPr>
+          </w:p>
+          <w:p>
+            <w:pPr>
+              <w:pStyle w:val="ANGEBOTDEUTSCH"/>
+              <w:rPr>
+                <w:szCs w:val="20"/>
+                <w:lang w:val="de-CH"/>
+              </w:rPr>
+            </w:pPr>
+          </w:p>
+          <w:p>
+            <w:pPr>
+              <w:pStyle w:val="ANGEBOTDEUTSCH"/>
+              <w:rPr>
+                <w:szCs w:val="20"/>
+                <w:lang w:val="de-CH"/>
+              </w:rPr>
+            </w:pPr>
+            <w:r>
+              <w:rPr>
+                <w:szCs w:val="20"/>
+                <w:lang w:val="de-CH"/>
+              </w:rPr>
+              <w:t>{{</w:t>
+            </w:r>
+            <w:proofErr w:type="spellStart"/>
+            <w:r>
+              <w:rPr>
+                <w:szCs w:val="20"/>
+                <w:lang w:val="de-CH"/>
+              </w:rPr>
+              <w:t>optionen_text</w:t>
+            </w:r>
+            <w:proofErr w:type="spellEnd"/>
+            <w:r>
+              <w:rPr>
+                <w:szCs w:val="20"/>
+                <w:lang w:val="de-CH"/>
+              </w:rPr>
+              <w:t>}}</w:t>
             </w:r>
           </w:p>
           <w:p>
@@ -2272,7 +3201,27 @@
                 <w:szCs w:val="20"/>
                 <w:lang w:val="de-CH"/>
               </w:rPr>
-              <w:t>{{optionen_text}}</w:t>
+              <w:t>{{</w:t>
+            </w:r>
+            <w:proofErr w:type="spellStart"/>
+            <w:r>
+              <w:rPr>
+                <w:rFonts w:cs="Arial"/>
+                <w:b/>
+                <w:szCs w:val="20"/>
+                <w:lang w:val="de-CH"/>
+              </w:rPr>
+              <w:t>optionen_text</w:t>
+            </w:r>
+            <w:proofErr w:type="spellEnd"/>
+            <w:r>
+              <w:rPr>
+                <w:rFonts w:cs="Arial"/>
+                <w:b/>
+                <w:szCs w:val="20"/>
+                <w:lang w:val="de-CH"/>
+              </w:rPr>
+              <w:t>}}</w:t>
             </w:r>
           </w:p>
         </w:tc>

</xml_diff>

<commit_message>
Word: Logimat-Titelseite als Angebots-Cover
Vorlage wieder aktiv; Cover-Platzhalter (Adresse, Datum, Telefon,
SSI-Kontakte) und Software-/Preisblock; Maschinen-TOC entfernt.

Co-authored-by: msobona <msobona@users.noreply.github.com>
</commit_message>
<xml_diff>
--- a/docs/templates/Angebot Logimat DE.docx
+++ b/docs/templates/Angebot Logimat DE.docx
@@ -9,331 +9,8 @@
         </w:rPr>
       </w:pPr>
       <w:r>
-        <w:rPr>
-          <w:noProof/>
-        </w:rPr>
-        <w:drawing>
-          <wp:anchor distT="0" distB="0" distL="114300" distR="114300" simplePos="0" relativeHeight="251632127" behindDoc="1" locked="0" layoutInCell="1" allowOverlap="1" wp14:anchorId="307E5AE9" wp14:editId="3EF8594B">
-            <wp:simplePos x="0" y="0"/>
-            <wp:positionH relativeFrom="leftMargin">
-              <wp:posOffset>5080</wp:posOffset>
-            </wp:positionH>
-            <wp:positionV relativeFrom="paragraph">
-              <wp:posOffset>-2260287</wp:posOffset>
-            </wp:positionV>
-            <wp:extent cx="7560000" cy="10674000"/>
-            <wp:effectExtent l="0" t="0" r="3175" b="0"/>
-            <wp:wrapNone/>
-            <wp:docPr id="18" name="Grafik 18" descr="C:\Users\johunwu\AppData\Local\Microsoft\Windows\INetCache\Content.Word\SLL_Titelmotiv.jpg"/>
-            <wp:cNvGraphicFramePr/>
-            <a:graphic xmlns:a="http://schemas.openxmlformats.org/drawingml/2006/main">
-              <a:graphicData uri="http://schemas.openxmlformats.org/drawingml/2006/picture">
-                <pic:pic xmlns:pic="http://schemas.openxmlformats.org/drawingml/2006/picture">
-                  <pic:nvPicPr>
-                    <pic:cNvPr id="40" name="Grafik 40" descr="C:\Users\johunwu\AppData\Local\Microsoft\Windows\INetCache\Content.Word\SLL_Titelmotiv.jpg"/>
-                    <pic:cNvPicPr/>
-                  </pic:nvPicPr>
-                  <pic:blipFill>
-                    <a:blip r:embed="rId11" cstate="print">
-                      <a:extLst>
-                        <a:ext uri="{28A0092B-C50C-407E-A947-70E740481C1C}">
-                          <a14:useLocalDpi xmlns:a14="http://schemas.microsoft.com/office/drawing/2010/main" val="0"/>
-                        </a:ext>
-                      </a:extLst>
-                    </a:blip>
-                    <a:srcRect/>
-                    <a:stretch>
-                      <a:fillRect/>
-                    </a:stretch>
-                  </pic:blipFill>
-                  <pic:spPr bwMode="auto">
-                    <a:xfrm>
-                      <a:off x="0" y="0"/>
-                      <a:ext cx="7560000" cy="10674000"/>
-                    </a:xfrm>
-                    <a:prstGeom prst="rect">
-                      <a:avLst/>
-                    </a:prstGeom>
-                    <a:noFill/>
-                    <a:ln>
-                      <a:noFill/>
-                    </a:ln>
-                  </pic:spPr>
-                </pic:pic>
-              </a:graphicData>
-            </a:graphic>
-            <wp14:sizeRelH relativeFrom="page">
-              <wp14:pctWidth>0</wp14:pctWidth>
-            </wp14:sizeRelH>
-            <wp14:sizeRelV relativeFrom="page">
-              <wp14:pctHeight>0</wp14:pctHeight>
-            </wp14:sizeRelV>
-          </wp:anchor>
-        </w:drawing>
-      </w:r>
-      <w:r>
-        <w:rPr>
-          <w:noProof/>
-          <w:lang w:val="de-DE" w:eastAsia="de-DE"/>
-        </w:rPr>
-        <mc:AlternateContent>
-          <mc:Choice Requires="wps">
-            <w:drawing>
-              <wp:anchor distT="0" distB="0" distL="114300" distR="114300" simplePos="0" relativeHeight="251661824" behindDoc="0" locked="0" layoutInCell="1" allowOverlap="1" wp14:anchorId="535DBA41" wp14:editId="24642FD4">
-                <wp:simplePos x="0" y="0"/>
-                <wp:positionH relativeFrom="column">
-                  <wp:posOffset>-888365</wp:posOffset>
-                </wp:positionH>
-                <wp:positionV relativeFrom="paragraph">
-                  <wp:posOffset>65074</wp:posOffset>
-                </wp:positionV>
-                <wp:extent cx="3227705" cy="548640"/>
-                <wp:effectExtent l="0" t="0" r="0" b="3810"/>
-                <wp:wrapNone/>
-                <wp:docPr id="4" name="Textfeld 4"/>
-                <wp:cNvGraphicFramePr/>
-                <a:graphic xmlns:a="http://schemas.openxmlformats.org/drawingml/2006/main">
-                  <a:graphicData uri="http://schemas.microsoft.com/office/word/2010/wordprocessingShape">
-                    <wps:wsp>
-                      <wps:cNvSpPr txBox="1"/>
-                      <wps:spPr>
-                        <a:xfrm>
-                          <a:off x="0" y="0"/>
-                          <a:ext cx="3227705" cy="548640"/>
-                        </a:xfrm>
-                        <a:prstGeom prst="rect">
-                          <a:avLst/>
-                        </a:prstGeom>
-                        <a:noFill/>
-                        <a:ln w="6350">
-                          <a:noFill/>
-                        </a:ln>
-                      </wps:spPr>
-                      <wps:txbx>
-                        <w:txbxContent>
-                          <w:p>
-                            <w:pPr>
-                              <w:ind w:firstLine="142"/>
-                              <w:rPr>
-                                <w:b/>
-                                <w:bCs/>
-                                <w:sz w:val="44"/>
-                                <w:szCs w:val="44"/>
-                              </w:rPr>
-                            </w:pPr>
-                            <w:r>
-                              <w:rPr>
-                                <w:b/>
-                                <w:bCs/>
-                                <w:sz w:val="44"/>
-                                <w:szCs w:val="44"/>
-                              </w:rPr>
-                              <w:t>{{</w:t>
-                            </w:r>
-                            <w:proofErr w:type="spellStart"/>
-                            <w:r>
-                              <w:rPr>
-                                <w:b/>
-                                <w:bCs/>
-                                <w:sz w:val="44"/>
-                                <w:szCs w:val="44"/>
-                              </w:rPr>
-                              <w:t>titel</w:t>
-                            </w:r>
-                            <w:proofErr w:type="spellEnd"/>
-                            <w:r>
-                              <w:rPr>
-                                <w:b/>
-                                <w:bCs/>
-                                <w:sz w:val="44"/>
-                                <w:szCs w:val="44"/>
-                              </w:rPr>
-                              <w:t>}}</w:t>
-                            </w:r>
-                            <w:r>
-                              <w:rPr>
-                                <w:b/>
-                                <w:bCs/>
-                                <w:sz w:val="44"/>
-                                <w:szCs w:val="44"/>
-                              </w:rPr>
-                              <w:t xml:space="preserve"> </w:t>
-                            </w:r>
-                          </w:p>
-                          <w:p>
-                            <w:pPr>
-                              <w:ind w:firstLine="142"/>
-                              <w:rPr>
-                                <w:b/>
-                                <w:bCs/>
-                              </w:rPr>
-                            </w:pPr>
-                            <w:r>
-                              <w:rPr>
-                                <w:b/>
-                                <w:bCs/>
-                              </w:rPr>
-                              <w:fldChar w:fldCharType="begin"/>
-                            </w:r>
-                            <w:r>
-                              <w:rPr>
-                                <w:b/>
-                                <w:bCs/>
-                              </w:rPr>
-                              <w:instrText xml:space="preserve"> TIME \@ "dd.MM.yyyy" </w:instrText>
-                            </w:r>
-                            <w:r>
-                              <w:rPr>
-                                <w:b/>
-                                <w:bCs/>
-                              </w:rPr>
-                              <w:fldChar w:fldCharType="separate"/>
-                            </w:r>
-                            <w:r>
-                              <w:rPr>
-                                <w:b/>
-                                <w:bCs/>
-                                <w:noProof/>
-                              </w:rPr>
-                              <w:t>20.07.2026</w:t>
-                            </w:r>
-                            <w:r>
-                              <w:rPr>
-                                <w:b/>
-                                <w:bCs/>
-                              </w:rPr>
-                              <w:fldChar w:fldCharType="end"/>
-                            </w:r>
-                          </w:p>
-                        </w:txbxContent>
-                      </wps:txbx>
-                      <wps:bodyPr rot="0" spcFirstLastPara="0" vertOverflow="overflow" horzOverflow="overflow" vert="horz" wrap="square" lIns="91440" tIns="45720" rIns="91440" bIns="45720" numCol="1" spcCol="0" rtlCol="0" fromWordArt="0" anchor="ctr" anchorCtr="0" forceAA="0" compatLnSpc="1">
-                        <a:prstTxWarp prst="textNoShape">
-                          <a:avLst/>
-                        </a:prstTxWarp>
-                        <a:noAutofit/>
-                      </wps:bodyPr>
-                    </wps:wsp>
-                  </a:graphicData>
-                </a:graphic>
-                <wp14:sizeRelH relativeFrom="margin">
-                  <wp14:pctWidth>0</wp14:pctWidth>
-                </wp14:sizeRelH>
-                <wp14:sizeRelV relativeFrom="margin">
-                  <wp14:pctHeight>0</wp14:pctHeight>
-                </wp14:sizeRelV>
-              </wp:anchor>
-            </w:drawing>
-          </mc:Choice>
-          <mc:Fallback>
-            <w:pict>
-              <v:shapetype w14:anchorId="535DBA41" id="_x0000_t202" coordsize="21600,21600" o:spt="202" path="m,l,21600r21600,l21600,xe">
-                <v:stroke joinstyle="miter"/>
-                <v:path gradientshapeok="t" o:connecttype="rect"/>
-              </v:shapetype>
-              <v:shape id="Textfeld 4" o:spid="_x0000_s1026" type="#_x0000_t202" style="position:absolute;margin-left:-69.95pt;margin-top:5.1pt;width:254.15pt;height:43.2pt;z-index:251661824;visibility:visible;mso-wrap-style:square;mso-width-percent:0;mso-height-percent:0;mso-wrap-distance-left:9pt;mso-wrap-distance-top:0;mso-wrap-distance-right:9pt;mso-wrap-distance-bottom:0;mso-position-horizontal:absolute;mso-position-horizontal-relative:text;mso-position-vertical:absolute;mso-position-vertical-relative:text;mso-width-percent:0;mso-height-percent:0;mso-width-relative:margin;mso-height-relative:margin;v-text-anchor:middle" o:gfxdata="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" filled="f" stroked="f" strokeweight=".5pt">
-                <v:textbox>
-                  <w:txbxContent>
-                    <w:p>
-                      <w:pPr>
-                        <w:ind w:firstLine="142"/>
-                        <w:rPr>
-                          <w:b/>
-                          <w:bCs/>
-                          <w:sz w:val="44"/>
-                          <w:szCs w:val="44"/>
-                        </w:rPr>
-                      </w:pPr>
-                      <w:r>
-                        <w:rPr>
-                          <w:b/>
-                          <w:bCs/>
-                          <w:sz w:val="44"/>
-                          <w:szCs w:val="44"/>
-                        </w:rPr>
-                        <w:t>{{</w:t>
-                      </w:r>
-                      <w:proofErr w:type="spellStart"/>
-                      <w:r>
-                        <w:rPr>
-                          <w:b/>
-                          <w:bCs/>
-                          <w:sz w:val="44"/>
-                          <w:szCs w:val="44"/>
-                        </w:rPr>
-                        <w:t>titel</w:t>
-                      </w:r>
-                      <w:proofErr w:type="spellEnd"/>
-                      <w:r>
-                        <w:rPr>
-                          <w:b/>
-                          <w:bCs/>
-                          <w:sz w:val="44"/>
-                          <w:szCs w:val="44"/>
-                        </w:rPr>
-                        <w:t>}}</w:t>
-                      </w:r>
-                      <w:r>
-                        <w:rPr>
-                          <w:b/>
-                          <w:bCs/>
-                          <w:sz w:val="44"/>
-                          <w:szCs w:val="44"/>
-                        </w:rPr>
-                        <w:t xml:space="preserve"> </w:t>
-                      </w:r>
-                    </w:p>
-                    <w:p>
-                      <w:pPr>
-                        <w:ind w:firstLine="142"/>
-                        <w:rPr>
-                          <w:b/>
-                          <w:bCs/>
-                        </w:rPr>
-                      </w:pPr>
-                      <w:r>
-                        <w:rPr>
-                          <w:b/>
-                          <w:bCs/>
-                        </w:rPr>
-                        <w:fldChar w:fldCharType="begin"/>
-                      </w:r>
-                      <w:r>
-                        <w:rPr>
-                          <w:b/>
-                          <w:bCs/>
-                        </w:rPr>
-                        <w:instrText xml:space="preserve"> TIME \@ "dd.MM.yyyy" </w:instrText>
-                      </w:r>
-                      <w:r>
-                        <w:rPr>
-                          <w:b/>
-                          <w:bCs/>
-                        </w:rPr>
-                        <w:fldChar w:fldCharType="separate"/>
-                      </w:r>
-                      <w:r>
-                        <w:rPr>
-                          <w:b/>
-                          <w:bCs/>
-                          <w:noProof/>
-                        </w:rPr>
-                        <w:t>20.07.2026</w:t>
-                      </w:r>
-                      <w:r>
-                        <w:rPr>
-                          <w:b/>
-                          <w:bCs/>
-                        </w:rPr>
-                        <w:fldChar w:fldCharType="end"/>
-                      </w:r>
-                    </w:p>
-                  </w:txbxContent>
-                </v:textbox>
-              </v:shape>
-            </w:pict>
-          </mc:Fallback>
-        </mc:AlternateContent>
+        <w:rPr/>
+        <w:t xml:space="preserve">{{titel}} {{datum}}{{titel}} {{datum}}</w:t>
       </w:r>
     </w:p>
     <w:p>
@@ -639,518 +316,8 @@
             </w:rPr>
           </w:pPr>
           <w:r>
-            <w:rPr>
-              <w:noProof/>
-            </w:rPr>
-            <mc:AlternateContent>
-              <mc:Choice Requires="wps">
-                <w:drawing>
-                  <wp:anchor distT="45720" distB="45720" distL="114300" distR="114300" simplePos="0" relativeHeight="251634176" behindDoc="1" locked="0" layoutInCell="1" allowOverlap="1" wp14:anchorId="622881BA" wp14:editId="4705950F">
-                    <wp:simplePos x="0" y="0"/>
-                    <wp:positionH relativeFrom="column">
-                      <wp:posOffset>3291560</wp:posOffset>
-                    </wp:positionH>
-                    <wp:positionV relativeFrom="paragraph">
-                      <wp:posOffset>13343</wp:posOffset>
-                    </wp:positionV>
-                    <wp:extent cx="3063833" cy="1908175"/>
-                    <wp:effectExtent l="0" t="0" r="3810" b="0"/>
-                    <wp:wrapNone/>
-                    <wp:docPr id="217" name="Textfeld 2"/>
-                    <wp:cNvGraphicFramePr>
-                      <a:graphicFrameLocks xmlns:a="http://schemas.openxmlformats.org/drawingml/2006/main"/>
-                    </wp:cNvGraphicFramePr>
-                    <a:graphic xmlns:a="http://schemas.openxmlformats.org/drawingml/2006/main">
-                      <a:graphicData uri="http://schemas.microsoft.com/office/word/2010/wordprocessingShape">
-                        <wps:wsp>
-                          <wps:cNvSpPr txBox="1">
-                            <a:spLocks noChangeArrowheads="1"/>
-                          </wps:cNvSpPr>
-                          <wps:spPr bwMode="auto">
-                            <a:xfrm>
-                              <a:off x="0" y="0"/>
-                              <a:ext cx="3063833" cy="1908175"/>
-                            </a:xfrm>
-                            <a:prstGeom prst="rect">
-                              <a:avLst/>
-                            </a:prstGeom>
-                            <a:solidFill>
-                              <a:schemeClr val="bg1">
-                                <a:lumMod val="95000"/>
-                                <a:alpha val="85000"/>
-                              </a:schemeClr>
-                            </a:solidFill>
-                            <a:ln w="9525">
-                              <a:noFill/>
-                              <a:miter lim="800000"/>
-                              <a:headEnd/>
-                              <a:tailEnd/>
-                            </a:ln>
-                            <a:effectLst/>
-                          </wps:spPr>
-                          <wps:txbx>
-                            <w:txbxContent>
-                              <w:p>
-                                <w:pPr>
-                                  <w:spacing w:line="276" w:lineRule="auto"/>
-                                  <w:rPr>
-                                    <w:b/>
-                                    <w:bCs/>
-                                    <w:sz w:val="24"/>
-                                    <w:szCs w:val="24"/>
-                                  </w:rPr>
-                                </w:pPr>
-                                <w:r>
-                                  <w:rPr>
-                                    <w:b/>
-                                    <w:bCs/>
-                                    <w:sz w:val="24"/>
-                                    <w:szCs w:val="24"/>
-                                  </w:rPr>
-                                  <w:t>Firmenname:</w:t>
-                                </w:r>
-                                <w:r>
-                                  <w:rPr>
-                                    <w:b/>
-                                    <w:bCs/>
-                                    <w:sz w:val="24"/>
-                                    <w:szCs w:val="24"/>
-                                  </w:rPr>
-                                  <w:t xml:space="preserve"> </w:t>
-                                </w:r>
-                                <w:r>
-                                  <w:t>{{</w:t>
-                                </w:r>
-                                <w:proofErr w:type="spellStart"/>
-                                <w:r>
-                                  <w:t>kunde</w:t>
-                                </w:r>
-                                <w:proofErr w:type="spellEnd"/>
-                                <w:r>
-                                  <w:t>}}</w:t>
-                                </w:r>
-                              </w:p>
-                              <w:p>
-                                <w:pPr>
-                                  <w:spacing w:line="276" w:lineRule="auto"/>
-                                  <w:rPr>
-                                    <w:b/>
-                                    <w:bCs/>
-                                    <w:sz w:val="24"/>
-                                    <w:szCs w:val="24"/>
-                                  </w:rPr>
-                                </w:pPr>
-                                <w:r>
-                                  <w:rPr>
-                                    <w:b/>
-                                    <w:bCs/>
-                                    <w:sz w:val="24"/>
-                                    <w:szCs w:val="24"/>
-                                  </w:rPr>
-                                  <w:t>Name:</w:t>
-                                </w:r>
-                                <w:r>
-                                  <w:t xml:space="preserve"> </w:t>
-                                </w:r>
-                                <w:r>
-                                  <w:t>{{</w:t>
-                                </w:r>
-                                <w:proofErr w:type="spellStart"/>
-                                <w:r>
-                                  <w:t>ansprechpartner</w:t>
-                                </w:r>
-                                <w:proofErr w:type="spellEnd"/>
-                                <w:r>
-                                  <w:t>}}</w:t>
-                                </w:r>
-                              </w:p>
-                              <w:p>
-                                <w:pPr>
-                                  <w:spacing w:line="276" w:lineRule="auto"/>
-                                  <w:rPr>
-                                    <w:b/>
-                                    <w:bCs/>
-                                    <w:sz w:val="24"/>
-                                    <w:szCs w:val="24"/>
-                                  </w:rPr>
-                                </w:pPr>
-                                <w:r>
-                                  <w:rPr>
-                                    <w:b/>
-                                    <w:bCs/>
-                                    <w:sz w:val="24"/>
-                                    <w:szCs w:val="24"/>
-                                  </w:rPr>
-                                  <w:t>Strasse:</w:t>
-                                </w:r>
-                                <w:r>
-                                  <w:t xml:space="preserve"> </w:t>
-                                </w:r>
-                                <w:r>
-                                  <w:t>{{</w:t>
-                                </w:r>
-                                <w:proofErr w:type="spellStart"/>
-                                <w:r>
-                                  <w:t>adresse</w:t>
-                                </w:r>
-                                <w:proofErr w:type="spellEnd"/>
-                                <w:r>
-                                  <w:t>}}</w:t>
-                                </w:r>
-                              </w:p>
-                              <w:p>
-                                <w:pPr>
-                                  <w:spacing w:line="276" w:lineRule="auto"/>
-                                  <w:rPr>
-                                    <w:b/>
-                                    <w:bCs/>
-                                    <w:sz w:val="24"/>
-                                    <w:szCs w:val="24"/>
-                                  </w:rPr>
-                                </w:pPr>
-                                <w:r>
-                                  <w:rPr>
-                                    <w:b/>
-                                    <w:bCs/>
-                                    <w:sz w:val="24"/>
-                                    <w:szCs w:val="24"/>
-                                  </w:rPr>
-                                  <w:t>Postleizahl, Ort:</w:t>
-                                </w:r>
-                                <w:r>
-                                  <w:t xml:space="preserve"> </w:t>
-                                </w:r>
-                                <w:r>
-                                  <w:t>{{</w:t>
-                                </w:r>
-                                <w:proofErr w:type="spellStart"/>
-                                <w:r>
-                                  <w:t>adresse</w:t>
-                                </w:r>
-                                <w:proofErr w:type="spellEnd"/>
-                                <w:r>
-                                  <w:t>}}</w:t>
-                                </w:r>
-                              </w:p>
-                              <w:p>
-                                <w:pPr>
-                                  <w:spacing w:line="276" w:lineRule="auto"/>
-                                  <w:rPr>
-                                    <w:b/>
-                                    <w:bCs/>
-                                    <w:sz w:val="24"/>
-                                    <w:szCs w:val="24"/>
-                                  </w:rPr>
-                                </w:pPr>
-                              </w:p>
-                              <w:p>
-                                <w:pPr>
-                                  <w:tabs>
-                                    <w:tab w:val="left" w:pos="851"/>
-                                  </w:tabs>
-                                  <w:spacing w:line="276" w:lineRule="auto"/>
-                                </w:pPr>
-                                <w:r>
-                                  <w:t>Telefon:</w:t>
-                                </w:r>
-                                <w:r>
-                                  <w:tab/>
-                                </w:r>
-                              </w:p>
-                              <w:p>
-                                <w:pPr>
-                                  <w:tabs>
-                                    <w:tab w:val="left" w:pos="851"/>
-                                  </w:tabs>
-                                  <w:spacing w:line="276" w:lineRule="auto"/>
-                                </w:pPr>
-                                <w:r>
-                                  <w:t>Fax:</w:t>
-                                </w:r>
-                                <w:r>
-                                  <w:tab/>
-                                </w:r>
-                              </w:p>
-                              <w:p>
-                                <w:pPr>
-                                  <w:tabs>
-                                    <w:tab w:val="left" w:pos="851"/>
-                                  </w:tabs>
-                                  <w:spacing w:line="276" w:lineRule="auto"/>
-                                </w:pPr>
-                                <w:r>
-                                  <w:t>E-Mail:</w:t>
-                                </w:r>
-                                <w:r>
-                                  <w:tab/>
-                                </w:r>
-                                <w:r>
-                                  <w:t>{{</w:t>
-                                </w:r>
-                                <w:proofErr w:type="gramStart"/>
-                                <w:r>
-                                  <w:t>email</w:t>
-                                </w:r>
-                                <w:proofErr w:type="gramEnd"/>
-                                <w:r>
-                                  <w:t>}}</w:t>
-                                </w:r>
-                              </w:p>
-                              <w:p>
-                                <w:pPr>
-                                  <w:rPr>
-                                    <w:b/>
-                                    <w:bCs/>
-                                    <w:sz w:val="18"/>
-                                    <w:szCs w:val="18"/>
-                                  </w:rPr>
-                                </w:pPr>
-                              </w:p>
-                            </w:txbxContent>
-                          </wps:txbx>
-                          <wps:bodyPr rot="0" vert="horz" wrap="square" lIns="91440" tIns="45720" rIns="91440" bIns="45720" anchor="t" anchorCtr="0">
-                            <a:noAutofit/>
-                          </wps:bodyPr>
-                        </wps:wsp>
-                      </a:graphicData>
-                    </a:graphic>
-                    <wp14:sizeRelH relativeFrom="margin">
-                      <wp14:pctWidth>0</wp14:pctWidth>
-                    </wp14:sizeRelH>
-                    <wp14:sizeRelV relativeFrom="margin">
-                      <wp14:pctHeight>0</wp14:pctHeight>
-                    </wp14:sizeRelV>
-                  </wp:anchor>
-                </w:drawing>
-              </mc:Choice>
-              <mc:Fallback>
-                <w:pict>
-                  <v:shape w14:anchorId="622881BA" id="_x0000_s1028" type="#_x0000_t202" style="position:absolute;margin-left:259.2pt;margin-top:1.05pt;width:241.25pt;height:150.25pt;z-index:-251682304;visibility:visible;mso-wrap-style:square;mso-width-percent:0;mso-height-percent:0;mso-wrap-distance-left:9pt;mso-wrap-distance-top:3.6pt;mso-wrap-distance-right:9pt;mso-wrap-distance-bottom:3.6pt;mso-position-horizontal:absolute;mso-position-horizontal-relative:text;mso-position-vertical:absolute;mso-position-vertical-relative:text;mso-width-percent:0;mso-height-percent:0;mso-width-relative:margin;mso-height-relative:margin;v-text-anchor:top" o:gfxdata="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" fillcolor="#f2f2f2 [3052]" stroked="f">
-                    <v:fill opacity="55769f"/>
-                    <v:textbox>
-                      <w:txbxContent>
-                        <w:p>
-                          <w:pPr>
-                            <w:spacing w:line="276" w:lineRule="auto"/>
-                            <w:rPr>
-                              <w:b/>
-                              <w:bCs/>
-                              <w:sz w:val="24"/>
-                              <w:szCs w:val="24"/>
-                            </w:rPr>
-                          </w:pPr>
-                          <w:r>
-                            <w:rPr>
-                              <w:b/>
-                              <w:bCs/>
-                              <w:sz w:val="24"/>
-                              <w:szCs w:val="24"/>
-                            </w:rPr>
-                            <w:t>Firmenname:</w:t>
-                          </w:r>
-                          <w:r>
-                            <w:rPr>
-                              <w:b/>
-                              <w:bCs/>
-                              <w:sz w:val="24"/>
-                              <w:szCs w:val="24"/>
-                            </w:rPr>
-                            <w:t xml:space="preserve"> </w:t>
-                          </w:r>
-                          <w:r>
-                            <w:t>{{</w:t>
-                          </w:r>
-                          <w:proofErr w:type="spellStart"/>
-                          <w:r>
-                            <w:t>kunde</w:t>
-                          </w:r>
-                          <w:proofErr w:type="spellEnd"/>
-                          <w:r>
-                            <w:t>}}</w:t>
-                          </w:r>
-                        </w:p>
-                        <w:p>
-                          <w:pPr>
-                            <w:spacing w:line="276" w:lineRule="auto"/>
-                            <w:rPr>
-                              <w:b/>
-                              <w:bCs/>
-                              <w:sz w:val="24"/>
-                              <w:szCs w:val="24"/>
-                            </w:rPr>
-                          </w:pPr>
-                          <w:r>
-                            <w:rPr>
-                              <w:b/>
-                              <w:bCs/>
-                              <w:sz w:val="24"/>
-                              <w:szCs w:val="24"/>
-                            </w:rPr>
-                            <w:t>Name:</w:t>
-                          </w:r>
-                          <w:r>
-                            <w:t xml:space="preserve"> </w:t>
-                          </w:r>
-                          <w:r>
-                            <w:t>{{</w:t>
-                          </w:r>
-                          <w:proofErr w:type="spellStart"/>
-                          <w:r>
-                            <w:t>ansprechpartner</w:t>
-                          </w:r>
-                          <w:proofErr w:type="spellEnd"/>
-                          <w:r>
-                            <w:t>}}</w:t>
-                          </w:r>
-                        </w:p>
-                        <w:p>
-                          <w:pPr>
-                            <w:spacing w:line="276" w:lineRule="auto"/>
-                            <w:rPr>
-                              <w:b/>
-                              <w:bCs/>
-                              <w:sz w:val="24"/>
-                              <w:szCs w:val="24"/>
-                            </w:rPr>
-                          </w:pPr>
-                          <w:r>
-                            <w:rPr>
-                              <w:b/>
-                              <w:bCs/>
-                              <w:sz w:val="24"/>
-                              <w:szCs w:val="24"/>
-                            </w:rPr>
-                            <w:t>Strasse:</w:t>
-                          </w:r>
-                          <w:r>
-                            <w:t xml:space="preserve"> </w:t>
-                          </w:r>
-                          <w:r>
-                            <w:t>{{</w:t>
-                          </w:r>
-                          <w:proofErr w:type="spellStart"/>
-                          <w:r>
-                            <w:t>adresse</w:t>
-                          </w:r>
-                          <w:proofErr w:type="spellEnd"/>
-                          <w:r>
-                            <w:t>}}</w:t>
-                          </w:r>
-                        </w:p>
-                        <w:p>
-                          <w:pPr>
-                            <w:spacing w:line="276" w:lineRule="auto"/>
-                            <w:rPr>
-                              <w:b/>
-                              <w:bCs/>
-                              <w:sz w:val="24"/>
-                              <w:szCs w:val="24"/>
-                            </w:rPr>
-                          </w:pPr>
-                          <w:r>
-                            <w:rPr>
-                              <w:b/>
-                              <w:bCs/>
-                              <w:sz w:val="24"/>
-                              <w:szCs w:val="24"/>
-                            </w:rPr>
-                            <w:t>Postleizahl, Ort:</w:t>
-                          </w:r>
-                          <w:r>
-                            <w:t xml:space="preserve"> </w:t>
-                          </w:r>
-                          <w:r>
-                            <w:t>{{</w:t>
-                          </w:r>
-                          <w:proofErr w:type="spellStart"/>
-                          <w:r>
-                            <w:t>adresse</w:t>
-                          </w:r>
-                          <w:proofErr w:type="spellEnd"/>
-                          <w:r>
-                            <w:t>}}</w:t>
-                          </w:r>
-                        </w:p>
-                        <w:p>
-                          <w:pPr>
-                            <w:spacing w:line="276" w:lineRule="auto"/>
-                            <w:rPr>
-                              <w:b/>
-                              <w:bCs/>
-                              <w:sz w:val="24"/>
-                              <w:szCs w:val="24"/>
-                            </w:rPr>
-                          </w:pPr>
-                        </w:p>
-                        <w:p>
-                          <w:pPr>
-                            <w:tabs>
-                              <w:tab w:val="left" w:pos="851"/>
-                            </w:tabs>
-                            <w:spacing w:line="276" w:lineRule="auto"/>
-                          </w:pPr>
-                          <w:r>
-                            <w:t>Telefon:</w:t>
-                          </w:r>
-                          <w:r>
-                            <w:tab/>
-                          </w:r>
-                        </w:p>
-                        <w:p>
-                          <w:pPr>
-                            <w:tabs>
-                              <w:tab w:val="left" w:pos="851"/>
-                            </w:tabs>
-                            <w:spacing w:line="276" w:lineRule="auto"/>
-                          </w:pPr>
-                          <w:r>
-                            <w:t>Fax:</w:t>
-                          </w:r>
-                          <w:r>
-                            <w:tab/>
-                          </w:r>
-                        </w:p>
-                        <w:p>
-                          <w:pPr>
-                            <w:tabs>
-                              <w:tab w:val="left" w:pos="851"/>
-                            </w:tabs>
-                            <w:spacing w:line="276" w:lineRule="auto"/>
-                          </w:pPr>
-                          <w:r>
-                            <w:t>E-Mail:</w:t>
-                          </w:r>
-                          <w:r>
-                            <w:tab/>
-                          </w:r>
-                          <w:r>
-                            <w:t>{{</w:t>
-                          </w:r>
-                          <w:proofErr w:type="gramStart"/>
-                          <w:r>
-                            <w:t>email</w:t>
-                          </w:r>
-                          <w:proofErr w:type="gramEnd"/>
-                          <w:r>
-                            <w:t>}}</w:t>
-                          </w:r>
-                        </w:p>
-                        <w:p>
-                          <w:pPr>
-                            <w:rPr>
-                              <w:b/>
-                              <w:bCs/>
-                              <w:sz w:val="18"/>
-                              <w:szCs w:val="18"/>
-                            </w:rPr>
-                          </w:pPr>
-                        </w:p>
-                      </w:txbxContent>
-                    </v:textbox>
-                  </v:shape>
-                </w:pict>
-              </mc:Fallback>
-            </mc:AlternateContent>
+            <w:rPr/>
+            <w:t xml:space="preserve">Firmenname: {{kunde}}Name: {{ansprechpartner}}Strasse: {{strasse}}Postleizahl, Ort: {{plz_ort}}Telefon: {{telefon}}Fax: {{fax}}E-Mail:{{email}}Firmenname: {{kunde}}Name: {{ansprechpartner}}Strasse: {{strasse}}Postleizahl, Ort: {{plz_ort}}Telefon: {{telefon}}Fax: {{fax}}E-Mail:{{email}}</w:t>
           </w:r>
         </w:p>
         <w:p>
@@ -1297,40 +464,50 @@
           </w:tcPr>
           <w:p>
             <w:pPr>
-              <w:pStyle w:val="03Standardtext"/>
-            </w:pPr>
-            <w:r>
-              <w:t>Name</w:t>
-            </w:r>
-            <w:r>
-              <w:t>:</w:t>
-            </w:r>
-          </w:p>
-          <w:p>
-            <w:pPr>
-              <w:pStyle w:val="03Standardtext"/>
-            </w:pPr>
-            <w:r>
-              <w:t>Position</w:t>
-            </w:r>
-            <w:r>
-              <w:t>:</w:t>
-            </w:r>
-          </w:p>
-          <w:p>
-            <w:pPr>
-              <w:pStyle w:val="03Standardtext"/>
-            </w:pPr>
-            <w:r>
-              <w:t>E-Mail:</w:t>
-            </w:r>
-          </w:p>
-          <w:p>
-            <w:pPr>
-              <w:pStyle w:val="03Standardtext"/>
-            </w:pPr>
-            <w:r>
-              <w:t>Telefon:</w:t>
+              <w:spacing w:after="40"/>
+            </w:pPr>
+            <w:r>
+              <w:rPr>
+                <w:sz w:val="18"/>
+                <w:szCs w:val="18"/>
+              </w:rPr>
+              <w:t xml:space="preserve">Name:</w:t>
+            </w:r>
+          </w:p>
+          <w:p>
+            <w:pPr>
+              <w:spacing w:after="40"/>
+            </w:pPr>
+            <w:r>
+              <w:rPr>
+                <w:sz w:val="18"/>
+                <w:szCs w:val="18"/>
+              </w:rPr>
+              <w:t xml:space="preserve">Position:</w:t>
+            </w:r>
+          </w:p>
+          <w:p>
+            <w:pPr>
+              <w:spacing w:after="40"/>
+            </w:pPr>
+            <w:r>
+              <w:rPr>
+                <w:sz w:val="18"/>
+                <w:szCs w:val="18"/>
+              </w:rPr>
+              <w:t xml:space="preserve">E-Mail:</w:t>
+            </w:r>
+          </w:p>
+          <w:p>
+            <w:pPr>
+              <w:spacing w:after="40"/>
+            </w:pPr>
+            <w:r>
+              <w:rPr>
+                <w:sz w:val="18"/>
+                <w:szCs w:val="18"/>
+              </w:rPr>
+              <w:t xml:space="preserve">Telefon:</w:t>
             </w:r>
           </w:p>
         </w:tc>
@@ -1364,10 +541,8 @@
                   <w:pStyle w:val="03Standardtext"/>
                 </w:pPr>
                 <w:r>
-                  <w:rPr>
-                    <w:rStyle w:val="Platzhaltertext"/>
-                  </w:rPr>
-                  <w:t>Wählen Sie ein Element aus.</w:t>
+                  <w:rPr/>
+                  <w:t xml:space="preserve">{{ssi_kontakt_1_name}}</w:t>
                 </w:r>
               </w:p>
             </w:sdtContent>
@@ -1388,14 +563,60 @@
                   <w:pStyle w:val="03Standardtext"/>
                 </w:pPr>
                 <w:r>
-                  <w:rPr>
-                    <w:rStyle w:val="Platzhaltertext"/>
-                  </w:rPr>
-                  <w:t>Klicken oder tippen Sie hier, um Text einzugeben.</w:t>
+                  <w:rPr/>
+                  <w:t xml:space="preserve">{{ssi_kontakt_1_position}}</w:t>
                 </w:r>
               </w:p>
             </w:sdtContent>
           </w:sdt>
+          <w:p>
+            <w:pPr>
+              <w:spacing w:after="40"/>
+            </w:pPr>
+            <w:r>
+              <w:rPr>
+                <w:sz w:val="18"/>
+                <w:szCs w:val="18"/>
+              </w:rPr>
+              <w:t xml:space="preserve">{{ssi_kontakt_1_name}}</w:t>
+            </w:r>
+          </w:p>
+          <w:p>
+            <w:pPr>
+              <w:spacing w:after="40"/>
+            </w:pPr>
+            <w:r>
+              <w:rPr>
+                <w:sz w:val="18"/>
+                <w:szCs w:val="18"/>
+              </w:rPr>
+              <w:t xml:space="preserve">{{ssi_kontakt_1_position}}</w:t>
+            </w:r>
+          </w:p>
+          <w:p>
+            <w:pPr>
+              <w:spacing w:after="40"/>
+            </w:pPr>
+            <w:r>
+              <w:rPr>
+                <w:sz w:val="18"/>
+                <w:szCs w:val="18"/>
+              </w:rPr>
+              <w:t xml:space="preserve">{{ssi_kontakt_1_email}}</w:t>
+            </w:r>
+          </w:p>
+          <w:p>
+            <w:pPr>
+              <w:spacing w:after="40"/>
+            </w:pPr>
+            <w:r>
+              <w:rPr>
+                <w:sz w:val="18"/>
+                <w:szCs w:val="18"/>
+              </w:rPr>
+              <w:t xml:space="preserve">{{ssi_kontakt_1_telefon}}</w:t>
+            </w:r>
+          </w:p>
         </w:tc>
       </w:tr>
       <w:tr>
@@ -1409,40 +630,50 @@
           </w:tcPr>
           <w:p>
             <w:pPr>
-              <w:pStyle w:val="03Standardtext"/>
-            </w:pPr>
-            <w:r>
-              <w:t>Name</w:t>
-            </w:r>
-            <w:r>
-              <w:t>:</w:t>
-            </w:r>
-          </w:p>
-          <w:p>
-            <w:pPr>
-              <w:pStyle w:val="03Standardtext"/>
-            </w:pPr>
-            <w:r>
-              <w:t>Position</w:t>
-            </w:r>
-            <w:r>
-              <w:t>:</w:t>
-            </w:r>
-          </w:p>
-          <w:p>
-            <w:pPr>
-              <w:pStyle w:val="03Standardtext"/>
-            </w:pPr>
-            <w:r>
-              <w:t>E-Mail:</w:t>
-            </w:r>
-          </w:p>
-          <w:p>
-            <w:pPr>
-              <w:pStyle w:val="03Standardtext"/>
-            </w:pPr>
-            <w:r>
-              <w:t>Telefon:</w:t>
+              <w:spacing w:after="40"/>
+            </w:pPr>
+            <w:r>
+              <w:rPr>
+                <w:sz w:val="18"/>
+                <w:szCs w:val="18"/>
+              </w:rPr>
+              <w:t xml:space="preserve">Name:</w:t>
+            </w:r>
+          </w:p>
+          <w:p>
+            <w:pPr>
+              <w:spacing w:after="40"/>
+            </w:pPr>
+            <w:r>
+              <w:rPr>
+                <w:sz w:val="18"/>
+                <w:szCs w:val="18"/>
+              </w:rPr>
+              <w:t xml:space="preserve">Position:</w:t>
+            </w:r>
+          </w:p>
+          <w:p>
+            <w:pPr>
+              <w:spacing w:after="40"/>
+            </w:pPr>
+            <w:r>
+              <w:rPr>
+                <w:sz w:val="18"/>
+                <w:szCs w:val="18"/>
+              </w:rPr>
+              <w:t xml:space="preserve">E-Mail:</w:t>
+            </w:r>
+          </w:p>
+          <w:p>
+            <w:pPr>
+              <w:spacing w:after="40"/>
+            </w:pPr>
+            <w:r>
+              <w:rPr>
+                <w:sz w:val="18"/>
+                <w:szCs w:val="18"/>
+              </w:rPr>
+              <w:t xml:space="preserve">Telefon:</w:t>
             </w:r>
           </w:p>
         </w:tc>
@@ -1480,10 +711,8 @@
                   </w:rPr>
                 </w:pPr>
                 <w:r>
-                  <w:rPr>
-                    <w:rStyle w:val="Platzhaltertext"/>
-                  </w:rPr>
-                  <w:t>Wählen Sie ein Element aus.</w:t>
+                  <w:rPr/>
+                  <w:t xml:space="preserve">{{ssi_kontakt_1_name}}</w:t>
                 </w:r>
               </w:p>
             </w:sdtContent>
@@ -1507,14 +736,60 @@
                   </w:rPr>
                 </w:pPr>
                 <w:r>
-                  <w:rPr>
-                    <w:rStyle w:val="Platzhaltertext"/>
-                  </w:rPr>
-                  <w:t>Klicken oder tippen Sie hier, um Text einzugeben.</w:t>
+                  <w:rPr/>
+                  <w:t xml:space="preserve">{{ssi_kontakt_1_position}}</w:t>
                 </w:r>
               </w:p>
             </w:sdtContent>
           </w:sdt>
+          <w:p>
+            <w:pPr>
+              <w:spacing w:after="40"/>
+            </w:pPr>
+            <w:r>
+              <w:rPr>
+                <w:sz w:val="18"/>
+                <w:szCs w:val="18"/>
+              </w:rPr>
+              <w:t xml:space="preserve">{{ssi_kontakt_2_name}}</w:t>
+            </w:r>
+          </w:p>
+          <w:p>
+            <w:pPr>
+              <w:spacing w:after="40"/>
+            </w:pPr>
+            <w:r>
+              <w:rPr>
+                <w:sz w:val="18"/>
+                <w:szCs w:val="18"/>
+              </w:rPr>
+              <w:t xml:space="preserve">{{ssi_kontakt_2_position}}</w:t>
+            </w:r>
+          </w:p>
+          <w:p>
+            <w:pPr>
+              <w:spacing w:after="40"/>
+            </w:pPr>
+            <w:r>
+              <w:rPr>
+                <w:sz w:val="18"/>
+                <w:szCs w:val="18"/>
+              </w:rPr>
+              <w:t xml:space="preserve">{{ssi_kontakt_2_email}}</w:t>
+            </w:r>
+          </w:p>
+          <w:p>
+            <w:pPr>
+              <w:spacing w:after="40"/>
+            </w:pPr>
+            <w:r>
+              <w:rPr>
+                <w:sz w:val="18"/>
+                <w:szCs w:val="18"/>
+              </w:rPr>
+              <w:t xml:space="preserve">{{ssi_kontakt_2_telefon}}</w:t>
+            </w:r>
+          </w:p>
         </w:tc>
       </w:tr>
     </w:tbl>
@@ -1541,662 +816,177 @@
       </w:r>
     </w:p>
     <w:p>
-      <w:r>
-        <w:lastRenderedPageBreak/>
-        <w:t xml:space="preserve">Sehr geehrter Herr </w:t>
-      </w:r>
-      <w:r>
-        <w:t>{{</w:t>
-      </w:r>
-      <w:proofErr w:type="spellStart"/>
-      <w:r>
-        <w:t>ansprechpartner</w:t>
-      </w:r>
-      <w:proofErr w:type="spellEnd"/>
-      <w:r>
-        <w:t>}}</w:t>
-      </w:r>
-      <w:r>
-        <w:rPr>
-          <w:highlight w:val="yellow"/>
-        </w:rPr>
-        <w:t>,</w:t>
-      </w:r>
-      <w:r>
-        <w:fldChar w:fldCharType="begin"/>
-      </w:r>
-      <w:r>
-        <w:instrText xml:space="preserve">  </w:instrText>
-      </w:r>
-      <w:r>
-        <w:fldChar w:fldCharType="end"/>
-      </w:r>
-    </w:p>
-    <w:p>
-      <w:pPr>
-        <w:rPr>
-          <w:sz w:val="16"/>
-          <w:szCs w:val="16"/>
-        </w:rPr>
-      </w:pPr>
-    </w:p>
-    <w:p>
-      <w:pPr>
-        <w:tabs>
-          <w:tab w:val="left" w:pos="5671"/>
-        </w:tabs>
-      </w:pPr>
-      <w:r>
-        <w:t xml:space="preserve">Wir danken für Ihre Anfrage vom </w:t>
-      </w:r>
-      <w:r>
-        <w:rPr>
-          <w:highlight w:val="yellow"/>
-        </w:rPr>
-        <w:t>14.04.2008</w:t>
-      </w:r>
-      <w:r>
-        <w:t xml:space="preserve"> an </w:t>
-      </w:r>
-      <w:r>
-        <w:rPr>
-          <w:highlight w:val="yellow"/>
-        </w:rPr>
-        <w:t xml:space="preserve">Herrn </w:t>
-      </w:r>
-      <w:r>
-        <w:rPr>
-          <w:highlight w:val="yellow"/>
-        </w:rPr>
-        <w:t>Reto Häuselmann</w:t>
-      </w:r>
-      <w:r>
-        <w:rPr>
-          <w:highlight w:val="yellow"/>
-        </w:rPr>
-        <w:t xml:space="preserve"> </w:t>
-      </w:r>
-      <w:r>
-        <w:rPr>
-          <w:highlight w:val="yellow"/>
-        </w:rPr>
-        <w:t>/ Herrn Cenk Aytac</w:t>
-      </w:r>
-      <w:r>
-        <w:rPr>
-          <w:highlight w:val="yellow"/>
-        </w:rPr>
-        <w:t xml:space="preserve"> </w:t>
-      </w:r>
-      <w:r>
-        <w:rPr>
-          <w:highlight w:val="yellow"/>
-        </w:rPr>
-        <w:t xml:space="preserve">/ Kristijan Zornjak </w:t>
-      </w:r>
-      <w:r>
-        <w:rPr>
-          <w:highlight w:val="yellow"/>
-        </w:rPr>
-        <w:t>/</w:t>
-      </w:r>
-      <w:r>
-        <w:rPr>
-          <w:highlight w:val="yellow"/>
-        </w:rPr>
-        <w:t xml:space="preserve"> </w:t>
-      </w:r>
-      <w:r>
-        <w:rPr>
-          <w:highlight w:val="yellow"/>
-        </w:rPr>
-        <w:t>Marek Sobona</w:t>
-      </w:r>
-      <w:r>
-        <w:t xml:space="preserve"> </w:t>
-      </w:r>
-      <w:r>
-        <w:t>und unterbreiten Ihnen nachstehend das gewünschte Angebot:</w:t>
-      </w:r>
-    </w:p>
-    <w:p>
-      <w:pPr>
-        <w:pStyle w:val="Verzeichnis1"/>
-      </w:pPr>
-    </w:p>
-    <w:p>
-      <w:pPr>
-        <w:rPr>
-          <w:sz w:val="16"/>
-          <w:szCs w:val="16"/>
-          <w:lang w:val="de-DE" w:eastAsia="de-DE"/>
-        </w:rPr>
-      </w:pPr>
-    </w:p>
-    <w:p>
-      <w:pPr>
-        <w:pStyle w:val="Verzeichnis1"/>
-        <w:rPr>
-          <w:rFonts w:asciiTheme="minorHAnsi" w:eastAsiaTheme="minorEastAsia" w:hAnsiTheme="minorHAnsi" w:cstheme="minorBidi"/>
-          <w:b w:val="0"/>
-          <w:bCs w:val="0"/>
-          <w:kern w:val="2"/>
+      <w:pPr>
+        <w:spacing w:after="120"/>
+      </w:pPr>
+      <w:r>
+        <w:rPr>
+          <w:sz w:val="22"/>
+          <w:szCs w:val="22"/>
+        </w:rPr>
+        <w:t xml:space="preserve">{{anrede}}</w:t>
+      </w:r>
+    </w:p>
+    <w:p>
+      <w:pPr>
+        <w:spacing w:after="120"/>
+      </w:pPr>
+      <w:r>
+        <w:rPr>
+          <w:sz w:val="20"/>
+          <w:szCs w:val="20"/>
+        </w:rPr>
+        <w:t xml:space="preserve">{{einleitung}}</w:t>
+      </w:r>
+    </w:p>
+    <w:p>
+      <w:pPr>
+        <w:spacing w:after="120"/>
+      </w:pPr>
+      <w:r>
+        <w:rPr>
+          <w:b/>
           <w:sz w:val="24"/>
           <w:szCs w:val="24"/>
-          <w:lang w:val="de-CH" w:eastAsia="de-CH"/>
-          <w14:ligatures w14:val="standardContextual"/>
-        </w:rPr>
-      </w:pPr>
-      <w:r>
-        <w:fldChar w:fldCharType="begin"/>
-      </w:r>
-      <w:r>
-        <w:instrText xml:space="preserve"> TOC \h \z \u \t "Überschrift 2;1" </w:instrText>
-      </w:r>
-      <w:r>
-        <w:fldChar w:fldCharType="separate"/>
-      </w:r>
-      <w:hyperlink w:anchor="_Toc176878711" w:history="1">
-        <w:r>
-          <w:rPr>
-            <w:rStyle w:val="Hyperlink"/>
-          </w:rPr>
-          <w:t>Position 1</w:t>
-        </w:r>
-        <w:r>
-          <w:rPr>
-            <w:rFonts w:asciiTheme="minorHAnsi" w:eastAsiaTheme="minorEastAsia" w:hAnsiTheme="minorHAnsi" w:cstheme="minorBidi"/>
-            <w:b w:val="0"/>
-            <w:bCs w:val="0"/>
-            <w:kern w:val="2"/>
-            <w:sz w:val="24"/>
-            <w:szCs w:val="24"/>
-            <w:lang w:val="de-CH" w:eastAsia="de-CH"/>
-            <w14:ligatures w14:val="standardContextual"/>
-          </w:rPr>
-          <w:tab/>
-        </w:r>
-        <w:r>
-          <w:rPr>
-            <w:rStyle w:val="Hyperlink"/>
-          </w:rPr>
-          <w:t>Schwerlast-Verschieberegal System ESX PR600</w:t>
-        </w:r>
-        <w:r>
-          <w:rPr>
-            <w:webHidden/>
-          </w:rPr>
-          <w:tab/>
-        </w:r>
-        <w:r>
-          <w:rPr>
-            <w:webHidden/>
-          </w:rPr>
-          <w:fldChar w:fldCharType="begin"/>
-        </w:r>
-        <w:r>
-          <w:rPr>
-            <w:webHidden/>
-          </w:rPr>
-          <w:instrText xml:space="preserve"> PAGEREF _Toc176878711 \h </w:instrText>
-        </w:r>
-        <w:r>
-          <w:rPr>
-            <w:webHidden/>
-          </w:rPr>
-        </w:r>
-        <w:r>
-          <w:rPr>
-            <w:webHidden/>
-          </w:rPr>
-          <w:fldChar w:fldCharType="separate"/>
-        </w:r>
-        <w:r>
-          <w:rPr>
-            <w:b w:val="0"/>
-            <w:bCs w:val="0"/>
-            <w:webHidden/>
-          </w:rPr>
-          <w:t>Fehler! Textmarke nicht definiert.</w:t>
-        </w:r>
-        <w:r>
-          <w:rPr>
-            <w:webHidden/>
-          </w:rPr>
-          <w:fldChar w:fldCharType="end"/>
-        </w:r>
-      </w:hyperlink>
-    </w:p>
-    <w:p>
-      <w:pPr>
-        <w:pStyle w:val="Verzeichnis1"/>
-        <w:rPr>
-          <w:rFonts w:asciiTheme="minorHAnsi" w:eastAsiaTheme="minorEastAsia" w:hAnsiTheme="minorHAnsi" w:cstheme="minorBidi"/>
-          <w:b w:val="0"/>
-          <w:bCs w:val="0"/>
-          <w:kern w:val="2"/>
+        </w:rPr>
+        <w:t xml:space="preserve">Konfiguration</w:t>
+      </w:r>
+    </w:p>
+    <w:p>
+      <w:pPr>
+        <w:spacing w:after="120"/>
+      </w:pPr>
+      <w:r>
+        <w:rPr>
+          <w:sz w:val="20"/>
+          <w:szCs w:val="20"/>
+        </w:rPr>
+        <w:t xml:space="preserve">{{konfiguration}}</w:t>
+      </w:r>
+    </w:p>
+    <w:p>
+      <w:pPr>
+        <w:spacing w:after="120"/>
+      </w:pPr>
+      <w:r>
+        <w:rPr>
+          <w:b/>
           <w:sz w:val="24"/>
           <w:szCs w:val="24"/>
-          <w:lang w:val="de-CH" w:eastAsia="de-CH"/>
-          <w14:ligatures w14:val="standardContextual"/>
-        </w:rPr>
-      </w:pPr>
-      <w:hyperlink w:anchor="_Toc176878712" w:history="1">
-        <w:r>
-          <w:rPr>
-            <w:rStyle w:val="Hyperlink"/>
-          </w:rPr>
-          <w:t>Position 2</w:t>
-        </w:r>
-        <w:r>
-          <w:rPr>
-            <w:rFonts w:asciiTheme="minorHAnsi" w:eastAsiaTheme="minorEastAsia" w:hAnsiTheme="minorHAnsi" w:cstheme="minorBidi"/>
-            <w:b w:val="0"/>
-            <w:bCs w:val="0"/>
-            <w:kern w:val="2"/>
-            <w:sz w:val="24"/>
-            <w:szCs w:val="24"/>
-            <w:lang w:val="de-CH" w:eastAsia="de-CH"/>
-            <w14:ligatures w14:val="standardContextual"/>
-          </w:rPr>
-          <w:tab/>
-        </w:r>
-        <w:r>
-          <w:rPr>
-            <w:rStyle w:val="Hyperlink"/>
-          </w:rPr>
-          <w:t>Montagehilfsmittel</w:t>
-        </w:r>
-        <w:r>
-          <w:rPr>
-            <w:webHidden/>
-          </w:rPr>
-          <w:tab/>
-        </w:r>
-        <w:r>
-          <w:rPr>
-            <w:webHidden/>
-          </w:rPr>
-          <w:fldChar w:fldCharType="begin"/>
-        </w:r>
-        <w:r>
-          <w:rPr>
-            <w:webHidden/>
-          </w:rPr>
-          <w:instrText xml:space="preserve"> PAGEREF _Toc176878712 \h </w:instrText>
-        </w:r>
-        <w:r>
-          <w:rPr>
-            <w:webHidden/>
-          </w:rPr>
-        </w:r>
-        <w:r>
-          <w:rPr>
-            <w:webHidden/>
-          </w:rPr>
-          <w:fldChar w:fldCharType="separate"/>
-        </w:r>
-        <w:r>
-          <w:rPr>
-            <w:webHidden/>
-          </w:rPr>
-          <w:t>8</w:t>
-        </w:r>
-        <w:r>
-          <w:rPr>
-            <w:webHidden/>
-          </w:rPr>
-          <w:fldChar w:fldCharType="end"/>
-        </w:r>
-      </w:hyperlink>
-    </w:p>
-    <w:p>
-      <w:pPr>
-        <w:pStyle w:val="Verzeichnis1"/>
-        <w:rPr>
-          <w:rFonts w:asciiTheme="minorHAnsi" w:eastAsiaTheme="minorEastAsia" w:hAnsiTheme="minorHAnsi" w:cstheme="minorBidi"/>
-          <w:b w:val="0"/>
-          <w:bCs w:val="0"/>
-          <w:kern w:val="2"/>
+        </w:rPr>
+        <w:t xml:space="preserve">Leistungsumfang</w:t>
+      </w:r>
+    </w:p>
+    <w:p>
+      <w:pPr>
+        <w:spacing w:after="120"/>
+      </w:pPr>
+      <w:r>
+        <w:rPr>
+          <w:sz w:val="20"/>
+          <w:szCs w:val="20"/>
+        </w:rPr>
+        <w:t xml:space="preserve">{{leistungsumfang_text}}</w:t>
+      </w:r>
+    </w:p>
+    <w:p>
+      <w:pPr>
+        <w:spacing w:after="120"/>
+      </w:pPr>
+      <w:r>
+        <w:rPr>
+          <w:b/>
           <w:sz w:val="24"/>
           <w:szCs w:val="24"/>
-          <w:lang w:val="de-CH" w:eastAsia="de-CH"/>
-          <w14:ligatures w14:val="standardContextual"/>
-        </w:rPr>
-      </w:pPr>
-      <w:hyperlink w:anchor="_Toc176878713" w:history="1">
-        <w:r>
-          <w:rPr>
-            <w:rStyle w:val="Hyperlink"/>
-          </w:rPr>
-          <w:t>Zusammenfassung</w:t>
-        </w:r>
-        <w:r>
-          <w:rPr>
-            <w:webHidden/>
-          </w:rPr>
-          <w:tab/>
-        </w:r>
-        <w:r>
-          <w:rPr>
-            <w:webHidden/>
-          </w:rPr>
-          <w:fldChar w:fldCharType="begin"/>
-        </w:r>
-        <w:r>
-          <w:rPr>
-            <w:webHidden/>
-          </w:rPr>
-          <w:instrText xml:space="preserve"> PAGEREF _Toc176878713 \h </w:instrText>
-        </w:r>
-        <w:r>
-          <w:rPr>
-            <w:webHidden/>
-          </w:rPr>
-        </w:r>
-        <w:r>
-          <w:rPr>
-            <w:webHidden/>
-          </w:rPr>
-          <w:fldChar w:fldCharType="separate"/>
-        </w:r>
-        <w:r>
-          <w:rPr>
-            <w:webHidden/>
-          </w:rPr>
-          <w:t>13</w:t>
-        </w:r>
-        <w:r>
-          <w:rPr>
-            <w:webHidden/>
-          </w:rPr>
-          <w:fldChar w:fldCharType="end"/>
-        </w:r>
-      </w:hyperlink>
-    </w:p>
-    <w:p>
-      <w:pPr>
-        <w:pStyle w:val="Verzeichnis1"/>
-        <w:rPr>
-          <w:rFonts w:asciiTheme="minorHAnsi" w:eastAsiaTheme="minorEastAsia" w:hAnsiTheme="minorHAnsi" w:cstheme="minorBidi"/>
-          <w:b w:val="0"/>
-          <w:bCs w:val="0"/>
-          <w:kern w:val="2"/>
+        </w:rPr>
+        <w:t xml:space="preserve">Optionen</w:t>
+      </w:r>
+    </w:p>
+    <w:p>
+      <w:pPr>
+        <w:spacing w:after="120"/>
+      </w:pPr>
+      <w:r>
+        <w:rPr>
+          <w:sz w:val="20"/>
+          <w:szCs w:val="20"/>
+        </w:rPr>
+        <w:t xml:space="preserve">{{optionen_text}}</w:t>
+      </w:r>
+    </w:p>
+    <w:p>
+      <w:pPr>
+        <w:spacing w:after="120"/>
+      </w:pPr>
+      <w:r>
+        <w:rPr>
+          <w:b/>
           <w:sz w:val="24"/>
           <w:szCs w:val="24"/>
-          <w:lang w:val="de-CH" w:eastAsia="de-CH"/>
-          <w14:ligatures w14:val="standardContextual"/>
-        </w:rPr>
-      </w:pPr>
-      <w:hyperlink w:anchor="_Toc176878714" w:history="1">
-        <w:r>
-          <w:rPr>
-            <w:rStyle w:val="Hyperlink"/>
-          </w:rPr>
-          <w:t>Verantwortlichkeitsmatrix</w:t>
-        </w:r>
-        <w:r>
-          <w:rPr>
-            <w:webHidden/>
-          </w:rPr>
-          <w:tab/>
-        </w:r>
-        <w:r>
-          <w:rPr>
-            <w:webHidden/>
-          </w:rPr>
-          <w:fldChar w:fldCharType="begin"/>
-        </w:r>
-        <w:r>
-          <w:rPr>
-            <w:webHidden/>
-          </w:rPr>
-          <w:instrText xml:space="preserve"> PAGEREF _Toc176878714 \h </w:instrText>
-        </w:r>
-        <w:r>
-          <w:rPr>
-            <w:webHidden/>
-          </w:rPr>
-        </w:r>
-        <w:r>
-          <w:rPr>
-            <w:webHidden/>
-          </w:rPr>
-          <w:fldChar w:fldCharType="separate"/>
-        </w:r>
-        <w:r>
-          <w:rPr>
-            <w:webHidden/>
-          </w:rPr>
-          <w:t>14</w:t>
-        </w:r>
-        <w:r>
-          <w:rPr>
-            <w:webHidden/>
-          </w:rPr>
-          <w:fldChar w:fldCharType="end"/>
-        </w:r>
-      </w:hyperlink>
-    </w:p>
-    <w:p>
-      <w:pPr>
-        <w:pStyle w:val="Verzeichnis1"/>
-        <w:rPr>
-          <w:rFonts w:asciiTheme="minorHAnsi" w:eastAsiaTheme="minorEastAsia" w:hAnsiTheme="minorHAnsi" w:cstheme="minorBidi"/>
-          <w:b w:val="0"/>
-          <w:bCs w:val="0"/>
-          <w:kern w:val="2"/>
-          <w:sz w:val="24"/>
-          <w:szCs w:val="24"/>
-          <w:lang w:val="de-CH" w:eastAsia="de-CH"/>
-          <w14:ligatures w14:val="standardContextual"/>
-        </w:rPr>
-      </w:pPr>
-      <w:hyperlink w:anchor="_Toc176878715" w:history="1">
-        <w:r>
-          <w:rPr>
-            <w:rStyle w:val="Hyperlink"/>
-          </w:rPr>
-          <w:t>Lieferung &amp; Montage</w:t>
-        </w:r>
-        <w:r>
-          <w:rPr>
-            <w:webHidden/>
-          </w:rPr>
-          <w:tab/>
-        </w:r>
-        <w:r>
-          <w:rPr>
-            <w:webHidden/>
-          </w:rPr>
-          <w:fldChar w:fldCharType="begin"/>
-        </w:r>
-        <w:r>
-          <w:rPr>
-            <w:webHidden/>
-          </w:rPr>
-          <w:instrText xml:space="preserve"> PAGEREF _Toc176878715 \h </w:instrText>
-        </w:r>
-        <w:r>
-          <w:rPr>
-            <w:webHidden/>
-          </w:rPr>
-        </w:r>
-        <w:r>
-          <w:rPr>
-            <w:webHidden/>
-          </w:rPr>
-          <w:fldChar w:fldCharType="separate"/>
-        </w:r>
-        <w:r>
-          <w:rPr>
-            <w:webHidden/>
-          </w:rPr>
-          <w:t>15</w:t>
-        </w:r>
-        <w:r>
-          <w:rPr>
-            <w:webHidden/>
-          </w:rPr>
-          <w:fldChar w:fldCharType="end"/>
-        </w:r>
-      </w:hyperlink>
-    </w:p>
-    <w:p>
-      <w:pPr>
-        <w:pStyle w:val="Verzeichnis1"/>
-        <w:rPr>
-          <w:rFonts w:asciiTheme="minorHAnsi" w:eastAsiaTheme="minorEastAsia" w:hAnsiTheme="minorHAnsi" w:cstheme="minorBidi"/>
-          <w:b w:val="0"/>
-          <w:bCs w:val="0"/>
-          <w:kern w:val="2"/>
-          <w:sz w:val="24"/>
-          <w:szCs w:val="24"/>
-          <w:lang w:val="de-CH" w:eastAsia="de-CH"/>
-          <w14:ligatures w14:val="standardContextual"/>
-        </w:rPr>
-      </w:pPr>
-      <w:hyperlink w:anchor="_Toc176878716" w:history="1">
-        <w:r>
-          <w:rPr>
-            <w:rStyle w:val="Hyperlink"/>
-          </w:rPr>
-          <w:t>Technische Details</w:t>
-        </w:r>
-        <w:r>
-          <w:rPr>
-            <w:webHidden/>
-          </w:rPr>
-          <w:tab/>
-        </w:r>
-        <w:r>
-          <w:rPr>
-            <w:webHidden/>
-          </w:rPr>
-          <w:fldChar w:fldCharType="begin"/>
-        </w:r>
-        <w:r>
-          <w:rPr>
-            <w:webHidden/>
-          </w:rPr>
-          <w:instrText xml:space="preserve"> PAGEREF _Toc176878716 \h </w:instrText>
-        </w:r>
-        <w:r>
-          <w:rPr>
-            <w:webHidden/>
-          </w:rPr>
-        </w:r>
-        <w:r>
-          <w:rPr>
-            <w:webHidden/>
-          </w:rPr>
-          <w:fldChar w:fldCharType="separate"/>
-        </w:r>
-        <w:r>
-          <w:rPr>
-            <w:webHidden/>
-          </w:rPr>
-          <w:t>16</w:t>
-        </w:r>
-        <w:r>
-          <w:rPr>
-            <w:webHidden/>
-          </w:rPr>
-          <w:fldChar w:fldCharType="end"/>
-        </w:r>
-      </w:hyperlink>
-    </w:p>
-    <w:p>
-      <w:pPr>
-        <w:pStyle w:val="Verzeichnis1"/>
-        <w:rPr>
-          <w:rFonts w:asciiTheme="minorHAnsi" w:eastAsiaTheme="minorEastAsia" w:hAnsiTheme="minorHAnsi" w:cstheme="minorBidi"/>
-          <w:b w:val="0"/>
-          <w:bCs w:val="0"/>
-          <w:kern w:val="2"/>
-          <w:sz w:val="24"/>
-          <w:szCs w:val="24"/>
-          <w:lang w:val="de-CH" w:eastAsia="de-CH"/>
-          <w14:ligatures w14:val="standardContextual"/>
-        </w:rPr>
-      </w:pPr>
-      <w:hyperlink w:anchor="_Toc176878717" w:history="1">
-        <w:r>
-          <w:rPr>
-            <w:rStyle w:val="Hyperlink"/>
-          </w:rPr>
-          <w:t>Kaufmännische Bedingungen für Geschäfte in der Schweiz</w:t>
-        </w:r>
-        <w:r>
-          <w:rPr>
-            <w:webHidden/>
-          </w:rPr>
-          <w:tab/>
-        </w:r>
-        <w:r>
-          <w:rPr>
-            <w:webHidden/>
-          </w:rPr>
-          <w:fldChar w:fldCharType="begin"/>
-        </w:r>
-        <w:r>
-          <w:rPr>
-            <w:webHidden/>
-          </w:rPr>
-          <w:instrText xml:space="preserve"> PAGEREF _Toc176878717 \h </w:instrText>
-        </w:r>
-        <w:r>
-          <w:rPr>
-            <w:webHidden/>
-          </w:rPr>
-        </w:r>
-        <w:r>
-          <w:rPr>
-            <w:webHidden/>
-          </w:rPr>
-          <w:fldChar w:fldCharType="separate"/>
-        </w:r>
-        <w:r>
-          <w:rPr>
-            <w:webHidden/>
-          </w:rPr>
-          <w:t>18</w:t>
-        </w:r>
-        <w:r>
-          <w:rPr>
-            <w:webHidden/>
-          </w:rPr>
-          <w:fldChar w:fldCharType="end"/>
-        </w:r>
-      </w:hyperlink>
-    </w:p>
-    <w:p>
-      <w:pPr>
+        </w:rPr>
+        <w:t xml:space="preserve">Preise (CHF, exkl. MwSt.)</w:t>
+      </w:r>
+    </w:p>
+    <w:p>
+      <w:pPr>
+        <w:spacing w:after="120"/>
+      </w:pPr>
+      <w:r>
+        <w:rPr>
+          <w:sz w:val="20"/>
+          <w:szCs w:val="20"/>
+        </w:rPr>
+        <w:t xml:space="preserve">Softwarelizenzen: {{lizenz_total_chf}}</w:t>
+      </w:r>
+    </w:p>
+    <w:p>
+      <w:pPr>
+        <w:spacing w:after="120"/>
+      </w:pPr>
+      <w:r>
+        <w:rPr>
+          <w:sz w:val="20"/>
+          <w:szCs w:val="20"/>
+        </w:rPr>
+        <w:t xml:space="preserve">IT-Aufwand / Installation: {{it_total_chf}}</w:t>
+      </w:r>
+    </w:p>
+    <w:p>
+      <w:pPr>
+        <w:spacing w:after="120"/>
+      </w:pPr>
+      <w:r>
         <w:rPr>
           <w:b/>
-          <w:bCs/>
-          <w:lang w:val="de-DE" w:eastAsia="de-DE"/>
-        </w:rPr>
-      </w:pPr>
-      <w:r>
-        <w:rPr>
-          <w:b/>
-          <w:bCs/>
-          <w:lang w:val="de-DE" w:eastAsia="de-DE"/>
-        </w:rPr>
-        <w:fldChar w:fldCharType="end"/>
-      </w:r>
-    </w:p>
-    <w:p>
-      <w:pPr>
-        <w:rPr>
-          <w:b/>
-          <w:bCs/>
-          <w:sz w:val="16"/>
-          <w:szCs w:val="16"/>
-          <w:lang w:val="de-DE" w:eastAsia="de-DE"/>
-        </w:rPr>
-      </w:pPr>
+          <w:sz w:val="22"/>
+          <w:szCs w:val="22"/>
+        </w:rPr>
+        <w:t xml:space="preserve">Gesamttotal: {{gesamt_chf}}</w:t>
+      </w:r>
+    </w:p>
+    <w:p>
+      <w:pPr>
+        <w:spacing w:after="120"/>
+      </w:pPr>
+      <w:r>
+        <w:rPr>
+          <w:sz w:val="18"/>
+          <w:szCs w:val="18"/>
+        </w:rPr>
+        <w:t xml:space="preserve">{{preis_hinweis}}</w:t>
+      </w:r>
+    </w:p>
+    <w:p>
+      <w:pPr>
+        <w:spacing w:after="120"/>
+      </w:pPr>
+      <w:r>
+        <w:rPr>
+          <w:sz w:val="18"/>
+          <w:szCs w:val="18"/>
+        </w:rPr>
+        <w:t xml:space="preserve">{{meta_zeile}}</w:t>
+      </w:r>
     </w:p>
     <w:p>
       <w:pPr>
@@ -2603,514 +1393,18 @@
         <w:br w:type="page"/>
       </w:r>
     </w:p>
-    <w:tbl>
-      <w:tblPr>
-        <w:tblStyle w:val="05Tabellenvorlage"/>
-        <w:tblpPr w:leftFromText="141" w:rightFromText="141" w:vertAnchor="text" w:tblpY="1"/>
-        <w:tblW w:w="9786" w:type="dxa"/>
-        <w:tblLayout w:type="fixed"/>
-        <w:tblLook w:val="0620" w:firstRow="1" w:lastRow="0" w:firstColumn="0" w:lastColumn="0" w:noHBand="1" w:noVBand="1"/>
-      </w:tblPr>
-      <w:tblGrid>
-        <w:gridCol w:w="5670"/>
-        <w:gridCol w:w="993"/>
-        <w:gridCol w:w="992"/>
-        <w:gridCol w:w="2131"/>
-      </w:tblGrid>
-      <w:tr>
-        <w:trPr>
-          <w:cnfStyle w:val="100000000000" w:firstRow="1" w:lastRow="0" w:firstColumn="0" w:lastColumn="0" w:oddVBand="0" w:evenVBand="0" w:oddHBand="0" w:evenHBand="0" w:firstRowFirstColumn="0" w:firstRowLastColumn="0" w:lastRowFirstColumn="0" w:lastRowLastColumn="0"/>
-          <w:trHeight w:val="567"/>
-        </w:trPr>
-        <w:tc>
-          <w:tcPr>
-            <w:tcW w:w="9786" w:type="dxa"/>
-            <w:gridSpan w:val="4"/>
-            <w:tcBorders>
-              <w:top w:val="none" w:sz="0" w:space="0" w:color="auto"/>
-              <w:left w:val="none" w:sz="0" w:space="0" w:color="auto"/>
-              <w:bottom w:val="none" w:sz="0" w:space="0" w:color="auto"/>
-              <w:right w:val="none" w:sz="0" w:space="0" w:color="auto"/>
-            </w:tcBorders>
-            <w:shd w:val="clear" w:color="auto" w:fill="FFED00"/>
-          </w:tcPr>
-          <w:p>
-            <w:pPr>
-              <w:pStyle w:val="berschrift2"/>
-              <w:tabs>
-                <w:tab w:val="left" w:pos="1456"/>
-              </w:tabs>
-              <w:rPr>
-                <w:b/>
-              </w:rPr>
-            </w:pPr>
-            <w:r>
-              <w:rPr>
-                <w:rFonts w:ascii="Calibri" w:eastAsia="Calibri" w:hAnsi="Calibri"/>
-                <w:b/>
-                <w:color w:val="0B1F3A"/>
-                <w:sz w:val="28"/>
-              </w:rPr>
-              <w:lastRenderedPageBreak/>
-              <w:t>Einleitung</w:t>
-            </w:r>
-          </w:p>
-        </w:tc>
-      </w:tr>
-      <w:tr>
-        <w:trPr>
-          <w:trHeight w:val="57"/>
-        </w:trPr>
-        <w:tc>
-          <w:tcPr>
-            <w:tcW w:w="9786" w:type="dxa"/>
-            <w:gridSpan w:val="4"/>
-          </w:tcPr>
-          <w:p>
-            <w:pPr>
-              <w:pStyle w:val="ANGEBOTDEUTSCH"/>
-              <w:rPr>
-                <w:szCs w:val="20"/>
-              </w:rPr>
-            </w:pPr>
-            <w:r>
-              <w:rPr>
-                <w:szCs w:val="20"/>
-              </w:rPr>
-              <w:t>{{</w:t>
-            </w:r>
-            <w:proofErr w:type="spellStart"/>
-            <w:r>
-              <w:rPr>
-                <w:szCs w:val="20"/>
-              </w:rPr>
-              <w:t>einleitung</w:t>
-            </w:r>
-            <w:proofErr w:type="spellEnd"/>
-            <w:r>
-              <w:rPr>
-                <w:szCs w:val="20"/>
-              </w:rPr>
-              <w:t>}}</w:t>
-            </w:r>
-          </w:p>
-          <w:p>
-            <w:pPr>
-              <w:pStyle w:val="ANGEBOTDEUTSCH"/>
-              <w:rPr>
-                <w:szCs w:val="20"/>
-              </w:rPr>
-            </w:pPr>
-          </w:p>
-          <w:p>
-            <w:pPr>
-              <w:pStyle w:val="ANGEBOTDEUTSCH"/>
-              <w:jc w:val="center"/>
-              <w:rPr>
-                <w:szCs w:val="20"/>
-              </w:rPr>
-            </w:pPr>
-            <w:r>
-              <w:rPr>
-                <w:rFonts w:cs="Arial"/>
-                <w:noProof/>
-                <w:lang w:val="de-AT"/>
-              </w:rPr>
-              <w:drawing>
-                <wp:inline distT="0" distB="0" distL="0" distR="0" wp14:anchorId="3A128B04" wp14:editId="746BEBD8">
-                  <wp:extent cx="1932936" cy="2564839"/>
-                  <wp:effectExtent l="0" t="0" r="0" b="6985"/>
-                  <wp:docPr id="907587233" name="Grafik 907587233"/>
-                  <wp:cNvGraphicFramePr>
-                    <a:graphicFrameLocks xmlns:a="http://schemas.openxmlformats.org/drawingml/2006/main" noChangeAspect="1"/>
-                  </wp:cNvGraphicFramePr>
-                  <a:graphic xmlns:a="http://schemas.openxmlformats.org/drawingml/2006/main">
-                    <a:graphicData uri="http://schemas.openxmlformats.org/drawingml/2006/picture">
-                      <pic:pic xmlns:pic="http://schemas.openxmlformats.org/drawingml/2006/picture">
-                        <pic:nvPicPr>
-                          <pic:cNvPr id="0" name="Picture 2"/>
-                          <pic:cNvPicPr>
-                            <a:picLocks noChangeAspect="1" noChangeArrowheads="1"/>
-                          </pic:cNvPicPr>
-                        </pic:nvPicPr>
-                        <pic:blipFill>
-                          <a:blip r:embed="rId15">
-                            <a:extLst>
-                              <a:ext uri="{28A0092B-C50C-407E-A947-70E740481C1C}">
-                                <a14:useLocalDpi xmlns:a14="http://schemas.microsoft.com/office/drawing/2010/main" val="0"/>
-                              </a:ext>
-                            </a:extLst>
-                          </a:blip>
-                          <a:srcRect/>
-                          <a:stretch>
-                            <a:fillRect/>
-                          </a:stretch>
-                        </pic:blipFill>
-                        <pic:spPr bwMode="auto">
-                          <a:xfrm>
-                            <a:off x="0" y="0"/>
-                            <a:ext cx="1937404" cy="2570768"/>
-                          </a:xfrm>
-                          <a:prstGeom prst="rect">
-                            <a:avLst/>
-                          </a:prstGeom>
-                          <a:noFill/>
-                          <a:ln>
-                            <a:noFill/>
-                          </a:ln>
-                        </pic:spPr>
-                      </pic:pic>
-                    </a:graphicData>
-                  </a:graphic>
-                </wp:inline>
-              </w:drawing>
-            </w:r>
-          </w:p>
-          <w:p>
-            <w:pPr>
-              <w:pStyle w:val="ANGEBOTDEUTSCH"/>
-              <w:jc w:val="center"/>
-              <w:rPr>
-                <w:szCs w:val="20"/>
-              </w:rPr>
-            </w:pPr>
-          </w:p>
-          <w:p>
-            <w:pPr>
-              <w:pStyle w:val="ANGEBOTDEUTSCH"/>
-              <w:rPr>
-                <w:szCs w:val="20"/>
-              </w:rPr>
-            </w:pPr>
-          </w:p>
-          <w:p>
-            <w:pPr>
-              <w:pStyle w:val="ANGEBOTDEUTSCH"/>
-              <w:rPr>
-                <w:szCs w:val="20"/>
-                <w:lang w:val="de-CH"/>
-              </w:rPr>
-            </w:pPr>
-            <w:r>
-              <w:rPr>
-                <w:szCs w:val="20"/>
-                <w:lang w:val="de-CH"/>
-              </w:rPr>
-              <w:t>{{</w:t>
-            </w:r>
-            <w:proofErr w:type="spellStart"/>
-            <w:r>
-              <w:rPr>
-                <w:szCs w:val="20"/>
-                <w:lang w:val="de-CH"/>
-              </w:rPr>
-              <w:t>konfiguration</w:t>
-            </w:r>
-            <w:proofErr w:type="spellEnd"/>
-            <w:r>
-              <w:rPr>
-                <w:szCs w:val="20"/>
-                <w:lang w:val="de-CH"/>
-              </w:rPr>
-              <w:t>}}</w:t>
-            </w:r>
-          </w:p>
-          <w:p>
-            <w:pPr>
-              <w:pStyle w:val="ANGEBOTDEUTSCH"/>
-              <w:rPr>
-                <w:szCs w:val="20"/>
-                <w:lang w:val="de-CH"/>
-              </w:rPr>
-            </w:pPr>
-          </w:p>
-          <w:p>
-            <w:pPr>
-              <w:pStyle w:val="ANGEBOTDEUTSCH"/>
-              <w:rPr>
-                <w:szCs w:val="20"/>
-                <w:lang w:val="de-CH"/>
-              </w:rPr>
-            </w:pPr>
-          </w:p>
-          <w:p>
-            <w:pPr>
-              <w:pStyle w:val="ANGEBOTDEUTSCH"/>
-              <w:rPr>
-                <w:szCs w:val="20"/>
-                <w:lang w:val="de-CH"/>
-              </w:rPr>
-            </w:pPr>
-            <w:r>
-              <w:rPr>
-                <w:szCs w:val="20"/>
-                <w:lang w:val="de-CH"/>
-              </w:rPr>
-              <w:t>{{</w:t>
-            </w:r>
-            <w:proofErr w:type="spellStart"/>
-            <w:r>
-              <w:rPr>
-                <w:szCs w:val="20"/>
-                <w:lang w:val="de-CH"/>
-              </w:rPr>
-              <w:t>leistungsumfang_text</w:t>
-            </w:r>
-            <w:proofErr w:type="spellEnd"/>
-            <w:r>
-              <w:rPr>
-                <w:szCs w:val="20"/>
-                <w:lang w:val="de-CH"/>
-              </w:rPr>
-              <w:t>}}</w:t>
-            </w:r>
-          </w:p>
-          <w:p>
-            <w:pPr>
-              <w:pStyle w:val="ANGEBOTDEUTSCH"/>
-              <w:rPr>
-                <w:szCs w:val="20"/>
-                <w:lang w:val="de-CH"/>
-              </w:rPr>
-            </w:pPr>
-          </w:p>
-          <w:p>
-            <w:pPr>
-              <w:pStyle w:val="ANGEBOTDEUTSCH"/>
-              <w:rPr>
-                <w:szCs w:val="20"/>
-                <w:lang w:val="de-CH"/>
-              </w:rPr>
-            </w:pPr>
-          </w:p>
-          <w:p>
-            <w:pPr>
-              <w:pStyle w:val="ANGEBOTDEUTSCH"/>
-              <w:rPr>
-                <w:szCs w:val="20"/>
-                <w:lang w:val="de-CH"/>
-              </w:rPr>
-            </w:pPr>
-          </w:p>
-          <w:p>
-            <w:pPr>
-              <w:pStyle w:val="ANGEBOTDEUTSCH"/>
-              <w:rPr>
-                <w:szCs w:val="20"/>
-                <w:lang w:val="de-CH"/>
-              </w:rPr>
-            </w:pPr>
-            <w:r>
-              <w:rPr>
-                <w:szCs w:val="20"/>
-                <w:lang w:val="de-CH"/>
-              </w:rPr>
-              <w:t>{{</w:t>
-            </w:r>
-            <w:proofErr w:type="spellStart"/>
-            <w:r>
-              <w:rPr>
-                <w:szCs w:val="20"/>
-                <w:lang w:val="de-CH"/>
-              </w:rPr>
-              <w:t>optionen_text</w:t>
-            </w:r>
-            <w:proofErr w:type="spellEnd"/>
-            <w:r>
-              <w:rPr>
-                <w:szCs w:val="20"/>
-                <w:lang w:val="de-CH"/>
-              </w:rPr>
-              <w:t>}}</w:t>
-            </w:r>
-          </w:p>
-          <w:p>
-            <w:pPr>
-              <w:pStyle w:val="ANGEBOTDEUTSCH"/>
-              <w:rPr>
-                <w:szCs w:val="20"/>
-              </w:rPr>
-            </w:pPr>
-          </w:p>
-        </w:tc>
-      </w:tr>
-      <w:tr>
-        <w:trPr>
-          <w:trHeight w:val="284"/>
-        </w:trPr>
-        <w:tc>
-          <w:tcPr>
-            <w:tcW w:w="5670" w:type="dxa"/>
-            <w:shd w:val="clear" w:color="auto" w:fill="FFED00"/>
-          </w:tcPr>
-          <w:p>
-            <w:pPr>
-              <w:pStyle w:val="ANGEBOTDEUTSCH"/>
-              <w:spacing w:before="40" w:after="40"/>
-              <w:rPr>
-                <w:b/>
-                <w:bCs/>
-              </w:rPr>
-            </w:pPr>
-            <w:bookmarkStart w:id="0" w:name="_Hlk116973797"/>
-            <w:r>
-              <w:rPr>
-                <w:bCs/>
-              </w:rPr>
-              <w:t xml:space="preserve">Materialbedarf: </w:t>
-            </w:r>
-          </w:p>
-        </w:tc>
-        <w:tc>
-          <w:tcPr>
-            <w:tcW w:w="993" w:type="dxa"/>
-            <w:shd w:val="clear" w:color="auto" w:fill="FFED00"/>
-          </w:tcPr>
-          <w:p>
-            <w:pPr>
-              <w:spacing w:before="40" w:after="40"/>
-              <w:rPr>
-                <w:b/>
-                <w:bCs/>
-                <w:lang w:val="de-DE"/>
-              </w:rPr>
-            </w:pPr>
-            <w:r>
-              <w:rPr>
-                <w:bCs/>
-                <w:lang w:val="de-DE"/>
-              </w:rPr>
-              <w:t>Menge</w:t>
-            </w:r>
-          </w:p>
-        </w:tc>
-        <w:tc>
-          <w:tcPr>
-            <w:tcW w:w="992" w:type="dxa"/>
-            <w:shd w:val="clear" w:color="auto" w:fill="FFED00"/>
-          </w:tcPr>
-          <w:p>
-            <w:pPr>
-              <w:spacing w:before="40" w:after="40"/>
-              <w:ind w:left="-242" w:right="-252"/>
-              <w:jc w:val="center"/>
-              <w:rPr>
-                <w:b/>
-                <w:bCs/>
-                <w:lang w:val="de-DE"/>
-              </w:rPr>
-            </w:pPr>
-            <w:r>
-              <w:rPr>
-                <w:bCs/>
-                <w:lang w:val="de-DE"/>
-              </w:rPr>
-              <w:t xml:space="preserve">Preis </w:t>
-            </w:r>
-            <w:r>
-              <w:rPr>
-                <w:bCs/>
-                <w:lang w:val="de-DE"/>
-              </w:rPr>
-              <w:t xml:space="preserve">/ </w:t>
-            </w:r>
-            <w:r>
-              <w:rPr>
-                <w:bCs/>
-                <w:lang w:val="de-DE"/>
-              </w:rPr>
-              <w:t>Stk</w:t>
-            </w:r>
-            <w:r>
-              <w:rPr>
-                <w:bCs/>
-                <w:lang w:val="de-DE"/>
-              </w:rPr>
-              <w:t>.</w:t>
-            </w:r>
-          </w:p>
-        </w:tc>
-        <w:tc>
-          <w:tcPr>
-            <w:tcW w:w="2131" w:type="dxa"/>
-            <w:shd w:val="clear" w:color="auto" w:fill="FFED00"/>
-          </w:tcPr>
-          <w:p>
-            <w:pPr>
-              <w:spacing w:before="40" w:after="40"/>
-              <w:jc w:val="right"/>
-              <w:rPr>
-                <w:b/>
-                <w:bCs/>
-                <w:lang w:val="de-DE"/>
-              </w:rPr>
-            </w:pPr>
-            <w:r>
-              <w:rPr>
-                <w:bCs/>
-                <w:lang w:val="de-DE"/>
-              </w:rPr>
-              <w:t>Total</w:t>
-            </w:r>
-          </w:p>
-        </w:tc>
-      </w:tr>
-      <w:bookmarkEnd w:id="0"/>
-      <w:tr>
-        <w:tc>
-          <w:tcPr>
-            <w:tcW w:w="5670" w:type="dxa"/>
-          </w:tcPr>
-          <w:p>
-            <w:pPr>
-              <w:pStyle w:val="ANGEBOTDEUTSCH"/>
-              <w:rPr>
-                <w:u w:val="single"/>
-              </w:rPr>
-            </w:pPr>
-          </w:p>
-        </w:tc>
-        <w:tc>
-          <w:tcPr>
-            <w:tcW w:w="993" w:type="dxa"/>
-          </w:tcPr>
-          <w:p>
-            <w:pPr>
-              <w:jc w:val="right"/>
-              <w:rPr>
-                <w:lang w:val="de-DE"/>
-              </w:rPr>
-            </w:pPr>
-          </w:p>
-        </w:tc>
-        <w:tc>
-          <w:tcPr>
-            <w:tcW w:w="992" w:type="dxa"/>
-          </w:tcPr>
-          <w:p>
-            <w:pPr>
-              <w:jc w:val="right"/>
-              <w:rPr>
-                <w:lang w:val="de-DE"/>
-              </w:rPr>
-            </w:pPr>
-          </w:p>
-        </w:tc>
-        <w:tc>
-          <w:tcPr>
-            <w:tcW w:w="2131" w:type="dxa"/>
-          </w:tcPr>
-          <w:p>
-            <w:pPr>
-              <w:jc w:val="right"/>
-              <w:rPr>
-                <w:lang w:val="de-DE"/>
-              </w:rPr>
-            </w:pPr>
-          </w:p>
-        </w:tc>
-      </w:tr>
-    </w:tbl>
+    <w:p>
+      <w:pPr>
+        <w:spacing w:after="120"/>
+      </w:pPr>
+      <w:r>
+        <w:rPr>
+          <w:sz w:val="22"/>
+          <w:szCs w:val="22"/>
+        </w:rPr>
+        <w:t xml:space="preserve"/>
+      </w:r>
+    </w:p>
     <w:p/>
     <w:p/>
     <w:p/>
@@ -3121,327 +1415,6 @@
     <w:p/>
     <w:p/>
     <w:p/>
-    <w:tbl>
-      <w:tblPr>
-        <w:tblStyle w:val="05Tabellenvorlage"/>
-        <w:tblpPr w:leftFromText="141" w:rightFromText="141" w:vertAnchor="text" w:tblpY="1"/>
-        <w:tblW w:w="9786" w:type="dxa"/>
-        <w:tblLayout w:type="fixed"/>
-        <w:tblLook w:val="0620" w:firstRow="1" w:lastRow="0" w:firstColumn="0" w:lastColumn="0" w:noHBand="1" w:noVBand="1"/>
-      </w:tblPr>
-      <w:tblGrid>
-        <w:gridCol w:w="4820"/>
-        <w:gridCol w:w="1843"/>
-        <w:gridCol w:w="1135"/>
-        <w:gridCol w:w="1956"/>
-        <w:gridCol w:w="32"/>
-      </w:tblGrid>
-      <w:tr>
-        <w:trPr>
-          <w:cnfStyle w:val="100000000000" w:firstRow="1" w:lastRow="0" w:firstColumn="0" w:lastColumn="0" w:oddVBand="0" w:evenVBand="0" w:oddHBand="0" w:evenHBand="0" w:firstRowFirstColumn="0" w:firstRowLastColumn="0" w:lastRowFirstColumn="0" w:lastRowLastColumn="0"/>
-          <w:trHeight w:val="567"/>
-        </w:trPr>
-        <w:tc>
-          <w:tcPr>
-            <w:tcW w:w="9786" w:type="dxa"/>
-            <w:gridSpan w:val="5"/>
-            <w:tcBorders>
-              <w:top w:val="none" w:sz="0" w:space="0" w:color="auto"/>
-              <w:left w:val="none" w:sz="0" w:space="0" w:color="auto"/>
-              <w:bottom w:val="none" w:sz="0" w:space="0" w:color="auto"/>
-              <w:right w:val="none" w:sz="0" w:space="0" w:color="auto"/>
-            </w:tcBorders>
-            <w:shd w:val="clear" w:color="auto" w:fill="FFED00"/>
-          </w:tcPr>
-          <w:p>
-            <w:pPr>
-              <w:pStyle w:val="berschrift2"/>
-              <w:tabs>
-                <w:tab w:val="left" w:pos="1456"/>
-              </w:tabs>
-              <w:rPr>
-                <w:b/>
-              </w:rPr>
-            </w:pPr>
-            <w:r>
-              <w:rPr>
-                <w:b/>
-              </w:rPr>
-              <w:t>Optionen</w:t>
-            </w:r>
-          </w:p>
-        </w:tc>
-      </w:tr>
-      <w:tr>
-        <w:trPr>
-          <w:gridAfter w:val="1"/>
-          <w:wAfter w:w="32" w:type="dxa"/>
-        </w:trPr>
-        <w:tc>
-          <w:tcPr>
-            <w:tcW w:w="4820" w:type="dxa"/>
-          </w:tcPr>
-          <w:p>
-            <w:pPr>
-              <w:pStyle w:val="ANGEBOTDEUTSCH"/>
-              <w:spacing w:after="20" w:line="216" w:lineRule="auto"/>
-              <w:ind w:right="-109"/>
-              <w:rPr>
-                <w:rFonts w:cs="Arial"/>
-                <w:b/>
-                <w:szCs w:val="20"/>
-                <w:highlight w:val="yellow"/>
-                <w:lang w:val="de-CH"/>
-              </w:rPr>
-            </w:pPr>
-            <w:r>
-              <w:rPr>
-                <w:rFonts w:cs="Arial"/>
-                <w:b/>
-                <w:szCs w:val="20"/>
-                <w:lang w:val="de-CH"/>
-              </w:rPr>
-              <w:t>{{</w:t>
-            </w:r>
-            <w:proofErr w:type="spellStart"/>
-            <w:r>
-              <w:rPr>
-                <w:rFonts w:cs="Arial"/>
-                <w:b/>
-                <w:szCs w:val="20"/>
-                <w:lang w:val="de-CH"/>
-              </w:rPr>
-              <w:t>optionen_text</w:t>
-            </w:r>
-            <w:proofErr w:type="spellEnd"/>
-            <w:r>
-              <w:rPr>
-                <w:rFonts w:cs="Arial"/>
-                <w:b/>
-                <w:szCs w:val="20"/>
-                <w:lang w:val="de-CH"/>
-              </w:rPr>
-              <w:t>}}</w:t>
-            </w:r>
-          </w:p>
-        </w:tc>
-        <w:tc>
-          <w:tcPr>
-            <w:tcW w:w="1843" w:type="dxa"/>
-          </w:tcPr>
-          <w:p>
-            <w:pPr>
-              <w:spacing w:after="20" w:line="216" w:lineRule="auto"/>
-              <w:ind w:left="-110"/>
-              <w:jc w:val="right"/>
-              <w:rPr>
-                <w:rFonts w:cs="Arial"/>
-                <w:b/>
-                <w:bCs/>
-                <w:szCs w:val="20"/>
-              </w:rPr>
-            </w:pPr>
-          </w:p>
-        </w:tc>
-        <w:tc>
-          <w:tcPr>
-            <w:tcW w:w="1135" w:type="dxa"/>
-          </w:tcPr>
-          <w:p>
-            <w:pPr>
-              <w:spacing w:after="20" w:line="216" w:lineRule="auto"/>
-              <w:jc w:val="right"/>
-              <w:rPr>
-                <w:rFonts w:cs="Arial"/>
-                <w:b/>
-                <w:bCs/>
-                <w:noProof/>
-                <w:szCs w:val="20"/>
-                <w:highlight w:val="yellow"/>
-              </w:rPr>
-            </w:pPr>
-          </w:p>
-        </w:tc>
-        <w:tc>
-          <w:tcPr>
-            <w:tcW w:w="1956" w:type="dxa"/>
-          </w:tcPr>
-          <w:p>
-            <w:pPr>
-              <w:spacing w:after="20" w:line="216" w:lineRule="auto"/>
-              <w:rPr>
-                <w:rFonts w:cs="Arial"/>
-                <w:b/>
-                <w:bCs/>
-                <w:szCs w:val="20"/>
-              </w:rPr>
-            </w:pPr>
-          </w:p>
-        </w:tc>
-      </w:tr>
-      <w:tr>
-        <w:trPr>
-          <w:gridAfter w:val="1"/>
-          <w:wAfter w:w="32" w:type="dxa"/>
-        </w:trPr>
-        <w:tc>
-          <w:tcPr>
-            <w:tcW w:w="4820" w:type="dxa"/>
-          </w:tcPr>
-          <w:p>
-            <w:pPr>
-              <w:pStyle w:val="ANGEBOTDEUTSCH"/>
-              <w:spacing w:after="20" w:line="216" w:lineRule="auto"/>
-              <w:ind w:right="-109"/>
-              <w:rPr>
-                <w:rFonts w:cs="Arial"/>
-                <w:szCs w:val="20"/>
-                <w:highlight w:val="yellow"/>
-                <w:lang w:val="de-CH"/>
-              </w:rPr>
-            </w:pPr>
-          </w:p>
-        </w:tc>
-        <w:tc>
-          <w:tcPr>
-            <w:tcW w:w="1843" w:type="dxa"/>
-          </w:tcPr>
-          <w:p>
-            <w:pPr>
-              <w:spacing w:after="20" w:line="216" w:lineRule="auto"/>
-              <w:ind w:left="-110"/>
-              <w:jc w:val="right"/>
-              <w:rPr>
-                <w:rFonts w:cs="Arial"/>
-                <w:szCs w:val="20"/>
-              </w:rPr>
-            </w:pPr>
-          </w:p>
-        </w:tc>
-        <w:tc>
-          <w:tcPr>
-            <w:tcW w:w="1135" w:type="dxa"/>
-          </w:tcPr>
-          <w:p>
-            <w:pPr>
-              <w:spacing w:after="20" w:line="216" w:lineRule="auto"/>
-              <w:jc w:val="right"/>
-              <w:rPr>
-                <w:rFonts w:cs="Arial"/>
-                <w:noProof/>
-                <w:szCs w:val="20"/>
-                <w:highlight w:val="yellow"/>
-              </w:rPr>
-            </w:pPr>
-          </w:p>
-        </w:tc>
-        <w:tc>
-          <w:tcPr>
-            <w:tcW w:w="1956" w:type="dxa"/>
-          </w:tcPr>
-          <w:p>
-            <w:pPr>
-              <w:spacing w:after="20" w:line="216" w:lineRule="auto"/>
-              <w:rPr>
-                <w:rFonts w:cs="Arial"/>
-                <w:szCs w:val="20"/>
-              </w:rPr>
-            </w:pPr>
-          </w:p>
-        </w:tc>
-      </w:tr>
-      <w:tr>
-        <w:trPr>
-          <w:gridAfter w:val="1"/>
-          <w:wAfter w:w="32" w:type="dxa"/>
-        </w:trPr>
-        <w:tc>
-          <w:tcPr>
-            <w:tcW w:w="4820" w:type="dxa"/>
-          </w:tcPr>
-          <w:p>
-            <w:pPr>
-              <w:pStyle w:val="ANGEBOTDEUTSCH"/>
-              <w:tabs>
-                <w:tab w:val="left" w:pos="4543"/>
-              </w:tabs>
-              <w:spacing w:after="20" w:line="216" w:lineRule="auto"/>
-              <w:rPr>
-                <w:rFonts w:cs="Arial"/>
-                <w:b/>
-                <w:szCs w:val="20"/>
-                <w:highlight w:val="yellow"/>
-                <w:lang w:val="de-CH"/>
-              </w:rPr>
-            </w:pPr>
-          </w:p>
-        </w:tc>
-        <w:tc>
-          <w:tcPr>
-            <w:tcW w:w="1843" w:type="dxa"/>
-          </w:tcPr>
-          <w:p>
-            <w:pPr>
-              <w:pStyle w:val="ANGEBOTDEUTSCH"/>
-              <w:tabs>
-                <w:tab w:val="left" w:pos="4543"/>
-              </w:tabs>
-              <w:spacing w:after="20" w:line="216" w:lineRule="auto"/>
-              <w:ind w:left="-110"/>
-              <w:jc w:val="right"/>
-              <w:rPr>
-                <w:rFonts w:cs="Arial"/>
-                <w:bCs/>
-                <w:szCs w:val="20"/>
-                <w:lang w:val="de-CH"/>
-              </w:rPr>
-            </w:pPr>
-          </w:p>
-        </w:tc>
-        <w:tc>
-          <w:tcPr>
-            <w:tcW w:w="1135" w:type="dxa"/>
-          </w:tcPr>
-          <w:p>
-            <w:pPr>
-              <w:pStyle w:val="ANGEBOTDEUTSCH"/>
-              <w:tabs>
-                <w:tab w:val="left" w:pos="4543"/>
-              </w:tabs>
-              <w:spacing w:after="20" w:line="216" w:lineRule="auto"/>
-              <w:jc w:val="right"/>
-              <w:rPr>
-                <w:rFonts w:cs="Arial"/>
-                <w:b/>
-                <w:szCs w:val="20"/>
-                <w:highlight w:val="yellow"/>
-                <w:lang w:val="de-CH"/>
-              </w:rPr>
-            </w:pPr>
-          </w:p>
-        </w:tc>
-        <w:tc>
-          <w:tcPr>
-            <w:tcW w:w="1956" w:type="dxa"/>
-          </w:tcPr>
-          <w:p>
-            <w:pPr>
-              <w:pStyle w:val="ANGEBOTDEUTSCH"/>
-              <w:tabs>
-                <w:tab w:val="left" w:pos="4543"/>
-              </w:tabs>
-              <w:spacing w:after="20" w:line="216" w:lineRule="auto"/>
-              <w:rPr>
-                <w:rFonts w:cs="Arial"/>
-                <w:b/>
-                <w:szCs w:val="20"/>
-                <w:lang w:val="de-CH"/>
-              </w:rPr>
-            </w:pPr>
-          </w:p>
-        </w:tc>
-      </w:tr>
-    </w:tbl>
     <w:p/>
     <w:p/>
     <w:p/>
@@ -3450,458 +1423,63 @@
     <w:p/>
     <w:p/>
     <w:p/>
-    <w:tbl>
-      <w:tblPr>
-        <w:tblStyle w:val="05Tabellenvorlage"/>
-        <w:tblW w:w="9781" w:type="dxa"/>
-        <w:tblLayout w:type="fixed"/>
-        <w:tblLook w:val="0020" w:firstRow="1" w:lastRow="0" w:firstColumn="0" w:lastColumn="0" w:noHBand="0" w:noVBand="0"/>
-      </w:tblPr>
-      <w:tblGrid>
-        <w:gridCol w:w="5678"/>
-        <w:gridCol w:w="276"/>
-        <w:gridCol w:w="719"/>
-        <w:gridCol w:w="133"/>
-        <w:gridCol w:w="861"/>
-        <w:gridCol w:w="2114"/>
-      </w:tblGrid>
-      <w:tr>
-        <w:trPr>
-          <w:cnfStyle w:val="100000000000" w:firstRow="1" w:lastRow="0" w:firstColumn="0" w:lastColumn="0" w:oddVBand="0" w:evenVBand="0" w:oddHBand="0" w:evenHBand="0" w:firstRowFirstColumn="0" w:firstRowLastColumn="0" w:lastRowFirstColumn="0" w:lastRowLastColumn="0"/>
-          <w:trHeight w:val="567"/>
-        </w:trPr>
-        <w:tc>
-          <w:tcPr>
-            <w:tcW w:w="9781" w:type="dxa"/>
-            <w:gridSpan w:val="6"/>
-            <w:tcBorders>
-              <w:top w:val="none" w:sz="0" w:space="0" w:color="auto"/>
-              <w:left w:val="none" w:sz="0" w:space="0" w:color="auto"/>
-              <w:bottom w:val="none" w:sz="0" w:space="0" w:color="auto"/>
-              <w:right w:val="none" w:sz="0" w:space="0" w:color="auto"/>
-            </w:tcBorders>
-            <w:shd w:val="clear" w:color="auto" w:fill="FFED00"/>
-          </w:tcPr>
-          <w:p>
-            <w:pPr>
-              <w:pStyle w:val="berschrift2"/>
-              <w:tabs>
-                <w:tab w:val="left" w:pos="1456"/>
-              </w:tabs>
-              <w:rPr>
-                <w:b/>
-                <w:bCs/>
-              </w:rPr>
-            </w:pPr>
-            <w:bookmarkStart w:id="1" w:name="_Toc130385211"/>
-            <w:bookmarkStart w:id="2" w:name="_Toc138164344"/>
-            <w:bookmarkStart w:id="3" w:name="_Toc176878713"/>
-            <w:r>
-              <w:rPr>
-                <w:b/>
-              </w:rPr>
-              <w:t>Zusammenfassung</w:t>
-            </w:r>
-            <w:bookmarkEnd w:id="1"/>
-            <w:bookmarkEnd w:id="2"/>
-            <w:bookmarkEnd w:id="3"/>
-          </w:p>
-        </w:tc>
-      </w:tr>
-      <w:tr>
-        <w:trPr>
-          <w:cnfStyle w:val="000000100000" w:firstRow="0" w:lastRow="0" w:firstColumn="0" w:lastColumn="0" w:oddVBand="0" w:evenVBand="0" w:oddHBand="1" w:evenHBand="0" w:firstRowFirstColumn="0" w:firstRowLastColumn="0" w:lastRowFirstColumn="0" w:lastRowLastColumn="0"/>
-        </w:trPr>
-        <w:tc>
-          <w:tcPr>
-            <w:tcW w:w="6806" w:type="dxa"/>
-            <w:gridSpan w:val="4"/>
-            <w:tcBorders>
-              <w:top w:val="none" w:sz="0" w:space="0" w:color="auto"/>
-              <w:left w:val="none" w:sz="0" w:space="0" w:color="auto"/>
-              <w:bottom w:val="none" w:sz="0" w:space="0" w:color="auto"/>
-              <w:right w:val="none" w:sz="0" w:space="0" w:color="auto"/>
-            </w:tcBorders>
-            <w:shd w:val="clear" w:color="auto" w:fill="auto"/>
-          </w:tcPr>
-          <w:p>
-            <w:pPr>
-              <w:pStyle w:val="ANGEBOTDEUTSCH"/>
-              <w:jc w:val="both"/>
-            </w:pPr>
-          </w:p>
-          <w:p>
-            <w:pPr>
-              <w:pStyle w:val="ANGEBOTDEUTSCH"/>
-              <w:jc w:val="both"/>
-            </w:pPr>
-            <w:r>
-              <w:t xml:space="preserve">Position 1 </w:t>
-            </w:r>
-            <w:r>
-              <w:t xml:space="preserve">  –  </w:t>
-            </w:r>
-            <w:r>
-              <w:t xml:space="preserve"> </w:t>
-            </w:r>
-            <w:r>
-              <w:t>Lagerlift Logimat® (SLL)</w:t>
-            </w:r>
-          </w:p>
-          <w:p>
-            <w:pPr>
-              <w:jc w:val="both"/>
-              <w:rPr>
-                <w:sz w:val="16"/>
-                <w:szCs w:val="16"/>
-              </w:rPr>
-            </w:pPr>
-          </w:p>
-        </w:tc>
-        <w:tc>
-          <w:tcPr>
-            <w:tcW w:w="2975" w:type="dxa"/>
-            <w:gridSpan w:val="2"/>
-            <w:tcBorders>
-              <w:top w:val="none" w:sz="0" w:space="0" w:color="auto"/>
-              <w:left w:val="none" w:sz="0" w:space="0" w:color="auto"/>
-              <w:bottom w:val="none" w:sz="0" w:space="0" w:color="auto"/>
-              <w:right w:val="none" w:sz="0" w:space="0" w:color="auto"/>
-            </w:tcBorders>
-            <w:shd w:val="clear" w:color="auto" w:fill="auto"/>
-          </w:tcPr>
-          <w:p>
-            <w:pPr>
-              <w:jc w:val="right"/>
-            </w:pPr>
-          </w:p>
-          <w:p>
-            <w:pPr>
-              <w:jc w:val="right"/>
-            </w:pPr>
-            <w:r>
-              <w:t>00’000.00</w:t>
-            </w:r>
-          </w:p>
-        </w:tc>
-      </w:tr>
-      <w:tr>
-        <w:trPr>
-          <w:cnfStyle w:val="000000010000" w:firstRow="0" w:lastRow="0" w:firstColumn="0" w:lastColumn="0" w:oddVBand="0" w:evenVBand="0" w:oddHBand="0" w:evenHBand="1" w:firstRowFirstColumn="0" w:firstRowLastColumn="0" w:lastRowFirstColumn="0" w:lastRowLastColumn="0"/>
-        </w:trPr>
-        <w:tc>
-          <w:tcPr>
-            <w:tcW w:w="5954" w:type="dxa"/>
-            <w:gridSpan w:val="2"/>
-            <w:tcBorders>
-              <w:top w:val="none" w:sz="0" w:space="0" w:color="auto"/>
-              <w:left w:val="none" w:sz="0" w:space="0" w:color="auto"/>
-              <w:bottom w:val="none" w:sz="0" w:space="0" w:color="auto"/>
-              <w:right w:val="none" w:sz="0" w:space="0" w:color="auto"/>
-            </w:tcBorders>
-            <w:shd w:val="clear" w:color="auto" w:fill="auto"/>
-          </w:tcPr>
-          <w:p>
-            <w:pPr>
-              <w:pStyle w:val="ANGEBOTDEUTSCH"/>
-            </w:pPr>
-            <w:r>
-              <w:t xml:space="preserve">Position 2 </w:t>
-            </w:r>
-            <w:r>
-              <w:t xml:space="preserve">  </w:t>
-            </w:r>
-            <w:r>
-              <w:t>–</w:t>
-            </w:r>
-            <w:r>
-              <w:t xml:space="preserve">  </w:t>
-            </w:r>
-            <w:r>
-              <w:t xml:space="preserve"> </w:t>
-            </w:r>
-            <w:r>
-              <w:t>Montagehilfsmittel</w:t>
-            </w:r>
-          </w:p>
-          <w:p>
-            <w:pPr>
-              <w:pStyle w:val="ANGEBOTDEUTSCH"/>
-              <w:rPr>
-                <w:sz w:val="32"/>
-                <w:szCs w:val="32"/>
-              </w:rPr>
-            </w:pPr>
-          </w:p>
-        </w:tc>
-        <w:tc>
-          <w:tcPr>
-            <w:tcW w:w="852" w:type="dxa"/>
-            <w:gridSpan w:val="2"/>
-            <w:tcBorders>
-              <w:top w:val="none" w:sz="0" w:space="0" w:color="auto"/>
-              <w:left w:val="none" w:sz="0" w:space="0" w:color="auto"/>
-              <w:bottom w:val="none" w:sz="0" w:space="0" w:color="auto"/>
-              <w:right w:val="none" w:sz="0" w:space="0" w:color="auto"/>
-            </w:tcBorders>
-            <w:shd w:val="clear" w:color="auto" w:fill="auto"/>
-          </w:tcPr>
-          <w:p>
-            <w:pPr>
-              <w:jc w:val="right"/>
-            </w:pPr>
-          </w:p>
-        </w:tc>
-        <w:tc>
-          <w:tcPr>
-            <w:tcW w:w="2975" w:type="dxa"/>
-            <w:gridSpan w:val="2"/>
-            <w:tcBorders>
-              <w:top w:val="none" w:sz="0" w:space="0" w:color="auto"/>
-              <w:left w:val="none" w:sz="0" w:space="0" w:color="auto"/>
-              <w:bottom w:val="none" w:sz="0" w:space="0" w:color="auto"/>
-              <w:right w:val="none" w:sz="0" w:space="0" w:color="auto"/>
-            </w:tcBorders>
-            <w:shd w:val="clear" w:color="auto" w:fill="auto"/>
-          </w:tcPr>
-          <w:p>
-            <w:pPr>
-              <w:jc w:val="right"/>
-            </w:pPr>
-            <w:r>
-              <w:t>0</w:t>
-            </w:r>
-            <w:r>
-              <w:t>’</w:t>
-            </w:r>
-            <w:r>
-              <w:t>0</w:t>
-            </w:r>
-            <w:r>
-              <w:t>00.00</w:t>
-            </w:r>
-          </w:p>
-        </w:tc>
-      </w:tr>
-      <w:tr>
-        <w:tblPrEx>
-          <w:tblLook w:val="0620" w:firstRow="1" w:lastRow="0" w:firstColumn="0" w:lastColumn="0" w:noHBand="1" w:noVBand="1"/>
-        </w:tblPrEx>
-        <w:trPr>
-          <w:trHeight w:val="567"/>
-        </w:trPr>
-        <w:tc>
-          <w:tcPr>
-            <w:tcW w:w="5678" w:type="dxa"/>
-            <w:vAlign w:val="center"/>
-          </w:tcPr>
-          <w:p>
-            <w:pPr>
-              <w:pStyle w:val="ANGEBOTDEUTSCH"/>
-              <w:spacing w:before="100" w:after="100"/>
-              <w:rPr>
-                <w:rFonts w:cs="Arial"/>
-                <w:b/>
-                <w:lang w:val="fr-FR"/>
-              </w:rPr>
-            </w:pPr>
-            <w:r>
-              <w:rPr>
-                <w:rFonts w:cs="Arial"/>
-                <w:b/>
-                <w:lang w:val="fr-FR"/>
-              </w:rPr>
-              <w:t xml:space="preserve">Total </w:t>
-            </w:r>
-            <w:proofErr w:type="spellStart"/>
-            <w:proofErr w:type="gramStart"/>
-            <w:r>
-              <w:rPr>
-                <w:rFonts w:cs="Arial"/>
-                <w:b/>
-                <w:lang w:val="fr-CH"/>
-              </w:rPr>
-              <w:t>netto</w:t>
-            </w:r>
-            <w:proofErr w:type="spellEnd"/>
-            <w:r>
-              <w:rPr>
-                <w:rFonts w:cs="Arial"/>
-                <w:b/>
-                <w:lang w:val="fr-FR"/>
-              </w:rPr>
-              <w:t>,</w:t>
-            </w:r>
-            <w:r>
-              <w:rPr>
-                <w:rFonts w:cs="Arial"/>
-                <w:b/>
-                <w:lang w:val="fr-CH"/>
-              </w:rPr>
-              <w:t xml:space="preserve"> </w:t>
-            </w:r>
-            <w:r>
-              <w:rPr>
-                <w:rFonts w:cs="Arial"/>
-                <w:b/>
-                <w:lang w:val="fr-CH"/>
-              </w:rPr>
-              <w:t xml:space="preserve"> </w:t>
-            </w:r>
-            <w:proofErr w:type="spellStart"/>
-            <w:r>
-              <w:rPr>
-                <w:rFonts w:cs="Arial"/>
-                <w:b/>
-                <w:lang w:val="fr-CH"/>
-              </w:rPr>
-              <w:t>montiert</w:t>
-            </w:r>
-            <w:proofErr w:type="spellEnd"/>
-            <w:r>
-              <w:rPr>
-                <w:rFonts w:cs="Arial"/>
-                <w:b/>
-                <w:lang w:val="fr-CH"/>
-              </w:rPr>
-              <w:t xml:space="preserve">, </w:t>
-            </w:r>
-            <w:r>
-              <w:rPr>
-                <w:rFonts w:cs="Arial"/>
-                <w:b/>
-                <w:lang w:val="fr-CH"/>
-              </w:rPr>
-              <w:t xml:space="preserve"> </w:t>
-            </w:r>
-            <w:proofErr w:type="spellStart"/>
-            <w:r>
-              <w:rPr>
-                <w:rFonts w:cs="Arial"/>
-                <w:b/>
-                <w:lang w:val="fr-CH"/>
-              </w:rPr>
-              <w:t>ex</w:t>
-            </w:r>
-            <w:r>
-              <w:rPr>
-                <w:rFonts w:cs="Arial"/>
-                <w:b/>
-                <w:lang w:val="fr-CH"/>
-              </w:rPr>
-              <w:t>kl</w:t>
-            </w:r>
-            <w:proofErr w:type="spellEnd"/>
-            <w:proofErr w:type="gramEnd"/>
-            <w:r>
-              <w:rPr>
-                <w:rFonts w:cs="Arial"/>
-                <w:b/>
-                <w:lang w:val="fr-CH"/>
-              </w:rPr>
-              <w:t>. M</w:t>
-            </w:r>
-            <w:r>
-              <w:rPr>
-                <w:rFonts w:cs="Arial"/>
-                <w:b/>
-                <w:lang w:val="fr-CH"/>
-              </w:rPr>
-              <w:t>wSt.</w:t>
-            </w:r>
-          </w:p>
-        </w:tc>
-        <w:tc>
-          <w:tcPr>
-            <w:tcW w:w="995" w:type="dxa"/>
-            <w:gridSpan w:val="2"/>
-          </w:tcPr>
-          <w:p>
-            <w:pPr>
-              <w:spacing w:before="100" w:after="100"/>
-              <w:rPr>
-                <w:rFonts w:cs="Arial"/>
-                <w:b/>
-                <w:lang w:val="fr-FR"/>
-              </w:rPr>
-            </w:pPr>
-          </w:p>
-        </w:tc>
-        <w:tc>
-          <w:tcPr>
-            <w:tcW w:w="994" w:type="dxa"/>
-            <w:gridSpan w:val="2"/>
-          </w:tcPr>
-          <w:p>
-            <w:pPr>
-              <w:spacing w:before="100" w:after="100"/>
-              <w:jc w:val="right"/>
-              <w:rPr>
-                <w:rFonts w:cs="Arial"/>
-                <w:b/>
-                <w:lang w:val="fr-FR"/>
-              </w:rPr>
-            </w:pPr>
-          </w:p>
-        </w:tc>
-        <w:tc>
-          <w:tcPr>
-            <w:tcW w:w="2114" w:type="dxa"/>
-            <w:tcBorders>
-              <w:top w:val="single" w:sz="6" w:space="0" w:color="auto"/>
-              <w:bottom w:val="double" w:sz="6" w:space="0" w:color="auto"/>
-            </w:tcBorders>
-            <w:vAlign w:val="center"/>
-          </w:tcPr>
-          <w:p>
-            <w:pPr>
-              <w:spacing w:before="100" w:after="100"/>
-              <w:jc w:val="right"/>
-              <w:rPr>
-                <w:rFonts w:cs="Arial"/>
-                <w:b/>
-                <w:lang w:val="fr-CH"/>
-              </w:rPr>
-            </w:pPr>
-            <w:r>
-              <w:rPr>
-                <w:rFonts w:cs="Arial"/>
-                <w:b/>
-              </w:rPr>
-              <w:t xml:space="preserve">CHF  </w:t>
-            </w:r>
-            <w:r>
-              <w:rPr>
-                <w:rFonts w:cs="Arial"/>
-                <w:b/>
-              </w:rPr>
-              <w:t xml:space="preserve">        </w:t>
-            </w:r>
-            <w:r>
-              <w:rPr>
-                <w:rFonts w:cs="Arial"/>
-                <w:b/>
-              </w:rPr>
-              <w:t>00</w:t>
-            </w:r>
-            <w:r>
-              <w:rPr>
-                <w:rFonts w:cs="Arial"/>
-                <w:b/>
-              </w:rPr>
-              <w:t>’</w:t>
-            </w:r>
-            <w:r>
-              <w:rPr>
-                <w:rFonts w:cs="Arial"/>
-                <w:b/>
-              </w:rPr>
-              <w:t>000.00</w:t>
-            </w:r>
-          </w:p>
-        </w:tc>
-      </w:tr>
-    </w:tbl>
+    <w:p>
+      <w:pPr>
+        <w:spacing w:after="80"/>
+      </w:pPr>
+      <w:r>
+        <w:rPr>
+          <w:b/>
+          <w:sz w:val="24"/>
+        </w:rPr>
+        <w:t xml:space="preserve">Preisübersicht</w:t>
+      </w:r>
+    </w:p>
+    <w:p>
+      <w:pPr>
+        <w:spacing w:after="80"/>
+      </w:pPr>
+      <w:r>
+        <w:rPr>
+          <w:sz w:val="20"/>
+        </w:rPr>
+        <w:t xml:space="preserve">Softwarelizenzen: {{lizenz_total_chf}}</w:t>
+      </w:r>
+    </w:p>
+    <w:p>
+      <w:pPr>
+        <w:spacing w:after="80"/>
+      </w:pPr>
+      <w:r>
+        <w:rPr>
+          <w:sz w:val="20"/>
+        </w:rPr>
+        <w:t xml:space="preserve">IT-Aufwand / Installation: {{it_total_chf}}</w:t>
+      </w:r>
+    </w:p>
+    <w:p>
+      <w:pPr>
+        <w:spacing w:after="80"/>
+      </w:pPr>
+      <w:r>
+        <w:rPr>
+          <w:b/>
+          <w:sz w:val="20"/>
+        </w:rPr>
+        <w:t xml:space="preserve">Gesamttotal exkl. MwSt.: {{gesamt_chf}}</w:t>
+      </w:r>
+    </w:p>
+    <w:p>
+      <w:pPr>
+        <w:spacing w:after="80"/>
+      </w:pPr>
+      <w:r>
+        <w:rPr>
+          <w:sz w:val="18"/>
+        </w:rPr>
+        <w:t xml:space="preserve">{{preis_hinweis}}</w:t>
+      </w:r>
+    </w:p>
     <w:p/>
     <w:p/>
     <w:p/>
@@ -12677,42 +10255,10 @@
               </w:tabs>
               <w:ind w:left="-113"/>
             </w:pPr>
-            <w:sdt>
-              <w:sdtPr>
-                <w:rPr>
-                  <w:lang w:val="en-US"/>
-                </w:rPr>
-                <w:alias w:val="Unterschrift links"/>
-                <w:tag w:val="Unterschrift links"/>
-                <w:id w:val="-1575344139"/>
-                <w:placeholder>
-                  <w:docPart w:val="11AA91039777456BB6605DDA2B1BE627"/>
-                </w:placeholder>
-                <w:showingPlcHdr/>
-                <w:dropDownList>
-                  <w:listItem w:value="Wählen Sie ein Element aus."/>
-                  <w:listItem w:displayText="Florian Brunner" w:value="Florian Brunner"/>
-                  <w:listItem w:displayText="Luca Cathomen" w:value="Luca Cathomen"/>
-                  <w:listItem w:displayText="Peter Hansen" w:value="Peter Hansen"/>
-                  <w:listItem w:displayText="Armin Kaufmann" w:value="Armin Kaufmann"/>
-                  <w:listItem w:displayText="Marc Mangold" w:value="Marc Mangold"/>
-                  <w:listItem w:displayText="Rudolf Mayer-Richert" w:value="Rudolf Mayer-Richert"/>
-                  <w:listItem w:displayText="Oliver Meyer" w:value="Oliver Meyer"/>
-                  <w:listItem w:displayText="Michael Preisig" w:value="Michael Preisig"/>
-                  <w:listItem w:displayText="Andrej Pulfer" w:value="Andrej Pulfer"/>
-                  <w:listItem w:displayText="Simon Rüede" w:value="Simon Rüede"/>
-                  <w:listItem w:displayText="Daniel Urech" w:value="Daniel Urech"/>
-                </w:dropDownList>
-              </w:sdtPr>
-              <w:sdtContent>
-                <w:r>
-                  <w:rPr>
-                    <w:rStyle w:val="Platzhaltertext"/>
-                  </w:rPr>
-                  <w:t>Wählen Sie ein Element aus.</w:t>
-                </w:r>
-              </w:sdtContent>
-            </w:sdt>
+            <w:r>
+              <w:rPr/>
+              <w:t xml:space="preserve">{{ssi_kontakt_1_name}}</w:t>
+            </w:r>
           </w:p>
           <w:sdt>
             <w:sdtPr>
@@ -12733,10 +10279,8 @@
                   <w:ind w:left="-113"/>
                 </w:pPr>
                 <w:r>
-                  <w:rPr>
-                    <w:rStyle w:val="Platzhaltertext"/>
-                  </w:rPr>
-                  <w:t>Klicken oder tippen Sie hier, um Text einzugeben.</w:t>
+                  <w:rPr/>
+                  <w:t xml:space="preserve">{{ssi_kontakt_1_position}}</w:t>
                 </w:r>
               </w:p>
             </w:sdtContent>
@@ -12752,44 +10296,10 @@
                 <w:tab w:val="left" w:pos="5670"/>
               </w:tabs>
             </w:pPr>
-            <w:sdt>
-              <w:sdtPr>
-                <w:alias w:val="Unterschrift rechts"/>
-                <w:tag w:val="Unterschrift rechts"/>
-                <w:id w:val="782238394"/>
-                <w:placeholder>
-                  <w:docPart w:val="6302D71F33D84563BD7004445D965C1E"/>
-                </w:placeholder>
-                <w:showingPlcHdr/>
-                <w:dropDownList>
-                  <w:listItem w:value="Wählen Sie ein Element aus."/>
-                  <w:listItem w:displayText="Adrian Bollinger" w:value="Adrian Bollinger"/>
-                  <w:listItem w:displayText="Florian Brunner" w:value="Florian Brunner"/>
-                  <w:listItem w:displayText="Luca Cathomen" w:value="Luca Cathomen"/>
-                  <w:listItem w:displayText="Mario Gisler" w:value="Mario Gisler"/>
-                  <w:listItem w:displayText="Peter Hansen" w:value="Peter Hansen"/>
-                  <w:listItem w:displayText="Armin Kaufmann" w:value="Armin Kaufmann"/>
-                  <w:listItem w:displayText="Marc Mangold" w:value="Marc Mangold"/>
-                  <w:listItem w:displayText="Rudolf Mayer-Richert" w:value="Rudolf Mayer-Richert"/>
-                  <w:listItem w:displayText="Oliver Meyer" w:value="Oliver Meyer"/>
-                  <w:listItem w:displayText="Andrea Micanovic" w:value="Andrea Micanovic"/>
-                  <w:listItem w:displayText="Michael Preisig" w:value="Michael Preisig"/>
-                  <w:listItem w:displayText="Andrej Pulfer" w:value="Andrej Pulfer"/>
-                  <w:listItem w:displayText="Ursina Reich" w:value="Ursina Reich"/>
-                  <w:listItem w:displayText="Simon Rüede" w:value="Simon Rüede"/>
-                  <w:listItem w:displayText="Daniel Urech" w:value="Daniel Urech"/>
-                  <w:listItem w:displayText="Annina Zancanaro" w:value="Annina Zancanaro"/>
-                </w:dropDownList>
-              </w:sdtPr>
-              <w:sdtContent>
-                <w:r>
-                  <w:rPr>
-                    <w:rStyle w:val="Platzhaltertext"/>
-                  </w:rPr>
-                  <w:t>Wählen Sie ein Element aus.</w:t>
-                </w:r>
-              </w:sdtContent>
-            </w:sdt>
+            <w:r>
+              <w:rPr/>
+              <w:t xml:space="preserve">{{ssi_kontakt_1_name}}</w:t>
+            </w:r>
           </w:p>
           <w:p>
             <w:pPr>
@@ -12797,25 +10307,10 @@
                 <w:tab w:val="left" w:pos="5670"/>
               </w:tabs>
             </w:pPr>
-            <w:sdt>
-              <w:sdtPr>
-                <w:alias w:val="Funktion rechts"/>
-                <w:tag w:val="Funktion rechts"/>
-                <w:id w:val="264513574"/>
-                <w:placeholder>
-                  <w:docPart w:val="52048806D0E240A0BB0D0007E64DB55E"/>
-                </w:placeholder>
-                <w:showingPlcHdr/>
-              </w:sdtPr>
-              <w:sdtContent>
-                <w:r>
-                  <w:rPr>
-                    <w:rStyle w:val="Platzhaltertext"/>
-                  </w:rPr>
-                  <w:t>Klicken oder tippen Sie hier, um Text einzugeben.</w:t>
-                </w:r>
-              </w:sdtContent>
-            </w:sdt>
+            <w:r>
+              <w:rPr/>
+              <w:t xml:space="preserve">{{ssi_kontakt_1_position}}</w:t>
+            </w:r>
           </w:p>
         </w:tc>
       </w:tr>

</xml_diff>

<commit_message>
Angebot: Leistungsumfang & Preise nach A1.2.1 einordnen
Preisblock kommt erst nach Hardware-Optionen (A1.2.1); Inhaltsverzeichnis
und Word-Block entsprechend angepasst.

Co-authored-by: msobona <msobona@users.noreply.github.com>
</commit_message>
<xml_diff>
--- a/docs/templates/Angebot Logimat DE.docx
+++ b/docs/templates/Angebot Logimat DE.docx
@@ -817,173 +817,147 @@
     </w:p>
     <w:p>
       <w:pPr>
-        <w:spacing w:after="120"/>
+        <w:spacing w:after="80"/>
       </w:pPr>
       <w:r>
         <w:rPr>
           <w:sz w:val="22"/>
-          <w:szCs w:val="22"/>
         </w:rPr>
         <w:t xml:space="preserve">{{anrede}}</w:t>
       </w:r>
     </w:p>
     <w:p>
       <w:pPr>
-        <w:spacing w:after="120"/>
+        <w:spacing w:after="80"/>
       </w:pPr>
       <w:r>
         <w:rPr>
           <w:sz w:val="20"/>
-          <w:szCs w:val="20"/>
         </w:rPr>
         <w:t xml:space="preserve">{{einleitung}}</w:t>
       </w:r>
     </w:p>
     <w:p>
       <w:pPr>
-        <w:spacing w:after="120"/>
+        <w:spacing w:after="80"/>
       </w:pPr>
       <w:r>
         <w:rPr>
           <w:b/>
           <w:sz w:val="24"/>
-          <w:szCs w:val="24"/>
         </w:rPr>
         <w:t xml:space="preserve">Konfiguration</w:t>
       </w:r>
     </w:p>
     <w:p>
       <w:pPr>
-        <w:spacing w:after="120"/>
+        <w:spacing w:after="80"/>
       </w:pPr>
       <w:r>
         <w:rPr>
           <w:sz w:val="20"/>
-          <w:szCs w:val="20"/>
         </w:rPr>
         <w:t xml:space="preserve">{{konfiguration}}</w:t>
       </w:r>
     </w:p>
     <w:p>
       <w:pPr>
-        <w:spacing w:after="120"/>
+        <w:spacing w:after="80"/>
       </w:pPr>
       <w:r>
         <w:rPr>
           <w:b/>
           <w:sz w:val="24"/>
-          <w:szCs w:val="24"/>
-        </w:rPr>
-        <w:t xml:space="preserve">Leistungsumfang</w:t>
-      </w:r>
-    </w:p>
-    <w:p>
-      <w:pPr>
-        <w:spacing w:after="120"/>
+        </w:rPr>
+        <w:t xml:space="preserve">Optionen</w:t>
+      </w:r>
+    </w:p>
+    <w:p>
+      <w:pPr>
+        <w:spacing w:after="80"/>
       </w:pPr>
       <w:r>
         <w:rPr>
           <w:sz w:val="20"/>
-          <w:szCs w:val="20"/>
-        </w:rPr>
-        <w:t xml:space="preserve">{{leistungsumfang_text}}</w:t>
-      </w:r>
-    </w:p>
-    <w:p>
-      <w:pPr>
-        <w:spacing w:after="120"/>
+        </w:rPr>
+        <w:t xml:space="preserve">{{optionen_text}}</w:t>
+      </w:r>
+    </w:p>
+    <w:p>
+      <w:pPr>
+        <w:spacing w:after="80"/>
       </w:pPr>
       <w:r>
         <w:rPr>
           <w:b/>
           <w:sz w:val="24"/>
-          <w:szCs w:val="24"/>
-        </w:rPr>
-        <w:t xml:space="preserve">Optionen</w:t>
-      </w:r>
-    </w:p>
-    <w:p>
-      <w:pPr>
-        <w:spacing w:after="120"/>
+        </w:rPr>
+        <w:t xml:space="preserve">1. Leistungsumfang &amp; Preise</w:t>
+      </w:r>
+    </w:p>
+    <w:p>
+      <w:pPr>
+        <w:spacing w:after="80"/>
       </w:pPr>
       <w:r>
         <w:rPr>
           <w:sz w:val="20"/>
-          <w:szCs w:val="20"/>
-        </w:rPr>
-        <w:t xml:space="preserve">{{optionen_text}}</w:t>
-      </w:r>
-    </w:p>
-    <w:p>
-      <w:pPr>
-        <w:spacing w:after="120"/>
-      </w:pPr>
-      <w:r>
-        <w:rPr>
-          <w:b/>
-          <w:sz w:val="24"/>
-          <w:szCs w:val="24"/>
-        </w:rPr>
-        <w:t xml:space="preserve">Preise (CHF, exkl. MwSt.)</w:t>
-      </w:r>
-    </w:p>
-    <w:p>
-      <w:pPr>
-        <w:spacing w:after="120"/>
+        </w:rPr>
+        <w:t xml:space="preserve">{{leistungsumfang_text}}</w:t>
+      </w:r>
+    </w:p>
+    <w:p>
+      <w:pPr>
+        <w:spacing w:after="80"/>
       </w:pPr>
       <w:r>
         <w:rPr>
           <w:sz w:val="20"/>
-          <w:szCs w:val="20"/>
         </w:rPr>
         <w:t xml:space="preserve">Softwarelizenzen: {{lizenz_total_chf}}</w:t>
       </w:r>
     </w:p>
     <w:p>
       <w:pPr>
-        <w:spacing w:after="120"/>
+        <w:spacing w:after="80"/>
       </w:pPr>
       <w:r>
         <w:rPr>
           <w:sz w:val="20"/>
-          <w:szCs w:val="20"/>
         </w:rPr>
         <w:t xml:space="preserve">IT-Aufwand / Installation: {{it_total_chf}}</w:t>
       </w:r>
     </w:p>
     <w:p>
       <w:pPr>
-        <w:spacing w:after="120"/>
+        <w:spacing w:after="80"/>
       </w:pPr>
       <w:r>
         <w:rPr>
           <w:b/>
           <w:sz w:val="22"/>
-          <w:szCs w:val="22"/>
         </w:rPr>
         <w:t xml:space="preserve">Gesamttotal: {{gesamt_chf}}</w:t>
       </w:r>
     </w:p>
     <w:p>
       <w:pPr>
-        <w:spacing w:after="120"/>
+        <w:spacing w:after="80"/>
       </w:pPr>
       <w:r>
         <w:rPr>
           <w:sz w:val="18"/>
-          <w:szCs w:val="18"/>
         </w:rPr>
         <w:t xml:space="preserve">{{preis_hinweis}}</w:t>
       </w:r>
     </w:p>
     <w:p>
       <w:pPr>
-        <w:spacing w:after="120"/>
+        <w:spacing w:after="80"/>
       </w:pPr>
       <w:r>
         <w:rPr>
           <w:sz w:val="18"/>
-          <w:szCs w:val="18"/>
         </w:rPr>
         <w:t xml:space="preserve">{{meta_zeile}}</w:t>
       </w:r>

</xml_diff>

<commit_message>
Word-Cover wiederherstellen; Marge erst nach EUR→CHF
Logimat-Vorlage aus Backup restauriert (Floating-Bilder erhalten).
Lizenzkalkulation: Einkauf EUR × Kurs = Einkauf CHF, danach Marge.

Co-authored-by: msobona <msobona@users.noreply.github.com>
</commit_message>
<xml_diff>
--- a/docs/templates/Angebot Logimat DE.docx
+++ b/docs/templates/Angebot Logimat DE.docx
@@ -464,50 +464,41 @@
           </w:tcPr>
           <w:p>
             <w:pPr>
-              <w:spacing w:after="40"/>
-            </w:pPr>
-            <w:r>
-              <w:rPr>
-                <w:sz w:val="18"/>
-                <w:szCs w:val="18"/>
-              </w:rPr>
-              <w:t xml:space="preserve">Name:</w:t>
-            </w:r>
-          </w:p>
-          <w:p>
-            <w:pPr>
-              <w:spacing w:after="40"/>
-            </w:pPr>
-            <w:r>
-              <w:rPr>
-                <w:sz w:val="18"/>
-                <w:szCs w:val="18"/>
-              </w:rPr>
-              <w:t xml:space="preserve">Position:</w:t>
-            </w:r>
-          </w:p>
-          <w:p>
-            <w:pPr>
-              <w:spacing w:after="40"/>
-            </w:pPr>
-            <w:r>
-              <w:rPr>
-                <w:sz w:val="18"/>
-                <w:szCs w:val="18"/>
-              </w:rPr>
-              <w:t xml:space="preserve">E-Mail:</w:t>
-            </w:r>
-          </w:p>
-          <w:p>
-            <w:pPr>
-              <w:spacing w:after="40"/>
-            </w:pPr>
-            <w:r>
-              <w:rPr>
-                <w:sz w:val="18"/>
-                <w:szCs w:val="18"/>
-              </w:rPr>
-              <w:t xml:space="preserve">Telefon:</w:t>
+              <w:pStyle w:val="03Standardtext"/>
+            </w:pPr>
+            <w:r>
+              <w:t>Name</w:t>
+            </w:r>
+            <w:r>
+              <w:t>:</w:t>
+            </w:r>
+          </w:p>
+          <w:p>
+            <w:pPr>
+              <w:pStyle w:val="03Standardtext"/>
+            </w:pPr>
+            <w:r>
+              <w:t>Position</w:t>
+            </w:r>
+            <w:r>
+              <w:t>:</w:t>
+            </w:r>
+          </w:p>
+          <w:p>
+            <w:pPr>
+              <w:pStyle w:val="03Standardtext"/>
+            </w:pPr>
+            <w:r>
+              <w:t>E-Mail:</w:t>
+            </w:r>
+          </w:p>
+          <w:p>
+            <w:pPr>
+              <w:pStyle w:val="03Standardtext"/>
+            </w:pPr>
+            <w:r>
+              <w:rPr/>
+              <w:t xml:space="preserve">Telefon: {{telefon}}</w:t>
             </w:r>
           </w:p>
         </w:tc>
@@ -541,8 +532,10 @@
                   <w:pStyle w:val="03Standardtext"/>
                 </w:pPr>
                 <w:r>
-                  <w:rPr/>
-                  <w:t xml:space="preserve">{{ssi_kontakt_1_name}}</w:t>
+                  <w:rPr>
+                    <w:rStyle w:val="Platzhaltertext"/>
+                  </w:rPr>
+                  <w:t>Wählen Sie ein Element aus.</w:t>
                 </w:r>
               </w:p>
             </w:sdtContent>
@@ -563,60 +556,14 @@
                   <w:pStyle w:val="03Standardtext"/>
                 </w:pPr>
                 <w:r>
-                  <w:rPr/>
-                  <w:t xml:space="preserve">{{ssi_kontakt_1_position}}</w:t>
+                  <w:rPr>
+                    <w:rStyle w:val="Platzhaltertext"/>
+                  </w:rPr>
+                  <w:t>Klicken oder tippen Sie hier, um Text einzugeben.</w:t>
                 </w:r>
               </w:p>
             </w:sdtContent>
           </w:sdt>
-          <w:p>
-            <w:pPr>
-              <w:spacing w:after="40"/>
-            </w:pPr>
-            <w:r>
-              <w:rPr>
-                <w:sz w:val="18"/>
-                <w:szCs w:val="18"/>
-              </w:rPr>
-              <w:t xml:space="preserve">{{ssi_kontakt_1_name}}</w:t>
-            </w:r>
-          </w:p>
-          <w:p>
-            <w:pPr>
-              <w:spacing w:after="40"/>
-            </w:pPr>
-            <w:r>
-              <w:rPr>
-                <w:sz w:val="18"/>
-                <w:szCs w:val="18"/>
-              </w:rPr>
-              <w:t xml:space="preserve">{{ssi_kontakt_1_position}}</w:t>
-            </w:r>
-          </w:p>
-          <w:p>
-            <w:pPr>
-              <w:spacing w:after="40"/>
-            </w:pPr>
-            <w:r>
-              <w:rPr>
-                <w:sz w:val="18"/>
-                <w:szCs w:val="18"/>
-              </w:rPr>
-              <w:t xml:space="preserve">{{ssi_kontakt_1_email}}</w:t>
-            </w:r>
-          </w:p>
-          <w:p>
-            <w:pPr>
-              <w:spacing w:after="40"/>
-            </w:pPr>
-            <w:r>
-              <w:rPr>
-                <w:sz w:val="18"/>
-                <w:szCs w:val="18"/>
-              </w:rPr>
-              <w:t xml:space="preserve">{{ssi_kontakt_1_telefon}}</w:t>
-            </w:r>
-          </w:p>
         </w:tc>
       </w:tr>
       <w:tr>
@@ -630,50 +577,41 @@
           </w:tcPr>
           <w:p>
             <w:pPr>
-              <w:spacing w:after="40"/>
-            </w:pPr>
-            <w:r>
-              <w:rPr>
-                <w:sz w:val="18"/>
-                <w:szCs w:val="18"/>
-              </w:rPr>
-              <w:t xml:space="preserve">Name:</w:t>
-            </w:r>
-          </w:p>
-          <w:p>
-            <w:pPr>
-              <w:spacing w:after="40"/>
-            </w:pPr>
-            <w:r>
-              <w:rPr>
-                <w:sz w:val="18"/>
-                <w:szCs w:val="18"/>
-              </w:rPr>
-              <w:t xml:space="preserve">Position:</w:t>
-            </w:r>
-          </w:p>
-          <w:p>
-            <w:pPr>
-              <w:spacing w:after="40"/>
-            </w:pPr>
-            <w:r>
-              <w:rPr>
-                <w:sz w:val="18"/>
-                <w:szCs w:val="18"/>
-              </w:rPr>
-              <w:t xml:space="preserve">E-Mail:</w:t>
-            </w:r>
-          </w:p>
-          <w:p>
-            <w:pPr>
-              <w:spacing w:after="40"/>
-            </w:pPr>
-            <w:r>
-              <w:rPr>
-                <w:sz w:val="18"/>
-                <w:szCs w:val="18"/>
-              </w:rPr>
-              <w:t xml:space="preserve">Telefon:</w:t>
+              <w:pStyle w:val="03Standardtext"/>
+            </w:pPr>
+            <w:r>
+              <w:t>Name</w:t>
+            </w:r>
+            <w:r>
+              <w:t>:</w:t>
+            </w:r>
+          </w:p>
+          <w:p>
+            <w:pPr>
+              <w:pStyle w:val="03Standardtext"/>
+            </w:pPr>
+            <w:r>
+              <w:t>Position</w:t>
+            </w:r>
+            <w:r>
+              <w:t>:</w:t>
+            </w:r>
+          </w:p>
+          <w:p>
+            <w:pPr>
+              <w:pStyle w:val="03Standardtext"/>
+            </w:pPr>
+            <w:r>
+              <w:t>E-Mail:</w:t>
+            </w:r>
+          </w:p>
+          <w:p>
+            <w:pPr>
+              <w:pStyle w:val="03Standardtext"/>
+            </w:pPr>
+            <w:r>
+              <w:rPr/>
+              <w:t xml:space="preserve">Telefon: {{telefon}}</w:t>
             </w:r>
           </w:p>
         </w:tc>
@@ -711,8 +649,10 @@
                   </w:rPr>
                 </w:pPr>
                 <w:r>
-                  <w:rPr/>
-                  <w:t xml:space="preserve">{{ssi_kontakt_1_name}}</w:t>
+                  <w:rPr>
+                    <w:rStyle w:val="Platzhaltertext"/>
+                  </w:rPr>
+                  <w:t>Wählen Sie ein Element aus.</w:t>
                 </w:r>
               </w:p>
             </w:sdtContent>
@@ -736,60 +676,14 @@
                   </w:rPr>
                 </w:pPr>
                 <w:r>
-                  <w:rPr/>
-                  <w:t xml:space="preserve">{{ssi_kontakt_1_position}}</w:t>
+                  <w:rPr>
+                    <w:rStyle w:val="Platzhaltertext"/>
+                  </w:rPr>
+                  <w:t>Klicken oder tippen Sie hier, um Text einzugeben.</w:t>
                 </w:r>
               </w:p>
             </w:sdtContent>
           </w:sdt>
-          <w:p>
-            <w:pPr>
-              <w:spacing w:after="40"/>
-            </w:pPr>
-            <w:r>
-              <w:rPr>
-                <w:sz w:val="18"/>
-                <w:szCs w:val="18"/>
-              </w:rPr>
-              <w:t xml:space="preserve">{{ssi_kontakt_2_name}}</w:t>
-            </w:r>
-          </w:p>
-          <w:p>
-            <w:pPr>
-              <w:spacing w:after="40"/>
-            </w:pPr>
-            <w:r>
-              <w:rPr>
-                <w:sz w:val="18"/>
-                <w:szCs w:val="18"/>
-              </w:rPr>
-              <w:t xml:space="preserve">{{ssi_kontakt_2_position}}</w:t>
-            </w:r>
-          </w:p>
-          <w:p>
-            <w:pPr>
-              <w:spacing w:after="40"/>
-            </w:pPr>
-            <w:r>
-              <w:rPr>
-                <w:sz w:val="18"/>
-                <w:szCs w:val="18"/>
-              </w:rPr>
-              <w:t xml:space="preserve">{{ssi_kontakt_2_email}}</w:t>
-            </w:r>
-          </w:p>
-          <w:p>
-            <w:pPr>
-              <w:spacing w:after="40"/>
-            </w:pPr>
-            <w:r>
-              <w:rPr>
-                <w:sz w:val="18"/>
-                <w:szCs w:val="18"/>
-              </w:rPr>
-              <w:t xml:space="preserve">{{ssi_kontakt_2_telefon}}</w:t>
-            </w:r>
-          </w:p>
         </w:tc>
       </w:tr>
     </w:tbl>
@@ -816,151 +710,662 @@
       </w:r>
     </w:p>
     <w:p>
-      <w:pPr>
-        <w:spacing w:after="80"/>
-      </w:pPr>
-      <w:r>
-        <w:rPr>
-          <w:sz w:val="22"/>
-        </w:rPr>
-        <w:t xml:space="preserve">{{anrede}}</w:t>
-      </w:r>
-    </w:p>
-    <w:p>
-      <w:pPr>
-        <w:spacing w:after="80"/>
-      </w:pPr>
-      <w:r>
-        <w:rPr>
-          <w:sz w:val="20"/>
-        </w:rPr>
-        <w:t xml:space="preserve">{{einleitung}}</w:t>
-      </w:r>
-    </w:p>
-    <w:p>
-      <w:pPr>
-        <w:spacing w:after="80"/>
-      </w:pPr>
-      <w:r>
+      <w:r>
+        <w:lastRenderedPageBreak/>
+        <w:t xml:space="preserve">Sehr geehrter Herr </w:t>
+      </w:r>
+      <w:r>
+        <w:t>{{</w:t>
+      </w:r>
+      <w:proofErr w:type="spellStart"/>
+      <w:r>
+        <w:t>ansprechpartner</w:t>
+      </w:r>
+      <w:proofErr w:type="spellEnd"/>
+      <w:r>
+        <w:t>}}</w:t>
+      </w:r>
+      <w:r>
+        <w:rPr>
+          <w:highlight w:val="yellow"/>
+        </w:rPr>
+        <w:t>,</w:t>
+      </w:r>
+      <w:r>
+        <w:fldChar w:fldCharType="begin"/>
+      </w:r>
+      <w:r>
+        <w:instrText xml:space="preserve">  </w:instrText>
+      </w:r>
+      <w:r>
+        <w:fldChar w:fldCharType="end"/>
+      </w:r>
+    </w:p>
+    <w:p>
+      <w:pPr>
+        <w:rPr>
+          <w:sz w:val="16"/>
+          <w:szCs w:val="16"/>
+        </w:rPr>
+      </w:pPr>
+    </w:p>
+    <w:p>
+      <w:pPr>
+        <w:tabs>
+          <w:tab w:val="left" w:pos="5671"/>
+        </w:tabs>
+      </w:pPr>
+      <w:r>
+        <w:t xml:space="preserve">Wir danken für Ihre Anfrage vom </w:t>
+      </w:r>
+      <w:r>
+        <w:rPr>
+          <w:highlight w:val="yellow"/>
+        </w:rPr>
+        <w:t>14.04.2008</w:t>
+      </w:r>
+      <w:r>
+        <w:t xml:space="preserve"> an </w:t>
+      </w:r>
+      <w:r>
+        <w:rPr>
+          <w:highlight w:val="yellow"/>
+        </w:rPr>
+        <w:t xml:space="preserve">Herrn </w:t>
+      </w:r>
+      <w:r>
+        <w:rPr>
+          <w:highlight w:val="yellow"/>
+        </w:rPr>
+        <w:t>Reto Häuselmann</w:t>
+      </w:r>
+      <w:r>
+        <w:rPr>
+          <w:highlight w:val="yellow"/>
+        </w:rPr>
+        <w:t xml:space="preserve"> </w:t>
+      </w:r>
+      <w:r>
+        <w:rPr>
+          <w:highlight w:val="yellow"/>
+        </w:rPr>
+        <w:t>/ Herrn Cenk Aytac</w:t>
+      </w:r>
+      <w:r>
+        <w:rPr>
+          <w:highlight w:val="yellow"/>
+        </w:rPr>
+        <w:t xml:space="preserve"> </w:t>
+      </w:r>
+      <w:r>
+        <w:rPr>
+          <w:highlight w:val="yellow"/>
+        </w:rPr>
+        <w:t xml:space="preserve">/ Kristijan Zornjak </w:t>
+      </w:r>
+      <w:r>
+        <w:rPr>
+          <w:highlight w:val="yellow"/>
+        </w:rPr>
+        <w:t>/</w:t>
+      </w:r>
+      <w:r>
+        <w:rPr>
+          <w:highlight w:val="yellow"/>
+        </w:rPr>
+        <w:t xml:space="preserve"> </w:t>
+      </w:r>
+      <w:r>
+        <w:rPr>
+          <w:highlight w:val="yellow"/>
+        </w:rPr>
+        <w:t>Marek Sobona</w:t>
+      </w:r>
+      <w:r>
+        <w:t xml:space="preserve"> </w:t>
+      </w:r>
+      <w:r>
+        <w:t>und unterbreiten Ihnen nachstehend das gewünschte Angebot:</w:t>
+      </w:r>
+    </w:p>
+    <w:p>
+      <w:pPr>
+        <w:pStyle w:val="Verzeichnis1"/>
+      </w:pPr>
+    </w:p>
+    <w:p>
+      <w:pPr>
+        <w:rPr>
+          <w:sz w:val="16"/>
+          <w:szCs w:val="16"/>
+          <w:lang w:val="de-DE" w:eastAsia="de-DE"/>
+        </w:rPr>
+      </w:pPr>
+    </w:p>
+    <w:p>
+      <w:pPr>
+        <w:pStyle w:val="Verzeichnis1"/>
+        <w:rPr>
+          <w:rFonts w:asciiTheme="minorHAnsi" w:eastAsiaTheme="minorEastAsia" w:hAnsiTheme="minorHAnsi" w:cstheme="minorBidi"/>
+          <w:b w:val="0"/>
+          <w:bCs w:val="0"/>
+          <w:kern w:val="2"/>
+          <w:sz w:val="24"/>
+          <w:szCs w:val="24"/>
+          <w:lang w:val="de-CH" w:eastAsia="de-CH"/>
+          <w14:ligatures w14:val="standardContextual"/>
+        </w:rPr>
+      </w:pPr>
+      <w:r>
+        <w:fldChar w:fldCharType="begin"/>
+      </w:r>
+      <w:r>
+        <w:instrText xml:space="preserve"> TOC \h \z \u \t "Überschrift 2;1" </w:instrText>
+      </w:r>
+      <w:r>
+        <w:fldChar w:fldCharType="separate"/>
+      </w:r>
+      <w:hyperlink w:anchor="_Toc176878711" w:history="1">
+        <w:r>
+          <w:rPr>
+            <w:rStyle w:val="Hyperlink"/>
+          </w:rPr>
+          <w:t>Position 1</w:t>
+        </w:r>
+        <w:r>
+          <w:rPr>
+            <w:rFonts w:asciiTheme="minorHAnsi" w:eastAsiaTheme="minorEastAsia" w:hAnsiTheme="minorHAnsi" w:cstheme="minorBidi"/>
+            <w:b w:val="0"/>
+            <w:bCs w:val="0"/>
+            <w:kern w:val="2"/>
+            <w:sz w:val="24"/>
+            <w:szCs w:val="24"/>
+            <w:lang w:val="de-CH" w:eastAsia="de-CH"/>
+            <w14:ligatures w14:val="standardContextual"/>
+          </w:rPr>
+          <w:tab/>
+        </w:r>
+        <w:r>
+          <w:rPr>
+            <w:rStyle w:val="Hyperlink"/>
+          </w:rPr>
+          <w:t>Schwerlast-Verschieberegal System ESX PR600</w:t>
+        </w:r>
+        <w:r>
+          <w:rPr>
+            <w:webHidden/>
+          </w:rPr>
+          <w:tab/>
+        </w:r>
+        <w:r>
+          <w:rPr>
+            <w:webHidden/>
+          </w:rPr>
+          <w:fldChar w:fldCharType="begin"/>
+        </w:r>
+        <w:r>
+          <w:rPr>
+            <w:webHidden/>
+          </w:rPr>
+          <w:instrText xml:space="preserve"> PAGEREF _Toc176878711 \h </w:instrText>
+        </w:r>
+        <w:r>
+          <w:rPr>
+            <w:webHidden/>
+          </w:rPr>
+        </w:r>
+        <w:r>
+          <w:rPr>
+            <w:webHidden/>
+          </w:rPr>
+          <w:fldChar w:fldCharType="separate"/>
+        </w:r>
+        <w:r>
+          <w:rPr>
+            <w:b w:val="0"/>
+            <w:bCs w:val="0"/>
+            <w:webHidden/>
+          </w:rPr>
+          <w:t>Fehler! Textmarke nicht definiert.</w:t>
+        </w:r>
+        <w:r>
+          <w:rPr>
+            <w:webHidden/>
+          </w:rPr>
+          <w:fldChar w:fldCharType="end"/>
+        </w:r>
+      </w:hyperlink>
+    </w:p>
+    <w:p>
+      <w:pPr>
+        <w:pStyle w:val="Verzeichnis1"/>
+        <w:rPr>
+          <w:rFonts w:asciiTheme="minorHAnsi" w:eastAsiaTheme="minorEastAsia" w:hAnsiTheme="minorHAnsi" w:cstheme="minorBidi"/>
+          <w:b w:val="0"/>
+          <w:bCs w:val="0"/>
+          <w:kern w:val="2"/>
+          <w:sz w:val="24"/>
+          <w:szCs w:val="24"/>
+          <w:lang w:val="de-CH" w:eastAsia="de-CH"/>
+          <w14:ligatures w14:val="standardContextual"/>
+        </w:rPr>
+      </w:pPr>
+      <w:hyperlink w:anchor="_Toc176878712" w:history="1">
+        <w:r>
+          <w:rPr>
+            <w:rStyle w:val="Hyperlink"/>
+          </w:rPr>
+          <w:t>Position 2</w:t>
+        </w:r>
+        <w:r>
+          <w:rPr>
+            <w:rFonts w:asciiTheme="minorHAnsi" w:eastAsiaTheme="minorEastAsia" w:hAnsiTheme="minorHAnsi" w:cstheme="minorBidi"/>
+            <w:b w:val="0"/>
+            <w:bCs w:val="0"/>
+            <w:kern w:val="2"/>
+            <w:sz w:val="24"/>
+            <w:szCs w:val="24"/>
+            <w:lang w:val="de-CH" w:eastAsia="de-CH"/>
+            <w14:ligatures w14:val="standardContextual"/>
+          </w:rPr>
+          <w:tab/>
+        </w:r>
+        <w:r>
+          <w:rPr>
+            <w:rStyle w:val="Hyperlink"/>
+          </w:rPr>
+          <w:t>Montagehilfsmittel</w:t>
+        </w:r>
+        <w:r>
+          <w:rPr>
+            <w:webHidden/>
+          </w:rPr>
+          <w:tab/>
+        </w:r>
+        <w:r>
+          <w:rPr>
+            <w:webHidden/>
+          </w:rPr>
+          <w:fldChar w:fldCharType="begin"/>
+        </w:r>
+        <w:r>
+          <w:rPr>
+            <w:webHidden/>
+          </w:rPr>
+          <w:instrText xml:space="preserve"> PAGEREF _Toc176878712 \h </w:instrText>
+        </w:r>
+        <w:r>
+          <w:rPr>
+            <w:webHidden/>
+          </w:rPr>
+        </w:r>
+        <w:r>
+          <w:rPr>
+            <w:webHidden/>
+          </w:rPr>
+          <w:fldChar w:fldCharType="separate"/>
+        </w:r>
+        <w:r>
+          <w:rPr>
+            <w:webHidden/>
+          </w:rPr>
+          <w:t>8</w:t>
+        </w:r>
+        <w:r>
+          <w:rPr>
+            <w:webHidden/>
+          </w:rPr>
+          <w:fldChar w:fldCharType="end"/>
+        </w:r>
+      </w:hyperlink>
+    </w:p>
+    <w:p>
+      <w:pPr>
+        <w:pStyle w:val="Verzeichnis1"/>
+        <w:rPr>
+          <w:rFonts w:asciiTheme="minorHAnsi" w:eastAsiaTheme="minorEastAsia" w:hAnsiTheme="minorHAnsi" w:cstheme="minorBidi"/>
+          <w:b w:val="0"/>
+          <w:bCs w:val="0"/>
+          <w:kern w:val="2"/>
+          <w:sz w:val="24"/>
+          <w:szCs w:val="24"/>
+          <w:lang w:val="de-CH" w:eastAsia="de-CH"/>
+          <w14:ligatures w14:val="standardContextual"/>
+        </w:rPr>
+      </w:pPr>
+      <w:hyperlink w:anchor="_Toc176878713" w:history="1">
+        <w:r>
+          <w:rPr>
+            <w:rStyle w:val="Hyperlink"/>
+          </w:rPr>
+          <w:t>Zusammenfassung</w:t>
+        </w:r>
+        <w:r>
+          <w:rPr>
+            <w:webHidden/>
+          </w:rPr>
+          <w:tab/>
+        </w:r>
+        <w:r>
+          <w:rPr>
+            <w:webHidden/>
+          </w:rPr>
+          <w:fldChar w:fldCharType="begin"/>
+        </w:r>
+        <w:r>
+          <w:rPr>
+            <w:webHidden/>
+          </w:rPr>
+          <w:instrText xml:space="preserve"> PAGEREF _Toc176878713 \h </w:instrText>
+        </w:r>
+        <w:r>
+          <w:rPr>
+            <w:webHidden/>
+          </w:rPr>
+        </w:r>
+        <w:r>
+          <w:rPr>
+            <w:webHidden/>
+          </w:rPr>
+          <w:fldChar w:fldCharType="separate"/>
+        </w:r>
+        <w:r>
+          <w:rPr>
+            <w:webHidden/>
+          </w:rPr>
+          <w:t>13</w:t>
+        </w:r>
+        <w:r>
+          <w:rPr>
+            <w:webHidden/>
+          </w:rPr>
+          <w:fldChar w:fldCharType="end"/>
+        </w:r>
+      </w:hyperlink>
+    </w:p>
+    <w:p>
+      <w:pPr>
+        <w:pStyle w:val="Verzeichnis1"/>
+        <w:rPr>
+          <w:rFonts w:asciiTheme="minorHAnsi" w:eastAsiaTheme="minorEastAsia" w:hAnsiTheme="minorHAnsi" w:cstheme="minorBidi"/>
+          <w:b w:val="0"/>
+          <w:bCs w:val="0"/>
+          <w:kern w:val="2"/>
+          <w:sz w:val="24"/>
+          <w:szCs w:val="24"/>
+          <w:lang w:val="de-CH" w:eastAsia="de-CH"/>
+          <w14:ligatures w14:val="standardContextual"/>
+        </w:rPr>
+      </w:pPr>
+      <w:hyperlink w:anchor="_Toc176878714" w:history="1">
+        <w:r>
+          <w:rPr>
+            <w:rStyle w:val="Hyperlink"/>
+          </w:rPr>
+          <w:t>Verantwortlichkeitsmatrix</w:t>
+        </w:r>
+        <w:r>
+          <w:rPr>
+            <w:webHidden/>
+          </w:rPr>
+          <w:tab/>
+        </w:r>
+        <w:r>
+          <w:rPr>
+            <w:webHidden/>
+          </w:rPr>
+          <w:fldChar w:fldCharType="begin"/>
+        </w:r>
+        <w:r>
+          <w:rPr>
+            <w:webHidden/>
+          </w:rPr>
+          <w:instrText xml:space="preserve"> PAGEREF _Toc176878714 \h </w:instrText>
+        </w:r>
+        <w:r>
+          <w:rPr>
+            <w:webHidden/>
+          </w:rPr>
+        </w:r>
+        <w:r>
+          <w:rPr>
+            <w:webHidden/>
+          </w:rPr>
+          <w:fldChar w:fldCharType="separate"/>
+        </w:r>
+        <w:r>
+          <w:rPr>
+            <w:webHidden/>
+          </w:rPr>
+          <w:t>14</w:t>
+        </w:r>
+        <w:r>
+          <w:rPr>
+            <w:webHidden/>
+          </w:rPr>
+          <w:fldChar w:fldCharType="end"/>
+        </w:r>
+      </w:hyperlink>
+    </w:p>
+    <w:p>
+      <w:pPr>
+        <w:pStyle w:val="Verzeichnis1"/>
+        <w:rPr>
+          <w:rFonts w:asciiTheme="minorHAnsi" w:eastAsiaTheme="minorEastAsia" w:hAnsiTheme="minorHAnsi" w:cstheme="minorBidi"/>
+          <w:b w:val="0"/>
+          <w:bCs w:val="0"/>
+          <w:kern w:val="2"/>
+          <w:sz w:val="24"/>
+          <w:szCs w:val="24"/>
+          <w:lang w:val="de-CH" w:eastAsia="de-CH"/>
+          <w14:ligatures w14:val="standardContextual"/>
+        </w:rPr>
+      </w:pPr>
+      <w:hyperlink w:anchor="_Toc176878715" w:history="1">
+        <w:r>
+          <w:rPr>
+            <w:rStyle w:val="Hyperlink"/>
+          </w:rPr>
+          <w:t>Lieferung &amp; Montage</w:t>
+        </w:r>
+        <w:r>
+          <w:rPr>
+            <w:webHidden/>
+          </w:rPr>
+          <w:tab/>
+        </w:r>
+        <w:r>
+          <w:rPr>
+            <w:webHidden/>
+          </w:rPr>
+          <w:fldChar w:fldCharType="begin"/>
+        </w:r>
+        <w:r>
+          <w:rPr>
+            <w:webHidden/>
+          </w:rPr>
+          <w:instrText xml:space="preserve"> PAGEREF _Toc176878715 \h </w:instrText>
+        </w:r>
+        <w:r>
+          <w:rPr>
+            <w:webHidden/>
+          </w:rPr>
+        </w:r>
+        <w:r>
+          <w:rPr>
+            <w:webHidden/>
+          </w:rPr>
+          <w:fldChar w:fldCharType="separate"/>
+        </w:r>
+        <w:r>
+          <w:rPr>
+            <w:webHidden/>
+          </w:rPr>
+          <w:t>15</w:t>
+        </w:r>
+        <w:r>
+          <w:rPr>
+            <w:webHidden/>
+          </w:rPr>
+          <w:fldChar w:fldCharType="end"/>
+        </w:r>
+      </w:hyperlink>
+    </w:p>
+    <w:p>
+      <w:pPr>
+        <w:pStyle w:val="Verzeichnis1"/>
+        <w:rPr>
+          <w:rFonts w:asciiTheme="minorHAnsi" w:eastAsiaTheme="minorEastAsia" w:hAnsiTheme="minorHAnsi" w:cstheme="minorBidi"/>
+          <w:b w:val="0"/>
+          <w:bCs w:val="0"/>
+          <w:kern w:val="2"/>
+          <w:sz w:val="24"/>
+          <w:szCs w:val="24"/>
+          <w:lang w:val="de-CH" w:eastAsia="de-CH"/>
+          <w14:ligatures w14:val="standardContextual"/>
+        </w:rPr>
+      </w:pPr>
+      <w:hyperlink w:anchor="_Toc176878716" w:history="1">
+        <w:r>
+          <w:rPr>
+            <w:rStyle w:val="Hyperlink"/>
+          </w:rPr>
+          <w:t>Technische Details</w:t>
+        </w:r>
+        <w:r>
+          <w:rPr>
+            <w:webHidden/>
+          </w:rPr>
+          <w:tab/>
+        </w:r>
+        <w:r>
+          <w:rPr>
+            <w:webHidden/>
+          </w:rPr>
+          <w:fldChar w:fldCharType="begin"/>
+        </w:r>
+        <w:r>
+          <w:rPr>
+            <w:webHidden/>
+          </w:rPr>
+          <w:instrText xml:space="preserve"> PAGEREF _Toc176878716 \h </w:instrText>
+        </w:r>
+        <w:r>
+          <w:rPr>
+            <w:webHidden/>
+          </w:rPr>
+        </w:r>
+        <w:r>
+          <w:rPr>
+            <w:webHidden/>
+          </w:rPr>
+          <w:fldChar w:fldCharType="separate"/>
+        </w:r>
+        <w:r>
+          <w:rPr>
+            <w:webHidden/>
+          </w:rPr>
+          <w:t>16</w:t>
+        </w:r>
+        <w:r>
+          <w:rPr>
+            <w:webHidden/>
+          </w:rPr>
+          <w:fldChar w:fldCharType="end"/>
+        </w:r>
+      </w:hyperlink>
+    </w:p>
+    <w:p>
+      <w:pPr>
+        <w:pStyle w:val="Verzeichnis1"/>
+        <w:rPr>
+          <w:rFonts w:asciiTheme="minorHAnsi" w:eastAsiaTheme="minorEastAsia" w:hAnsiTheme="minorHAnsi" w:cstheme="minorBidi"/>
+          <w:b w:val="0"/>
+          <w:bCs w:val="0"/>
+          <w:kern w:val="2"/>
+          <w:sz w:val="24"/>
+          <w:szCs w:val="24"/>
+          <w:lang w:val="de-CH" w:eastAsia="de-CH"/>
+          <w14:ligatures w14:val="standardContextual"/>
+        </w:rPr>
+      </w:pPr>
+      <w:hyperlink w:anchor="_Toc176878717" w:history="1">
+        <w:r>
+          <w:rPr>
+            <w:rStyle w:val="Hyperlink"/>
+          </w:rPr>
+          <w:t>Kaufmännische Bedingungen für Geschäfte in der Schweiz</w:t>
+        </w:r>
+        <w:r>
+          <w:rPr>
+            <w:webHidden/>
+          </w:rPr>
+          <w:tab/>
+        </w:r>
+        <w:r>
+          <w:rPr>
+            <w:webHidden/>
+          </w:rPr>
+          <w:fldChar w:fldCharType="begin"/>
+        </w:r>
+        <w:r>
+          <w:rPr>
+            <w:webHidden/>
+          </w:rPr>
+          <w:instrText xml:space="preserve"> PAGEREF _Toc176878717 \h </w:instrText>
+        </w:r>
+        <w:r>
+          <w:rPr>
+            <w:webHidden/>
+          </w:rPr>
+        </w:r>
+        <w:r>
+          <w:rPr>
+            <w:webHidden/>
+          </w:rPr>
+          <w:fldChar w:fldCharType="separate"/>
+        </w:r>
+        <w:r>
+          <w:rPr>
+            <w:webHidden/>
+          </w:rPr>
+          <w:t>18</w:t>
+        </w:r>
+        <w:r>
+          <w:rPr>
+            <w:webHidden/>
+          </w:rPr>
+          <w:fldChar w:fldCharType="end"/>
+        </w:r>
+      </w:hyperlink>
+    </w:p>
+    <w:p>
+      <w:pPr>
         <w:rPr>
           <w:b/>
-          <w:sz w:val="24"/>
-        </w:rPr>
-        <w:t xml:space="preserve">Konfiguration</w:t>
-      </w:r>
-    </w:p>
-    <w:p>
-      <w:pPr>
-        <w:spacing w:after="80"/>
-      </w:pPr>
-      <w:r>
-        <w:rPr>
-          <w:sz w:val="20"/>
-        </w:rPr>
-        <w:t xml:space="preserve">{{konfiguration}}</w:t>
-      </w:r>
-    </w:p>
-    <w:p>
-      <w:pPr>
-        <w:spacing w:after="80"/>
+          <w:bCs/>
+          <w:lang w:val="de-DE" w:eastAsia="de-DE"/>
+        </w:rPr>
       </w:pPr>
       <w:r>
         <w:rPr>
           <w:b/>
-          <w:sz w:val="24"/>
-        </w:rPr>
-        <w:t xml:space="preserve">Optionen</w:t>
-      </w:r>
-    </w:p>
-    <w:p>
-      <w:pPr>
-        <w:spacing w:after="80"/>
-      </w:pPr>
-      <w:r>
-        <w:rPr>
-          <w:sz w:val="20"/>
-        </w:rPr>
-        <w:t xml:space="preserve">{{optionen_text}}</w:t>
-      </w:r>
-    </w:p>
-    <w:p>
-      <w:pPr>
-        <w:spacing w:after="80"/>
-      </w:pPr>
-      <w:r>
+          <w:bCs/>
+          <w:lang w:val="de-DE" w:eastAsia="de-DE"/>
+        </w:rPr>
+        <w:fldChar w:fldCharType="end"/>
+      </w:r>
+    </w:p>
+    <w:p>
+      <w:pPr>
         <w:rPr>
           <w:b/>
-          <w:sz w:val="24"/>
-        </w:rPr>
-        <w:t xml:space="preserve">1. Leistungsumfang &amp; Preise</w:t>
-      </w:r>
-    </w:p>
-    <w:p>
-      <w:pPr>
-        <w:spacing w:after="80"/>
-      </w:pPr>
-      <w:r>
-        <w:rPr>
-          <w:sz w:val="20"/>
-        </w:rPr>
-        <w:t xml:space="preserve">{{leistungsumfang_text}}</w:t>
-      </w:r>
-    </w:p>
-    <w:p>
-      <w:pPr>
-        <w:spacing w:after="80"/>
-      </w:pPr>
-      <w:r>
-        <w:rPr>
-          <w:sz w:val="20"/>
-        </w:rPr>
-        <w:t xml:space="preserve">Softwarelizenzen: {{lizenz_total_chf}}</w:t>
-      </w:r>
-    </w:p>
-    <w:p>
-      <w:pPr>
-        <w:spacing w:after="80"/>
-      </w:pPr>
-      <w:r>
-        <w:rPr>
-          <w:sz w:val="20"/>
-        </w:rPr>
-        <w:t xml:space="preserve">IT-Aufwand / Installation: {{it_total_chf}}</w:t>
-      </w:r>
-    </w:p>
-    <w:p>
-      <w:pPr>
-        <w:spacing w:after="80"/>
-      </w:pPr>
-      <w:r>
-        <w:rPr>
-          <w:b/>
-          <w:sz w:val="22"/>
-        </w:rPr>
-        <w:t xml:space="preserve">Gesamttotal: {{gesamt_chf}}</w:t>
-      </w:r>
-    </w:p>
-    <w:p>
-      <w:pPr>
-        <w:spacing w:after="80"/>
-      </w:pPr>
-      <w:r>
-        <w:rPr>
-          <w:sz w:val="18"/>
-        </w:rPr>
-        <w:t xml:space="preserve">{{preis_hinweis}}</w:t>
-      </w:r>
-    </w:p>
-    <w:p>
-      <w:pPr>
-        <w:spacing w:after="80"/>
-      </w:pPr>
-      <w:r>
-        <w:rPr>
-          <w:sz w:val="18"/>
-        </w:rPr>
-        <w:t xml:space="preserve">{{meta_zeile}}</w:t>
-      </w:r>
+          <w:bCs/>
+          <w:sz w:val="16"/>
+          <w:szCs w:val="16"/>
+          <w:lang w:val="de-DE" w:eastAsia="de-DE"/>
+        </w:rPr>
+      </w:pPr>
     </w:p>
     <w:p>
       <w:pPr>
@@ -1367,18 +1772,514 @@
         <w:br w:type="page"/>
       </w:r>
     </w:p>
-    <w:p>
-      <w:pPr>
-        <w:spacing w:after="120"/>
-      </w:pPr>
-      <w:r>
-        <w:rPr>
-          <w:sz w:val="22"/>
-          <w:szCs w:val="22"/>
-        </w:rPr>
-        <w:t xml:space="preserve"/>
-      </w:r>
-    </w:p>
+    <w:tbl>
+      <w:tblPr>
+        <w:tblStyle w:val="05Tabellenvorlage"/>
+        <w:tblpPr w:leftFromText="141" w:rightFromText="141" w:vertAnchor="text" w:tblpY="1"/>
+        <w:tblW w:w="9786" w:type="dxa"/>
+        <w:tblLayout w:type="fixed"/>
+        <w:tblLook w:val="0620" w:firstRow="1" w:lastRow="0" w:firstColumn="0" w:lastColumn="0" w:noHBand="1" w:noVBand="1"/>
+      </w:tblPr>
+      <w:tblGrid>
+        <w:gridCol w:w="5670"/>
+        <w:gridCol w:w="993"/>
+        <w:gridCol w:w="992"/>
+        <w:gridCol w:w="2131"/>
+      </w:tblGrid>
+      <w:tr>
+        <w:trPr>
+          <w:cnfStyle w:val="100000000000" w:firstRow="1" w:lastRow="0" w:firstColumn="0" w:lastColumn="0" w:oddVBand="0" w:evenVBand="0" w:oddHBand="0" w:evenHBand="0" w:firstRowFirstColumn="0" w:firstRowLastColumn="0" w:lastRowFirstColumn="0" w:lastRowLastColumn="0"/>
+          <w:trHeight w:val="567"/>
+        </w:trPr>
+        <w:tc>
+          <w:tcPr>
+            <w:tcW w:w="9786" w:type="dxa"/>
+            <w:gridSpan w:val="4"/>
+            <w:tcBorders>
+              <w:top w:val="none" w:sz="0" w:space="0" w:color="auto"/>
+              <w:left w:val="none" w:sz="0" w:space="0" w:color="auto"/>
+              <w:bottom w:val="none" w:sz="0" w:space="0" w:color="auto"/>
+              <w:right w:val="none" w:sz="0" w:space="0" w:color="auto"/>
+            </w:tcBorders>
+            <w:shd w:val="clear" w:color="auto" w:fill="FFED00"/>
+          </w:tcPr>
+          <w:p>
+            <w:pPr>
+              <w:pStyle w:val="berschrift2"/>
+              <w:tabs>
+                <w:tab w:val="left" w:pos="1456"/>
+              </w:tabs>
+              <w:rPr>
+                <w:b/>
+              </w:rPr>
+            </w:pPr>
+            <w:r>
+              <w:rPr>
+                <w:rFonts w:ascii="Calibri" w:eastAsia="Calibri" w:hAnsi="Calibri"/>
+                <w:b/>
+                <w:color w:val="0B1F3A"/>
+                <w:sz w:val="28"/>
+              </w:rPr>
+              <w:lastRenderedPageBreak/>
+              <w:t>Einleitung</w:t>
+            </w:r>
+          </w:p>
+        </w:tc>
+      </w:tr>
+      <w:tr>
+        <w:trPr>
+          <w:trHeight w:val="57"/>
+        </w:trPr>
+        <w:tc>
+          <w:tcPr>
+            <w:tcW w:w="9786" w:type="dxa"/>
+            <w:gridSpan w:val="4"/>
+          </w:tcPr>
+          <w:p>
+            <w:pPr>
+              <w:pStyle w:val="ANGEBOTDEUTSCH"/>
+              <w:rPr>
+                <w:szCs w:val="20"/>
+              </w:rPr>
+            </w:pPr>
+            <w:r>
+              <w:rPr>
+                <w:szCs w:val="20"/>
+              </w:rPr>
+              <w:t>{{</w:t>
+            </w:r>
+            <w:proofErr w:type="spellStart"/>
+            <w:r>
+              <w:rPr>
+                <w:szCs w:val="20"/>
+              </w:rPr>
+              <w:t>einleitung</w:t>
+            </w:r>
+            <w:proofErr w:type="spellEnd"/>
+            <w:r>
+              <w:rPr>
+                <w:szCs w:val="20"/>
+              </w:rPr>
+              <w:t>}}</w:t>
+            </w:r>
+          </w:p>
+          <w:p>
+            <w:pPr>
+              <w:pStyle w:val="ANGEBOTDEUTSCH"/>
+              <w:rPr>
+                <w:szCs w:val="20"/>
+              </w:rPr>
+            </w:pPr>
+          </w:p>
+          <w:p>
+            <w:pPr>
+              <w:pStyle w:val="ANGEBOTDEUTSCH"/>
+              <w:jc w:val="center"/>
+              <w:rPr>
+                <w:szCs w:val="20"/>
+              </w:rPr>
+            </w:pPr>
+            <w:r>
+              <w:rPr>
+                <w:rFonts w:cs="Arial"/>
+                <w:noProof/>
+                <w:lang w:val="de-AT"/>
+              </w:rPr>
+              <w:drawing>
+                <wp:inline distT="0" distB="0" distL="0" distR="0" wp14:anchorId="3A128B04" wp14:editId="746BEBD8">
+                  <wp:extent cx="1932936" cy="2564839"/>
+                  <wp:effectExtent l="0" t="0" r="0" b="6985"/>
+                  <wp:docPr id="907587233" name="Grafik 907587233"/>
+                  <wp:cNvGraphicFramePr>
+                    <a:graphicFrameLocks xmlns:a="http://schemas.openxmlformats.org/drawingml/2006/main" noChangeAspect="1"/>
+                  </wp:cNvGraphicFramePr>
+                  <a:graphic xmlns:a="http://schemas.openxmlformats.org/drawingml/2006/main">
+                    <a:graphicData uri="http://schemas.openxmlformats.org/drawingml/2006/picture">
+                      <pic:pic xmlns:pic="http://schemas.openxmlformats.org/drawingml/2006/picture">
+                        <pic:nvPicPr>
+                          <pic:cNvPr id="0" name="Picture 2"/>
+                          <pic:cNvPicPr>
+                            <a:picLocks noChangeAspect="1" noChangeArrowheads="1"/>
+                          </pic:cNvPicPr>
+                        </pic:nvPicPr>
+                        <pic:blipFill>
+                          <a:blip r:embed="rId15">
+                            <a:extLst>
+                              <a:ext uri="{28A0092B-C50C-407E-A947-70E740481C1C}">
+                                <a14:useLocalDpi xmlns:a14="http://schemas.microsoft.com/office/drawing/2010/main" val="0"/>
+                              </a:ext>
+                            </a:extLst>
+                          </a:blip>
+                          <a:srcRect/>
+                          <a:stretch>
+                            <a:fillRect/>
+                          </a:stretch>
+                        </pic:blipFill>
+                        <pic:spPr bwMode="auto">
+                          <a:xfrm>
+                            <a:off x="0" y="0"/>
+                            <a:ext cx="1937404" cy="2570768"/>
+                          </a:xfrm>
+                          <a:prstGeom prst="rect">
+                            <a:avLst/>
+                          </a:prstGeom>
+                          <a:noFill/>
+                          <a:ln>
+                            <a:noFill/>
+                          </a:ln>
+                        </pic:spPr>
+                      </pic:pic>
+                    </a:graphicData>
+                  </a:graphic>
+                </wp:inline>
+              </w:drawing>
+            </w:r>
+          </w:p>
+          <w:p>
+            <w:pPr>
+              <w:pStyle w:val="ANGEBOTDEUTSCH"/>
+              <w:jc w:val="center"/>
+              <w:rPr>
+                <w:szCs w:val="20"/>
+              </w:rPr>
+            </w:pPr>
+          </w:p>
+          <w:p>
+            <w:pPr>
+              <w:pStyle w:val="ANGEBOTDEUTSCH"/>
+              <w:rPr>
+                <w:szCs w:val="20"/>
+              </w:rPr>
+            </w:pPr>
+          </w:p>
+          <w:p>
+            <w:pPr>
+              <w:pStyle w:val="ANGEBOTDEUTSCH"/>
+              <w:rPr>
+                <w:szCs w:val="20"/>
+                <w:lang w:val="de-CH"/>
+              </w:rPr>
+            </w:pPr>
+            <w:r>
+              <w:rPr>
+                <w:szCs w:val="20"/>
+                <w:lang w:val="de-CH"/>
+              </w:rPr>
+              <w:t>{{</w:t>
+            </w:r>
+            <w:proofErr w:type="spellStart"/>
+            <w:r>
+              <w:rPr>
+                <w:szCs w:val="20"/>
+                <w:lang w:val="de-CH"/>
+              </w:rPr>
+              <w:t>konfiguration</w:t>
+            </w:r>
+            <w:proofErr w:type="spellEnd"/>
+            <w:r>
+              <w:rPr>
+                <w:szCs w:val="20"/>
+                <w:lang w:val="de-CH"/>
+              </w:rPr>
+              <w:t>}}</w:t>
+            </w:r>
+          </w:p>
+          <w:p>
+            <w:pPr>
+              <w:pStyle w:val="ANGEBOTDEUTSCH"/>
+              <w:rPr>
+                <w:szCs w:val="20"/>
+                <w:lang w:val="de-CH"/>
+              </w:rPr>
+            </w:pPr>
+          </w:p>
+          <w:p>
+            <w:pPr>
+              <w:pStyle w:val="ANGEBOTDEUTSCH"/>
+              <w:rPr>
+                <w:szCs w:val="20"/>
+                <w:lang w:val="de-CH"/>
+              </w:rPr>
+            </w:pPr>
+          </w:p>
+          <w:p>
+            <w:pPr>
+              <w:pStyle w:val="ANGEBOTDEUTSCH"/>
+              <w:rPr>
+                <w:szCs w:val="20"/>
+                <w:lang w:val="de-CH"/>
+              </w:rPr>
+            </w:pPr>
+            <w:r>
+              <w:rPr>
+                <w:szCs w:val="20"/>
+                <w:lang w:val="de-CH"/>
+              </w:rPr>
+              <w:t>{{</w:t>
+            </w:r>
+            <w:proofErr w:type="spellStart"/>
+            <w:r>
+              <w:rPr>
+                <w:szCs w:val="20"/>
+                <w:lang w:val="de-CH"/>
+              </w:rPr>
+              <w:t>leistungsumfang_text</w:t>
+            </w:r>
+            <w:proofErr w:type="spellEnd"/>
+            <w:r>
+              <w:rPr>
+                <w:szCs w:val="20"/>
+                <w:lang w:val="de-CH"/>
+              </w:rPr>
+              <w:t>}}</w:t>
+            </w:r>
+          </w:p>
+          <w:p>
+            <w:pPr>
+              <w:pStyle w:val="ANGEBOTDEUTSCH"/>
+              <w:rPr>
+                <w:szCs w:val="20"/>
+                <w:lang w:val="de-CH"/>
+              </w:rPr>
+            </w:pPr>
+          </w:p>
+          <w:p>
+            <w:pPr>
+              <w:pStyle w:val="ANGEBOTDEUTSCH"/>
+              <w:rPr>
+                <w:szCs w:val="20"/>
+                <w:lang w:val="de-CH"/>
+              </w:rPr>
+            </w:pPr>
+          </w:p>
+          <w:p>
+            <w:pPr>
+              <w:pStyle w:val="ANGEBOTDEUTSCH"/>
+              <w:rPr>
+                <w:szCs w:val="20"/>
+                <w:lang w:val="de-CH"/>
+              </w:rPr>
+            </w:pPr>
+          </w:p>
+          <w:p>
+            <w:pPr>
+              <w:pStyle w:val="ANGEBOTDEUTSCH"/>
+              <w:rPr>
+                <w:szCs w:val="20"/>
+                <w:lang w:val="de-CH"/>
+              </w:rPr>
+            </w:pPr>
+            <w:r>
+              <w:rPr>
+                <w:szCs w:val="20"/>
+                <w:lang w:val="de-CH"/>
+              </w:rPr>
+              <w:t>{{</w:t>
+            </w:r>
+            <w:proofErr w:type="spellStart"/>
+            <w:r>
+              <w:rPr>
+                <w:szCs w:val="20"/>
+                <w:lang w:val="de-CH"/>
+              </w:rPr>
+              <w:t>optionen_text</w:t>
+            </w:r>
+            <w:proofErr w:type="spellEnd"/>
+            <w:r>
+              <w:rPr>
+                <w:szCs w:val="20"/>
+                <w:lang w:val="de-CH"/>
+              </w:rPr>
+              <w:t>}}</w:t>
+            </w:r>
+          </w:p>
+          <w:p>
+            <w:pPr>
+              <w:pStyle w:val="ANGEBOTDEUTSCH"/>
+              <w:rPr>
+                <w:szCs w:val="20"/>
+              </w:rPr>
+            </w:pPr>
+          </w:p>
+        </w:tc>
+      </w:tr>
+      <w:tr>
+        <w:trPr>
+          <w:trHeight w:val="284"/>
+        </w:trPr>
+        <w:tc>
+          <w:tcPr>
+            <w:tcW w:w="5670" w:type="dxa"/>
+            <w:shd w:val="clear" w:color="auto" w:fill="FFED00"/>
+          </w:tcPr>
+          <w:p>
+            <w:pPr>
+              <w:pStyle w:val="ANGEBOTDEUTSCH"/>
+              <w:spacing w:before="40" w:after="40"/>
+              <w:rPr>
+                <w:b/>
+                <w:bCs/>
+              </w:rPr>
+            </w:pPr>
+            <w:bookmarkStart w:id="0" w:name="_Hlk116973797"/>
+            <w:r>
+              <w:rPr>
+                <w:bCs/>
+              </w:rPr>
+              <w:t xml:space="preserve">Materialbedarf: </w:t>
+            </w:r>
+          </w:p>
+        </w:tc>
+        <w:tc>
+          <w:tcPr>
+            <w:tcW w:w="993" w:type="dxa"/>
+            <w:shd w:val="clear" w:color="auto" w:fill="FFED00"/>
+          </w:tcPr>
+          <w:p>
+            <w:pPr>
+              <w:spacing w:before="40" w:after="40"/>
+              <w:rPr>
+                <w:b/>
+                <w:bCs/>
+                <w:lang w:val="de-DE"/>
+              </w:rPr>
+            </w:pPr>
+            <w:r>
+              <w:rPr>
+                <w:bCs/>
+                <w:lang w:val="de-DE"/>
+              </w:rPr>
+              <w:t>Menge</w:t>
+            </w:r>
+          </w:p>
+        </w:tc>
+        <w:tc>
+          <w:tcPr>
+            <w:tcW w:w="992" w:type="dxa"/>
+            <w:shd w:val="clear" w:color="auto" w:fill="FFED00"/>
+          </w:tcPr>
+          <w:p>
+            <w:pPr>
+              <w:spacing w:before="40" w:after="40"/>
+              <w:ind w:left="-242" w:right="-252"/>
+              <w:jc w:val="center"/>
+              <w:rPr>
+                <w:b/>
+                <w:bCs/>
+                <w:lang w:val="de-DE"/>
+              </w:rPr>
+            </w:pPr>
+            <w:r>
+              <w:rPr>
+                <w:bCs/>
+                <w:lang w:val="de-DE"/>
+              </w:rPr>
+              <w:t xml:space="preserve">Preis </w:t>
+            </w:r>
+            <w:r>
+              <w:rPr>
+                <w:bCs/>
+                <w:lang w:val="de-DE"/>
+              </w:rPr>
+              <w:t xml:space="preserve">/ </w:t>
+            </w:r>
+            <w:r>
+              <w:rPr>
+                <w:bCs/>
+                <w:lang w:val="de-DE"/>
+              </w:rPr>
+              <w:t>Stk</w:t>
+            </w:r>
+            <w:r>
+              <w:rPr>
+                <w:bCs/>
+                <w:lang w:val="de-DE"/>
+              </w:rPr>
+              <w:t>.</w:t>
+            </w:r>
+          </w:p>
+        </w:tc>
+        <w:tc>
+          <w:tcPr>
+            <w:tcW w:w="2131" w:type="dxa"/>
+            <w:shd w:val="clear" w:color="auto" w:fill="FFED00"/>
+          </w:tcPr>
+          <w:p>
+            <w:pPr>
+              <w:spacing w:before="40" w:after="40"/>
+              <w:jc w:val="right"/>
+              <w:rPr>
+                <w:b/>
+                <w:bCs/>
+                <w:lang w:val="de-DE"/>
+              </w:rPr>
+            </w:pPr>
+            <w:r>
+              <w:rPr>
+                <w:bCs/>
+                <w:lang w:val="de-DE"/>
+              </w:rPr>
+              <w:t>Total</w:t>
+            </w:r>
+          </w:p>
+        </w:tc>
+      </w:tr>
+      <w:bookmarkEnd w:id="0"/>
+      <w:tr>
+        <w:tc>
+          <w:tcPr>
+            <w:tcW w:w="5670" w:type="dxa"/>
+          </w:tcPr>
+          <w:p>
+            <w:pPr>
+              <w:pStyle w:val="ANGEBOTDEUTSCH"/>
+              <w:rPr>
+                <w:u w:val="single"/>
+              </w:rPr>
+            </w:pPr>
+          </w:p>
+        </w:tc>
+        <w:tc>
+          <w:tcPr>
+            <w:tcW w:w="993" w:type="dxa"/>
+          </w:tcPr>
+          <w:p>
+            <w:pPr>
+              <w:jc w:val="right"/>
+              <w:rPr>
+                <w:lang w:val="de-DE"/>
+              </w:rPr>
+            </w:pPr>
+          </w:p>
+        </w:tc>
+        <w:tc>
+          <w:tcPr>
+            <w:tcW w:w="992" w:type="dxa"/>
+          </w:tcPr>
+          <w:p>
+            <w:pPr>
+              <w:jc w:val="right"/>
+              <w:rPr>
+                <w:lang w:val="de-DE"/>
+              </w:rPr>
+            </w:pPr>
+          </w:p>
+        </w:tc>
+        <w:tc>
+          <w:tcPr>
+            <w:tcW w:w="2131" w:type="dxa"/>
+          </w:tcPr>
+          <w:p>
+            <w:pPr>
+              <w:jc w:val="right"/>
+              <w:rPr>
+                <w:lang w:val="de-DE"/>
+              </w:rPr>
+            </w:pPr>
+          </w:p>
+        </w:tc>
+      </w:tr>
+    </w:tbl>
     <w:p/>
     <w:p/>
     <w:p/>
@@ -1389,6 +2290,327 @@
     <w:p/>
     <w:p/>
     <w:p/>
+    <w:tbl>
+      <w:tblPr>
+        <w:tblStyle w:val="05Tabellenvorlage"/>
+        <w:tblpPr w:leftFromText="141" w:rightFromText="141" w:vertAnchor="text" w:tblpY="1"/>
+        <w:tblW w:w="9786" w:type="dxa"/>
+        <w:tblLayout w:type="fixed"/>
+        <w:tblLook w:val="0620" w:firstRow="1" w:lastRow="0" w:firstColumn="0" w:lastColumn="0" w:noHBand="1" w:noVBand="1"/>
+      </w:tblPr>
+      <w:tblGrid>
+        <w:gridCol w:w="4820"/>
+        <w:gridCol w:w="1843"/>
+        <w:gridCol w:w="1135"/>
+        <w:gridCol w:w="1956"/>
+        <w:gridCol w:w="32"/>
+      </w:tblGrid>
+      <w:tr>
+        <w:trPr>
+          <w:cnfStyle w:val="100000000000" w:firstRow="1" w:lastRow="0" w:firstColumn="0" w:lastColumn="0" w:oddVBand="0" w:evenVBand="0" w:oddHBand="0" w:evenHBand="0" w:firstRowFirstColumn="0" w:firstRowLastColumn="0" w:lastRowFirstColumn="0" w:lastRowLastColumn="0"/>
+          <w:trHeight w:val="567"/>
+        </w:trPr>
+        <w:tc>
+          <w:tcPr>
+            <w:tcW w:w="9786" w:type="dxa"/>
+            <w:gridSpan w:val="5"/>
+            <w:tcBorders>
+              <w:top w:val="none" w:sz="0" w:space="0" w:color="auto"/>
+              <w:left w:val="none" w:sz="0" w:space="0" w:color="auto"/>
+              <w:bottom w:val="none" w:sz="0" w:space="0" w:color="auto"/>
+              <w:right w:val="none" w:sz="0" w:space="0" w:color="auto"/>
+            </w:tcBorders>
+            <w:shd w:val="clear" w:color="auto" w:fill="FFED00"/>
+          </w:tcPr>
+          <w:p>
+            <w:pPr>
+              <w:pStyle w:val="berschrift2"/>
+              <w:tabs>
+                <w:tab w:val="left" w:pos="1456"/>
+              </w:tabs>
+              <w:rPr>
+                <w:b/>
+              </w:rPr>
+            </w:pPr>
+            <w:r>
+              <w:rPr>
+                <w:b/>
+              </w:rPr>
+              <w:t>Optionen</w:t>
+            </w:r>
+          </w:p>
+        </w:tc>
+      </w:tr>
+      <w:tr>
+        <w:trPr>
+          <w:gridAfter w:val="1"/>
+          <w:wAfter w:w="32" w:type="dxa"/>
+        </w:trPr>
+        <w:tc>
+          <w:tcPr>
+            <w:tcW w:w="4820" w:type="dxa"/>
+          </w:tcPr>
+          <w:p>
+            <w:pPr>
+              <w:pStyle w:val="ANGEBOTDEUTSCH"/>
+              <w:spacing w:after="20" w:line="216" w:lineRule="auto"/>
+              <w:ind w:right="-109"/>
+              <w:rPr>
+                <w:rFonts w:cs="Arial"/>
+                <w:b/>
+                <w:szCs w:val="20"/>
+                <w:highlight w:val="yellow"/>
+                <w:lang w:val="de-CH"/>
+              </w:rPr>
+            </w:pPr>
+            <w:r>
+              <w:rPr>
+                <w:rFonts w:cs="Arial"/>
+                <w:b/>
+                <w:szCs w:val="20"/>
+                <w:lang w:val="de-CH"/>
+              </w:rPr>
+              <w:t>{{</w:t>
+            </w:r>
+            <w:proofErr w:type="spellStart"/>
+            <w:r>
+              <w:rPr>
+                <w:rFonts w:cs="Arial"/>
+                <w:b/>
+                <w:szCs w:val="20"/>
+                <w:lang w:val="de-CH"/>
+              </w:rPr>
+              <w:t>optionen_text</w:t>
+            </w:r>
+            <w:proofErr w:type="spellEnd"/>
+            <w:r>
+              <w:rPr>
+                <w:rFonts w:cs="Arial"/>
+                <w:b/>
+                <w:szCs w:val="20"/>
+                <w:lang w:val="de-CH"/>
+              </w:rPr>
+              <w:t>}}</w:t>
+            </w:r>
+          </w:p>
+        </w:tc>
+        <w:tc>
+          <w:tcPr>
+            <w:tcW w:w="1843" w:type="dxa"/>
+          </w:tcPr>
+          <w:p>
+            <w:pPr>
+              <w:spacing w:after="20" w:line="216" w:lineRule="auto"/>
+              <w:ind w:left="-110"/>
+              <w:jc w:val="right"/>
+              <w:rPr>
+                <w:rFonts w:cs="Arial"/>
+                <w:b/>
+                <w:bCs/>
+                <w:szCs w:val="20"/>
+              </w:rPr>
+            </w:pPr>
+          </w:p>
+        </w:tc>
+        <w:tc>
+          <w:tcPr>
+            <w:tcW w:w="1135" w:type="dxa"/>
+          </w:tcPr>
+          <w:p>
+            <w:pPr>
+              <w:spacing w:after="20" w:line="216" w:lineRule="auto"/>
+              <w:jc w:val="right"/>
+              <w:rPr>
+                <w:rFonts w:cs="Arial"/>
+                <w:b/>
+                <w:bCs/>
+                <w:noProof/>
+                <w:szCs w:val="20"/>
+                <w:highlight w:val="yellow"/>
+              </w:rPr>
+            </w:pPr>
+          </w:p>
+        </w:tc>
+        <w:tc>
+          <w:tcPr>
+            <w:tcW w:w="1956" w:type="dxa"/>
+          </w:tcPr>
+          <w:p>
+            <w:pPr>
+              <w:spacing w:after="20" w:line="216" w:lineRule="auto"/>
+              <w:rPr>
+                <w:rFonts w:cs="Arial"/>
+                <w:b/>
+                <w:bCs/>
+                <w:szCs w:val="20"/>
+              </w:rPr>
+            </w:pPr>
+          </w:p>
+        </w:tc>
+      </w:tr>
+      <w:tr>
+        <w:trPr>
+          <w:gridAfter w:val="1"/>
+          <w:wAfter w:w="32" w:type="dxa"/>
+        </w:trPr>
+        <w:tc>
+          <w:tcPr>
+            <w:tcW w:w="4820" w:type="dxa"/>
+          </w:tcPr>
+          <w:p>
+            <w:pPr>
+              <w:pStyle w:val="ANGEBOTDEUTSCH"/>
+              <w:spacing w:after="20" w:line="216" w:lineRule="auto"/>
+              <w:ind w:right="-109"/>
+              <w:rPr>
+                <w:rFonts w:cs="Arial"/>
+                <w:szCs w:val="20"/>
+                <w:highlight w:val="yellow"/>
+                <w:lang w:val="de-CH"/>
+              </w:rPr>
+            </w:pPr>
+          </w:p>
+        </w:tc>
+        <w:tc>
+          <w:tcPr>
+            <w:tcW w:w="1843" w:type="dxa"/>
+          </w:tcPr>
+          <w:p>
+            <w:pPr>
+              <w:spacing w:after="20" w:line="216" w:lineRule="auto"/>
+              <w:ind w:left="-110"/>
+              <w:jc w:val="right"/>
+              <w:rPr>
+                <w:rFonts w:cs="Arial"/>
+                <w:szCs w:val="20"/>
+              </w:rPr>
+            </w:pPr>
+          </w:p>
+        </w:tc>
+        <w:tc>
+          <w:tcPr>
+            <w:tcW w:w="1135" w:type="dxa"/>
+          </w:tcPr>
+          <w:p>
+            <w:pPr>
+              <w:spacing w:after="20" w:line="216" w:lineRule="auto"/>
+              <w:jc w:val="right"/>
+              <w:rPr>
+                <w:rFonts w:cs="Arial"/>
+                <w:noProof/>
+                <w:szCs w:val="20"/>
+                <w:highlight w:val="yellow"/>
+              </w:rPr>
+            </w:pPr>
+          </w:p>
+        </w:tc>
+        <w:tc>
+          <w:tcPr>
+            <w:tcW w:w="1956" w:type="dxa"/>
+          </w:tcPr>
+          <w:p>
+            <w:pPr>
+              <w:spacing w:after="20" w:line="216" w:lineRule="auto"/>
+              <w:rPr>
+                <w:rFonts w:cs="Arial"/>
+                <w:szCs w:val="20"/>
+              </w:rPr>
+            </w:pPr>
+          </w:p>
+        </w:tc>
+      </w:tr>
+      <w:tr>
+        <w:trPr>
+          <w:gridAfter w:val="1"/>
+          <w:wAfter w:w="32" w:type="dxa"/>
+        </w:trPr>
+        <w:tc>
+          <w:tcPr>
+            <w:tcW w:w="4820" w:type="dxa"/>
+          </w:tcPr>
+          <w:p>
+            <w:pPr>
+              <w:pStyle w:val="ANGEBOTDEUTSCH"/>
+              <w:tabs>
+                <w:tab w:val="left" w:pos="4543"/>
+              </w:tabs>
+              <w:spacing w:after="20" w:line="216" w:lineRule="auto"/>
+              <w:rPr>
+                <w:rFonts w:cs="Arial"/>
+                <w:b/>
+                <w:szCs w:val="20"/>
+                <w:highlight w:val="yellow"/>
+                <w:lang w:val="de-CH"/>
+              </w:rPr>
+            </w:pPr>
+          </w:p>
+        </w:tc>
+        <w:tc>
+          <w:tcPr>
+            <w:tcW w:w="1843" w:type="dxa"/>
+          </w:tcPr>
+          <w:p>
+            <w:pPr>
+              <w:pStyle w:val="ANGEBOTDEUTSCH"/>
+              <w:tabs>
+                <w:tab w:val="left" w:pos="4543"/>
+              </w:tabs>
+              <w:spacing w:after="20" w:line="216" w:lineRule="auto"/>
+              <w:ind w:left="-110"/>
+              <w:jc w:val="right"/>
+              <w:rPr>
+                <w:rFonts w:cs="Arial"/>
+                <w:bCs/>
+                <w:szCs w:val="20"/>
+                <w:lang w:val="de-CH"/>
+              </w:rPr>
+            </w:pPr>
+          </w:p>
+        </w:tc>
+        <w:tc>
+          <w:tcPr>
+            <w:tcW w:w="1135" w:type="dxa"/>
+          </w:tcPr>
+          <w:p>
+            <w:pPr>
+              <w:pStyle w:val="ANGEBOTDEUTSCH"/>
+              <w:tabs>
+                <w:tab w:val="left" w:pos="4543"/>
+              </w:tabs>
+              <w:spacing w:after="20" w:line="216" w:lineRule="auto"/>
+              <w:jc w:val="right"/>
+              <w:rPr>
+                <w:rFonts w:cs="Arial"/>
+                <w:b/>
+                <w:szCs w:val="20"/>
+                <w:highlight w:val="yellow"/>
+                <w:lang w:val="de-CH"/>
+              </w:rPr>
+            </w:pPr>
+          </w:p>
+        </w:tc>
+        <w:tc>
+          <w:tcPr>
+            <w:tcW w:w="1956" w:type="dxa"/>
+          </w:tcPr>
+          <w:p>
+            <w:pPr>
+              <w:pStyle w:val="ANGEBOTDEUTSCH"/>
+              <w:tabs>
+                <w:tab w:val="left" w:pos="4543"/>
+              </w:tabs>
+              <w:spacing w:after="20" w:line="216" w:lineRule="auto"/>
+              <w:rPr>
+                <w:rFonts w:cs="Arial"/>
+                <w:b/>
+                <w:szCs w:val="20"/>
+                <w:lang w:val="de-CH"/>
+              </w:rPr>
+            </w:pPr>
+          </w:p>
+        </w:tc>
+      </w:tr>
+    </w:tbl>
     <w:p/>
     <w:p/>
     <w:p/>
@@ -1397,63 +2619,458 @@
     <w:p/>
     <w:p/>
     <w:p/>
-    <w:p>
-      <w:pPr>
-        <w:spacing w:after="80"/>
-      </w:pPr>
-      <w:r>
-        <w:rPr>
-          <w:b/>
-          <w:sz w:val="24"/>
-        </w:rPr>
-        <w:t xml:space="preserve">Preisübersicht</w:t>
-      </w:r>
-    </w:p>
-    <w:p>
-      <w:pPr>
-        <w:spacing w:after="80"/>
-      </w:pPr>
-      <w:r>
-        <w:rPr>
-          <w:sz w:val="20"/>
-        </w:rPr>
-        <w:t xml:space="preserve">Softwarelizenzen: {{lizenz_total_chf}}</w:t>
-      </w:r>
-    </w:p>
-    <w:p>
-      <w:pPr>
-        <w:spacing w:after="80"/>
-      </w:pPr>
-      <w:r>
-        <w:rPr>
-          <w:sz w:val="20"/>
-        </w:rPr>
-        <w:t xml:space="preserve">IT-Aufwand / Installation: {{it_total_chf}}</w:t>
-      </w:r>
-    </w:p>
-    <w:p>
-      <w:pPr>
-        <w:spacing w:after="80"/>
-      </w:pPr>
-      <w:r>
-        <w:rPr>
-          <w:b/>
-          <w:sz w:val="20"/>
-        </w:rPr>
-        <w:t xml:space="preserve">Gesamttotal exkl. MwSt.: {{gesamt_chf}}</w:t>
-      </w:r>
-    </w:p>
-    <w:p>
-      <w:pPr>
-        <w:spacing w:after="80"/>
-      </w:pPr>
-      <w:r>
-        <w:rPr>
-          <w:sz w:val="18"/>
-        </w:rPr>
-        <w:t xml:space="preserve">{{preis_hinweis}}</w:t>
-      </w:r>
-    </w:p>
+    <w:tbl>
+      <w:tblPr>
+        <w:tblStyle w:val="05Tabellenvorlage"/>
+        <w:tblW w:w="9781" w:type="dxa"/>
+        <w:tblLayout w:type="fixed"/>
+        <w:tblLook w:val="0020" w:firstRow="1" w:lastRow="0" w:firstColumn="0" w:lastColumn="0" w:noHBand="0" w:noVBand="0"/>
+      </w:tblPr>
+      <w:tblGrid>
+        <w:gridCol w:w="5678"/>
+        <w:gridCol w:w="276"/>
+        <w:gridCol w:w="719"/>
+        <w:gridCol w:w="133"/>
+        <w:gridCol w:w="861"/>
+        <w:gridCol w:w="2114"/>
+      </w:tblGrid>
+      <w:tr>
+        <w:trPr>
+          <w:cnfStyle w:val="100000000000" w:firstRow="1" w:lastRow="0" w:firstColumn="0" w:lastColumn="0" w:oddVBand="0" w:evenVBand="0" w:oddHBand="0" w:evenHBand="0" w:firstRowFirstColumn="0" w:firstRowLastColumn="0" w:lastRowFirstColumn="0" w:lastRowLastColumn="0"/>
+          <w:trHeight w:val="567"/>
+        </w:trPr>
+        <w:tc>
+          <w:tcPr>
+            <w:tcW w:w="9781" w:type="dxa"/>
+            <w:gridSpan w:val="6"/>
+            <w:tcBorders>
+              <w:top w:val="none" w:sz="0" w:space="0" w:color="auto"/>
+              <w:left w:val="none" w:sz="0" w:space="0" w:color="auto"/>
+              <w:bottom w:val="none" w:sz="0" w:space="0" w:color="auto"/>
+              <w:right w:val="none" w:sz="0" w:space="0" w:color="auto"/>
+            </w:tcBorders>
+            <w:shd w:val="clear" w:color="auto" w:fill="FFED00"/>
+          </w:tcPr>
+          <w:p>
+            <w:pPr>
+              <w:pStyle w:val="berschrift2"/>
+              <w:tabs>
+                <w:tab w:val="left" w:pos="1456"/>
+              </w:tabs>
+              <w:rPr>
+                <w:b/>
+                <w:bCs/>
+              </w:rPr>
+            </w:pPr>
+            <w:bookmarkStart w:id="1" w:name="_Toc130385211"/>
+            <w:bookmarkStart w:id="2" w:name="_Toc138164344"/>
+            <w:bookmarkStart w:id="3" w:name="_Toc176878713"/>
+            <w:r>
+              <w:rPr>
+                <w:b/>
+              </w:rPr>
+              <w:t>Zusammenfassung</w:t>
+            </w:r>
+            <w:bookmarkEnd w:id="1"/>
+            <w:bookmarkEnd w:id="2"/>
+            <w:bookmarkEnd w:id="3"/>
+          </w:p>
+        </w:tc>
+      </w:tr>
+      <w:tr>
+        <w:trPr>
+          <w:cnfStyle w:val="000000100000" w:firstRow="0" w:lastRow="0" w:firstColumn="0" w:lastColumn="0" w:oddVBand="0" w:evenVBand="0" w:oddHBand="1" w:evenHBand="0" w:firstRowFirstColumn="0" w:firstRowLastColumn="0" w:lastRowFirstColumn="0" w:lastRowLastColumn="0"/>
+        </w:trPr>
+        <w:tc>
+          <w:tcPr>
+            <w:tcW w:w="6806" w:type="dxa"/>
+            <w:gridSpan w:val="4"/>
+            <w:tcBorders>
+              <w:top w:val="none" w:sz="0" w:space="0" w:color="auto"/>
+              <w:left w:val="none" w:sz="0" w:space="0" w:color="auto"/>
+              <w:bottom w:val="none" w:sz="0" w:space="0" w:color="auto"/>
+              <w:right w:val="none" w:sz="0" w:space="0" w:color="auto"/>
+            </w:tcBorders>
+            <w:shd w:val="clear" w:color="auto" w:fill="auto"/>
+          </w:tcPr>
+          <w:p>
+            <w:pPr>
+              <w:pStyle w:val="ANGEBOTDEUTSCH"/>
+              <w:jc w:val="both"/>
+            </w:pPr>
+          </w:p>
+          <w:p>
+            <w:pPr>
+              <w:pStyle w:val="ANGEBOTDEUTSCH"/>
+              <w:jc w:val="both"/>
+            </w:pPr>
+            <w:r>
+              <w:t xml:space="preserve">Position 1 </w:t>
+            </w:r>
+            <w:r>
+              <w:t xml:space="preserve">  –  </w:t>
+            </w:r>
+            <w:r>
+              <w:t xml:space="preserve"> </w:t>
+            </w:r>
+            <w:r>
+              <w:t>Lagerlift Logimat® (SLL)</w:t>
+            </w:r>
+          </w:p>
+          <w:p>
+            <w:pPr>
+              <w:jc w:val="both"/>
+              <w:rPr>
+                <w:sz w:val="16"/>
+                <w:szCs w:val="16"/>
+              </w:rPr>
+            </w:pPr>
+          </w:p>
+        </w:tc>
+        <w:tc>
+          <w:tcPr>
+            <w:tcW w:w="2975" w:type="dxa"/>
+            <w:gridSpan w:val="2"/>
+            <w:tcBorders>
+              <w:top w:val="none" w:sz="0" w:space="0" w:color="auto"/>
+              <w:left w:val="none" w:sz="0" w:space="0" w:color="auto"/>
+              <w:bottom w:val="none" w:sz="0" w:space="0" w:color="auto"/>
+              <w:right w:val="none" w:sz="0" w:space="0" w:color="auto"/>
+            </w:tcBorders>
+            <w:shd w:val="clear" w:color="auto" w:fill="auto"/>
+          </w:tcPr>
+          <w:p>
+            <w:pPr>
+              <w:jc w:val="right"/>
+            </w:pPr>
+          </w:p>
+          <w:p>
+            <w:pPr>
+              <w:jc w:val="right"/>
+            </w:pPr>
+            <w:r>
+              <w:t>00’000.00</w:t>
+            </w:r>
+          </w:p>
+        </w:tc>
+      </w:tr>
+      <w:tr>
+        <w:trPr>
+          <w:cnfStyle w:val="000000010000" w:firstRow="0" w:lastRow="0" w:firstColumn="0" w:lastColumn="0" w:oddVBand="0" w:evenVBand="0" w:oddHBand="0" w:evenHBand="1" w:firstRowFirstColumn="0" w:firstRowLastColumn="0" w:lastRowFirstColumn="0" w:lastRowLastColumn="0"/>
+        </w:trPr>
+        <w:tc>
+          <w:tcPr>
+            <w:tcW w:w="5954" w:type="dxa"/>
+            <w:gridSpan w:val="2"/>
+            <w:tcBorders>
+              <w:top w:val="none" w:sz="0" w:space="0" w:color="auto"/>
+              <w:left w:val="none" w:sz="0" w:space="0" w:color="auto"/>
+              <w:bottom w:val="none" w:sz="0" w:space="0" w:color="auto"/>
+              <w:right w:val="none" w:sz="0" w:space="0" w:color="auto"/>
+            </w:tcBorders>
+            <w:shd w:val="clear" w:color="auto" w:fill="auto"/>
+          </w:tcPr>
+          <w:p>
+            <w:pPr>
+              <w:pStyle w:val="ANGEBOTDEUTSCH"/>
+            </w:pPr>
+            <w:r>
+              <w:t xml:space="preserve">Position 2 </w:t>
+            </w:r>
+            <w:r>
+              <w:t xml:space="preserve">  </w:t>
+            </w:r>
+            <w:r>
+              <w:t>–</w:t>
+            </w:r>
+            <w:r>
+              <w:t xml:space="preserve">  </w:t>
+            </w:r>
+            <w:r>
+              <w:t xml:space="preserve"> </w:t>
+            </w:r>
+            <w:r>
+              <w:t>Montagehilfsmittel</w:t>
+            </w:r>
+          </w:p>
+          <w:p>
+            <w:pPr>
+              <w:pStyle w:val="ANGEBOTDEUTSCH"/>
+              <w:rPr>
+                <w:sz w:val="32"/>
+                <w:szCs w:val="32"/>
+              </w:rPr>
+            </w:pPr>
+          </w:p>
+        </w:tc>
+        <w:tc>
+          <w:tcPr>
+            <w:tcW w:w="852" w:type="dxa"/>
+            <w:gridSpan w:val="2"/>
+            <w:tcBorders>
+              <w:top w:val="none" w:sz="0" w:space="0" w:color="auto"/>
+              <w:left w:val="none" w:sz="0" w:space="0" w:color="auto"/>
+              <w:bottom w:val="none" w:sz="0" w:space="0" w:color="auto"/>
+              <w:right w:val="none" w:sz="0" w:space="0" w:color="auto"/>
+            </w:tcBorders>
+            <w:shd w:val="clear" w:color="auto" w:fill="auto"/>
+          </w:tcPr>
+          <w:p>
+            <w:pPr>
+              <w:jc w:val="right"/>
+            </w:pPr>
+          </w:p>
+        </w:tc>
+        <w:tc>
+          <w:tcPr>
+            <w:tcW w:w="2975" w:type="dxa"/>
+            <w:gridSpan w:val="2"/>
+            <w:tcBorders>
+              <w:top w:val="none" w:sz="0" w:space="0" w:color="auto"/>
+              <w:left w:val="none" w:sz="0" w:space="0" w:color="auto"/>
+              <w:bottom w:val="none" w:sz="0" w:space="0" w:color="auto"/>
+              <w:right w:val="none" w:sz="0" w:space="0" w:color="auto"/>
+            </w:tcBorders>
+            <w:shd w:val="clear" w:color="auto" w:fill="auto"/>
+          </w:tcPr>
+          <w:p>
+            <w:pPr>
+              <w:jc w:val="right"/>
+            </w:pPr>
+            <w:r>
+              <w:t>0</w:t>
+            </w:r>
+            <w:r>
+              <w:t>’</w:t>
+            </w:r>
+            <w:r>
+              <w:t>0</w:t>
+            </w:r>
+            <w:r>
+              <w:t>00.00</w:t>
+            </w:r>
+          </w:p>
+        </w:tc>
+      </w:tr>
+      <w:tr>
+        <w:tblPrEx>
+          <w:tblLook w:val="0620" w:firstRow="1" w:lastRow="0" w:firstColumn="0" w:lastColumn="0" w:noHBand="1" w:noVBand="1"/>
+        </w:tblPrEx>
+        <w:trPr>
+          <w:trHeight w:val="567"/>
+        </w:trPr>
+        <w:tc>
+          <w:tcPr>
+            <w:tcW w:w="5678" w:type="dxa"/>
+            <w:vAlign w:val="center"/>
+          </w:tcPr>
+          <w:p>
+            <w:pPr>
+              <w:pStyle w:val="ANGEBOTDEUTSCH"/>
+              <w:spacing w:before="100" w:after="100"/>
+              <w:rPr>
+                <w:rFonts w:cs="Arial"/>
+                <w:b/>
+                <w:lang w:val="fr-FR"/>
+              </w:rPr>
+            </w:pPr>
+            <w:r>
+              <w:rPr>
+                <w:rFonts w:cs="Arial"/>
+                <w:b/>
+                <w:lang w:val="fr-FR"/>
+              </w:rPr>
+              <w:t xml:space="preserve">Total </w:t>
+            </w:r>
+            <w:proofErr w:type="spellStart"/>
+            <w:proofErr w:type="gramStart"/>
+            <w:r>
+              <w:rPr>
+                <w:rFonts w:cs="Arial"/>
+                <w:b/>
+                <w:lang w:val="fr-CH"/>
+              </w:rPr>
+              <w:t>netto</w:t>
+            </w:r>
+            <w:proofErr w:type="spellEnd"/>
+            <w:r>
+              <w:rPr>
+                <w:rFonts w:cs="Arial"/>
+                <w:b/>
+                <w:lang w:val="fr-FR"/>
+              </w:rPr>
+              <w:t>,</w:t>
+            </w:r>
+            <w:r>
+              <w:rPr>
+                <w:rFonts w:cs="Arial"/>
+                <w:b/>
+                <w:lang w:val="fr-CH"/>
+              </w:rPr>
+              <w:t xml:space="preserve"> </w:t>
+            </w:r>
+            <w:r>
+              <w:rPr>
+                <w:rFonts w:cs="Arial"/>
+                <w:b/>
+                <w:lang w:val="fr-CH"/>
+              </w:rPr>
+              <w:t xml:space="preserve"> </w:t>
+            </w:r>
+            <w:proofErr w:type="spellStart"/>
+            <w:r>
+              <w:rPr>
+                <w:rFonts w:cs="Arial"/>
+                <w:b/>
+                <w:lang w:val="fr-CH"/>
+              </w:rPr>
+              <w:t>montiert</w:t>
+            </w:r>
+            <w:proofErr w:type="spellEnd"/>
+            <w:r>
+              <w:rPr>
+                <w:rFonts w:cs="Arial"/>
+                <w:b/>
+                <w:lang w:val="fr-CH"/>
+              </w:rPr>
+              <w:t xml:space="preserve">, </w:t>
+            </w:r>
+            <w:r>
+              <w:rPr>
+                <w:rFonts w:cs="Arial"/>
+                <w:b/>
+                <w:lang w:val="fr-CH"/>
+              </w:rPr>
+              <w:t xml:space="preserve"> </w:t>
+            </w:r>
+            <w:proofErr w:type="spellStart"/>
+            <w:r>
+              <w:rPr>
+                <w:rFonts w:cs="Arial"/>
+                <w:b/>
+                <w:lang w:val="fr-CH"/>
+              </w:rPr>
+              <w:t>ex</w:t>
+            </w:r>
+            <w:r>
+              <w:rPr>
+                <w:rFonts w:cs="Arial"/>
+                <w:b/>
+                <w:lang w:val="fr-CH"/>
+              </w:rPr>
+              <w:t>kl</w:t>
+            </w:r>
+            <w:proofErr w:type="spellEnd"/>
+            <w:proofErr w:type="gramEnd"/>
+            <w:r>
+              <w:rPr>
+                <w:rFonts w:cs="Arial"/>
+                <w:b/>
+                <w:lang w:val="fr-CH"/>
+              </w:rPr>
+              <w:t>. M</w:t>
+            </w:r>
+            <w:r>
+              <w:rPr>
+                <w:rFonts w:cs="Arial"/>
+                <w:b/>
+                <w:lang w:val="fr-CH"/>
+              </w:rPr>
+              <w:t>wSt.</w:t>
+            </w:r>
+          </w:p>
+        </w:tc>
+        <w:tc>
+          <w:tcPr>
+            <w:tcW w:w="995" w:type="dxa"/>
+            <w:gridSpan w:val="2"/>
+          </w:tcPr>
+          <w:p>
+            <w:pPr>
+              <w:spacing w:before="100" w:after="100"/>
+              <w:rPr>
+                <w:rFonts w:cs="Arial"/>
+                <w:b/>
+                <w:lang w:val="fr-FR"/>
+              </w:rPr>
+            </w:pPr>
+          </w:p>
+        </w:tc>
+        <w:tc>
+          <w:tcPr>
+            <w:tcW w:w="994" w:type="dxa"/>
+            <w:gridSpan w:val="2"/>
+          </w:tcPr>
+          <w:p>
+            <w:pPr>
+              <w:spacing w:before="100" w:after="100"/>
+              <w:jc w:val="right"/>
+              <w:rPr>
+                <w:rFonts w:cs="Arial"/>
+                <w:b/>
+                <w:lang w:val="fr-FR"/>
+              </w:rPr>
+            </w:pPr>
+          </w:p>
+        </w:tc>
+        <w:tc>
+          <w:tcPr>
+            <w:tcW w:w="2114" w:type="dxa"/>
+            <w:tcBorders>
+              <w:top w:val="single" w:sz="6" w:space="0" w:color="auto"/>
+              <w:bottom w:val="double" w:sz="6" w:space="0" w:color="auto"/>
+            </w:tcBorders>
+            <w:vAlign w:val="center"/>
+          </w:tcPr>
+          <w:p>
+            <w:pPr>
+              <w:spacing w:before="100" w:after="100"/>
+              <w:jc w:val="right"/>
+              <w:rPr>
+                <w:rFonts w:cs="Arial"/>
+                <w:b/>
+                <w:lang w:val="fr-CH"/>
+              </w:rPr>
+            </w:pPr>
+            <w:r>
+              <w:rPr>
+                <w:rFonts w:cs="Arial"/>
+                <w:b/>
+              </w:rPr>
+              <w:t xml:space="preserve">CHF  </w:t>
+            </w:r>
+            <w:r>
+              <w:rPr>
+                <w:rFonts w:cs="Arial"/>
+                <w:b/>
+              </w:rPr>
+              <w:t xml:space="preserve">        </w:t>
+            </w:r>
+            <w:r>
+              <w:rPr>
+                <w:rFonts w:cs="Arial"/>
+                <w:b/>
+              </w:rPr>
+              <w:t>00</w:t>
+            </w:r>
+            <w:r>
+              <w:rPr>
+                <w:rFonts w:cs="Arial"/>
+                <w:b/>
+              </w:rPr>
+              <w:t>’</w:t>
+            </w:r>
+            <w:r>
+              <w:rPr>
+                <w:rFonts w:cs="Arial"/>
+                <w:b/>
+              </w:rPr>
+              <w:t>000.00</w:t>
+            </w:r>
+          </w:p>
+        </w:tc>
+      </w:tr>
+    </w:tbl>
     <w:p/>
     <w:p/>
     <w:p/>
@@ -10229,10 +11846,42 @@
               </w:tabs>
               <w:ind w:left="-113"/>
             </w:pPr>
-            <w:r>
-              <w:rPr/>
-              <w:t xml:space="preserve">{{ssi_kontakt_1_name}}</w:t>
-            </w:r>
+            <w:sdt>
+              <w:sdtPr>
+                <w:rPr>
+                  <w:lang w:val="en-US"/>
+                </w:rPr>
+                <w:alias w:val="Unterschrift links"/>
+                <w:tag w:val="Unterschrift links"/>
+                <w:id w:val="-1575344139"/>
+                <w:placeholder>
+                  <w:docPart w:val="11AA91039777456BB6605DDA2B1BE627"/>
+                </w:placeholder>
+                <w:showingPlcHdr/>
+                <w:dropDownList>
+                  <w:listItem w:value="Wählen Sie ein Element aus."/>
+                  <w:listItem w:displayText="Florian Brunner" w:value="Florian Brunner"/>
+                  <w:listItem w:displayText="Luca Cathomen" w:value="Luca Cathomen"/>
+                  <w:listItem w:displayText="Peter Hansen" w:value="Peter Hansen"/>
+                  <w:listItem w:displayText="Armin Kaufmann" w:value="Armin Kaufmann"/>
+                  <w:listItem w:displayText="Marc Mangold" w:value="Marc Mangold"/>
+                  <w:listItem w:displayText="Rudolf Mayer-Richert" w:value="Rudolf Mayer-Richert"/>
+                  <w:listItem w:displayText="Oliver Meyer" w:value="Oliver Meyer"/>
+                  <w:listItem w:displayText="Michael Preisig" w:value="Michael Preisig"/>
+                  <w:listItem w:displayText="Andrej Pulfer" w:value="Andrej Pulfer"/>
+                  <w:listItem w:displayText="Simon Rüede" w:value="Simon Rüede"/>
+                  <w:listItem w:displayText="Daniel Urech" w:value="Daniel Urech"/>
+                </w:dropDownList>
+              </w:sdtPr>
+              <w:sdtContent>
+                <w:r>
+                  <w:rPr>
+                    <w:rStyle w:val="Platzhaltertext"/>
+                  </w:rPr>
+                  <w:t>Wählen Sie ein Element aus.</w:t>
+                </w:r>
+              </w:sdtContent>
+            </w:sdt>
           </w:p>
           <w:sdt>
             <w:sdtPr>
@@ -10253,8 +11902,10 @@
                   <w:ind w:left="-113"/>
                 </w:pPr>
                 <w:r>
-                  <w:rPr/>
-                  <w:t xml:space="preserve">{{ssi_kontakt_1_position}}</w:t>
+                  <w:rPr>
+                    <w:rStyle w:val="Platzhaltertext"/>
+                  </w:rPr>
+                  <w:t>Klicken oder tippen Sie hier, um Text einzugeben.</w:t>
                 </w:r>
               </w:p>
             </w:sdtContent>
@@ -10270,10 +11921,44 @@
                 <w:tab w:val="left" w:pos="5670"/>
               </w:tabs>
             </w:pPr>
-            <w:r>
-              <w:rPr/>
-              <w:t xml:space="preserve">{{ssi_kontakt_1_name}}</w:t>
-            </w:r>
+            <w:sdt>
+              <w:sdtPr>
+                <w:alias w:val="Unterschrift rechts"/>
+                <w:tag w:val="Unterschrift rechts"/>
+                <w:id w:val="782238394"/>
+                <w:placeholder>
+                  <w:docPart w:val="6302D71F33D84563BD7004445D965C1E"/>
+                </w:placeholder>
+                <w:showingPlcHdr/>
+                <w:dropDownList>
+                  <w:listItem w:value="Wählen Sie ein Element aus."/>
+                  <w:listItem w:displayText="Adrian Bollinger" w:value="Adrian Bollinger"/>
+                  <w:listItem w:displayText="Florian Brunner" w:value="Florian Brunner"/>
+                  <w:listItem w:displayText="Luca Cathomen" w:value="Luca Cathomen"/>
+                  <w:listItem w:displayText="Mario Gisler" w:value="Mario Gisler"/>
+                  <w:listItem w:displayText="Peter Hansen" w:value="Peter Hansen"/>
+                  <w:listItem w:displayText="Armin Kaufmann" w:value="Armin Kaufmann"/>
+                  <w:listItem w:displayText="Marc Mangold" w:value="Marc Mangold"/>
+                  <w:listItem w:displayText="Rudolf Mayer-Richert" w:value="Rudolf Mayer-Richert"/>
+                  <w:listItem w:displayText="Oliver Meyer" w:value="Oliver Meyer"/>
+                  <w:listItem w:displayText="Andrea Micanovic" w:value="Andrea Micanovic"/>
+                  <w:listItem w:displayText="Michael Preisig" w:value="Michael Preisig"/>
+                  <w:listItem w:displayText="Andrej Pulfer" w:value="Andrej Pulfer"/>
+                  <w:listItem w:displayText="Ursina Reich" w:value="Ursina Reich"/>
+                  <w:listItem w:displayText="Simon Rüede" w:value="Simon Rüede"/>
+                  <w:listItem w:displayText="Daniel Urech" w:value="Daniel Urech"/>
+                  <w:listItem w:displayText="Annina Zancanaro" w:value="Annina Zancanaro"/>
+                </w:dropDownList>
+              </w:sdtPr>
+              <w:sdtContent>
+                <w:r>
+                  <w:rPr>
+                    <w:rStyle w:val="Platzhaltertext"/>
+                  </w:rPr>
+                  <w:t>Wählen Sie ein Element aus.</w:t>
+                </w:r>
+              </w:sdtContent>
+            </w:sdt>
           </w:p>
           <w:p>
             <w:pPr>
@@ -10281,10 +11966,25 @@
                 <w:tab w:val="left" w:pos="5670"/>
               </w:tabs>
             </w:pPr>
-            <w:r>
-              <w:rPr/>
-              <w:t xml:space="preserve">{{ssi_kontakt_1_position}}</w:t>
-            </w:r>
+            <w:sdt>
+              <w:sdtPr>
+                <w:alias w:val="Funktion rechts"/>
+                <w:tag w:val="Funktion rechts"/>
+                <w:id w:val="264513574"/>
+                <w:placeholder>
+                  <w:docPart w:val="52048806D0E240A0BB0D0007E64DB55E"/>
+                </w:placeholder>
+                <w:showingPlcHdr/>
+              </w:sdtPr>
+              <w:sdtContent>
+                <w:r>
+                  <w:rPr>
+                    <w:rStyle w:val="Platzhaltertext"/>
+                  </w:rPr>
+                  <w:t>Klicken oder tippen Sie hier, um Text einzugeben.</w:t>
+                </w:r>
+              </w:sdtContent>
+            </w:sdt>
           </w:p>
         </w:tc>
       </w:tr>

</xml_diff>

<commit_message>
Add selectable SSI contacts for cover and signature page
Two dropdowns (from Logimat name lists) drive Cover SSI partners and
closing signatories with name, title, email and phone. Word export fills
the existing content-control dropdowns; catalog lives in ssi_contacts.json.

Co-authored-by: msobona <msobona@users.noreply.github.com>
</commit_message>
<xml_diff>
--- a/docs/templates/Angebot Logimat DE.docx
+++ b/docs/templates/Angebot Logimat DE.docx
@@ -498,7 +498,7 @@
             </w:pPr>
             <w:r>
               <w:rPr/>
-              <w:t xml:space="preserve">Telefon: {{telefon}}</w:t>
+              <w:t xml:space="preserve">Telefon: {{ssi_kontakt_1_telefon}}</w:t>
             </w:r>
           </w:p>
         </w:tc>
@@ -611,7 +611,7 @@
             </w:pPr>
             <w:r>
               <w:rPr/>
-              <w:t xml:space="preserve">Telefon: {{telefon}}</w:t>
+              <w:t xml:space="preserve">Telefon: {{ssi_kontakt_2_telefon}}</w:t>
             </w:r>
           </w:p>
         </w:tc>

</xml_diff>

<commit_message>
Restore Logimat cover image; spacious options table on offer board
Re-attach the full-page cover photo in the Word template (media was
present but unreferenced). HTML offer board lists each selected option
as its own roomy table row plus license total; print CSS keeps the cover visible.

Co-authored-by: msobona <msobona@users.noreply.github.com>
</commit_message>
<xml_diff>
--- a/docs/templates/Angebot Logimat DE.docx
+++ b/docs/templates/Angebot Logimat DE.docx
@@ -2,6 +2,76 @@
 <file path=word/document.xml><?xml version="1.0" encoding="utf-8"?>
 <w:document xmlns:wpc="http://schemas.microsoft.com/office/word/2010/wordprocessingCanvas" xmlns:cx="http://schemas.microsoft.com/office/drawing/2014/chartex" xmlns:cx1="http://schemas.microsoft.com/office/drawing/2015/9/8/chartex" xmlns:cx2="http://schemas.microsoft.com/office/drawing/2015/10/21/chartex" xmlns:cx3="http://schemas.microsoft.com/office/drawing/2016/5/9/chartex" xmlns:cx4="http://schemas.microsoft.com/office/drawing/2016/5/10/chartex" xmlns:cx5="http://schemas.microsoft.com/office/drawing/2016/5/11/chartex" xmlns:cx6="http://schemas.microsoft.com/office/drawing/2016/5/12/chartex" xmlns:cx7="http://schemas.microsoft.com/office/drawing/2016/5/13/chartex" xmlns:cx8="http://schemas.microsoft.com/office/drawing/2016/5/14/chartex" xmlns:mc="http://schemas.openxmlformats.org/markup-compatibility/2006" xmlns:aink="http://schemas.microsoft.com/office/drawing/2016/ink" xmlns:am3d="http://schemas.microsoft.com/office/drawing/2017/model3d" xmlns:o="urn:schemas-microsoft-com:office:office" xmlns:oel="http://schemas.microsoft.com/office/2019/extlst" xmlns:r="http://schemas.openxmlformats.org/officeDocument/2006/relationships" xmlns:m="http://schemas.openxmlformats.org/officeDocument/2006/math" xmlns:v="urn:schemas-microsoft-com:vml" xmlns:wp14="http://schemas.microsoft.com/office/word/2010/wordprocessingDrawing" xmlns:wp="http://schemas.openxmlformats.org/drawingml/2006/wordprocessingDrawing" xmlns:w10="urn:schemas-microsoft-com:office:word" xmlns:w="http://schemas.openxmlformats.org/wordprocessingml/2006/main" xmlns:w14="http://schemas.microsoft.com/office/word/2010/wordml" xmlns:w15="http://schemas.microsoft.com/office/word/2012/wordml" xmlns:w16cex="http://schemas.microsoft.com/office/word/2018/wordml/cex" xmlns:w16cid="http://schemas.microsoft.com/office/word/2016/wordml/cid" xmlns:w16="http://schemas.microsoft.com/office/word/2018/wordml" xmlns:w16du="http://schemas.microsoft.com/office/word/2023/wordml/word16du" xmlns:w16sdtdh="http://schemas.microsoft.com/office/word/2020/wordml/sdtdatahash" xmlns:w16sdtfl="http://schemas.microsoft.com/office/word/2024/wordml/sdtformatlock" xmlns:w16se="http://schemas.microsoft.com/office/word/2015/wordml/symex" xmlns:wpg="http://schemas.microsoft.com/office/word/2010/wordprocessingGroup" xmlns:wpi="http://schemas.microsoft.com/office/word/2010/wordprocessingInk" xmlns:wne="http://schemas.microsoft.com/office/word/2006/wordml" xmlns:wps="http://schemas.microsoft.com/office/word/2010/wordprocessingShape" mc:Ignorable="w14 w15 w16se w16cid w16 w16cex w16sdtdh w16sdtfl w16du wp14">
   <w:body>
+    <w:p>
+      <w:pPr>
+        <w:rPr>
+          <w:noProof/>
+        </w:rPr>
+      </w:pPr>
+      <w:r>
+        <w:rPr>
+          <w:noProof/>
+        </w:rPr>
+        <w:drawing>
+          <wp:anchor distT="0" distB="0" distL="114300" distR="114300" simplePos="0" relativeHeight="251632127" behindDoc="1" locked="0" layoutInCell="1" allowOverlap="1" wp14:anchorId="307E5AE9" wp14:editId="3EF8594B">
+            <wp:simplePos x="0" y="0"/>
+            <wp:positionH relativeFrom="leftMargin">
+              <wp:posOffset>5080</wp:posOffset>
+            </wp:positionH>
+            <wp:positionV relativeFrom="paragraph">
+              <wp:posOffset>-2260287</wp:posOffset>
+            </wp:positionV>
+            <wp:extent cx="7560000" cy="10674000"/>
+            <wp:effectExtent l="0" t="0" r="3175" b="0"/>
+            <wp:wrapNone/>
+            <wp:docPr id="18" name="Grafik 18" descr="C:\Users\johunwu\AppData\Local\Microsoft\Windows\INetCache\Content.Word\SLL_Titelmotiv.jpg"/>
+            <wp:cNvGraphicFramePr/>
+            <a:graphic xmlns:a="http://schemas.openxmlformats.org/drawingml/2006/main">
+              <a:graphicData uri="http://schemas.openxmlformats.org/drawingml/2006/picture">
+                <pic:pic xmlns:pic="http://schemas.openxmlformats.org/drawingml/2006/picture">
+                  <pic:nvPicPr>
+                    <pic:cNvPr id="40" name="Grafik 40" descr="C:\Users\johunwu\AppData\Local\Microsoft\Windows\INetCache\Content.Word\SLL_Titelmotiv.jpg"/>
+                    <pic:cNvPicPr/>
+                  </pic:nvPicPr>
+                  <pic:blipFill>
+                    <a:blip r:embed="rId11" cstate="print">
+                      <a:extLst>
+                        <a:ext uri="{28A0092B-C50C-407E-A947-70E740481C1C}">
+                          <a14:useLocalDpi xmlns:a14="http://schemas.microsoft.com/office/drawing/2010/main" val="0"/>
+                        </a:ext>
+                      </a:extLst>
+                    </a:blip>
+                    <a:srcRect/>
+                    <a:stretch>
+                      <a:fillRect/>
+                    </a:stretch>
+                  </pic:blipFill>
+                  <pic:spPr bwMode="auto">
+                    <a:xfrm>
+                      <a:off x="0" y="0"/>
+                      <a:ext cx="7560000" cy="10674000"/>
+                    </a:xfrm>
+                    <a:prstGeom prst="rect">
+                      <a:avLst/>
+                    </a:prstGeom>
+                    <a:noFill/>
+                    <a:ln>
+                      <a:noFill/>
+                    </a:ln>
+                  </pic:spPr>
+                </pic:pic>
+              </a:graphicData>
+            </a:graphic>
+            <wp14:sizeRelH relativeFrom="page">
+              <wp14:pctWidth>0</wp14:pctWidth>
+            </wp14:sizeRelH>
+            <wp14:sizeRelV relativeFrom="page">
+              <wp14:pctHeight>0</wp14:pctHeight>
+            </wp14:sizeRelV>
+          </wp:anchor>
+        </w:drawing>
+      </w:r>
+    </w:p>
     <w:p>
       <w:pPr>
         <w:rPr>

</xml_diff>

<commit_message>
Add WAMAS software logo to the offer cover
Place the black/red WAMAS mark top-left on the HTML cover (SSI stays
top-right) and embed the same logo on the Word Logimat title page.

Co-authored-by: msobona <msobona@users.noreply.github.com>
</commit_message>
<xml_diff>
--- a/docs/templates/Angebot Logimat DE.docx
+++ b/docs/templates/Angebot Logimat DE.docx
@@ -84,6 +84,66 @@
       </w:r>
     </w:p>
     <w:p>
+      <w:r>
+        <w:rPr>
+          <w:noProof/>
+        </w:rPr>
+        <w:drawing>
+          <wp:anchor distT="0" distB="0" distL="114300" distR="114300" simplePos="0" relativeHeight="251730944" behindDoc="0" locked="0" layoutInCell="1" allowOverlap="1" wp14:anchorId="25AC9053" wp14:editId="68297DF7">
+            <wp:simplePos x="0" y="0"/>
+            <wp:positionH relativeFrom="page">
+              <wp:posOffset>360000</wp:posOffset>
+            </wp:positionH>
+            <wp:positionV relativeFrom="page">
+              <wp:posOffset>288000</wp:posOffset>
+            </wp:positionV>
+            <wp:extent cx="2088000" cy="884401"/>
+            <wp:effectExtent l="0" t="0" r="0" b="635"/>
+            <wp:wrapNone/>
+            <wp:docPr id="101" name="WAMAS Logo" descr="WAMAS Software Logo"/>
+            <wp:cNvGraphicFramePr>
+              <a:graphicFrameLocks xmlns:a="http://schemas.openxmlformats.org/drawingml/2006/main" noChangeAspect="1"/>
+            </wp:cNvGraphicFramePr>
+            <a:graphic xmlns:a="http://schemas.openxmlformats.org/drawingml/2006/main">
+              <a:graphicData uri="http://schemas.openxmlformats.org/drawingml/2006/picture">
+                <pic:pic xmlns:pic="http://schemas.openxmlformats.org/drawingml/2006/picture">
+                  <pic:nvPicPr>
+                    <pic:cNvPr id="3" name="Grafik 3" descr="Ein Bild, das Text, ClipArt enthält.&#10;&#10;Automatisch generierte Beschreibung"/>
+                    <pic:cNvPicPr/>
+                  </pic:nvPicPr>
+                  <pic:blipFill>
+                    <a:blip r:embed="rId24">
+                      <a:extLst>
+                        <a:ext uri="{28A0092B-C50C-407E-A947-70E740481C1C}">
+                          <a14:useLocalDpi xmlns:a14="http://schemas.microsoft.com/office/drawing/2010/main" val="0"/>
+                        </a:ext>
+                      </a:extLst>
+                    </a:blip>
+                    <a:stretch>
+                      <a:fillRect/>
+                    </a:stretch>
+                  </pic:blipFill>
+                  <pic:spPr>
+                    <a:xfrm>
+                      <a:off x="0" y="0"/>
+                      <a:ext cx="2088000" cy="884401"/>
+                    </a:xfrm>
+                    <a:prstGeom prst="rect">
+                      <a:avLst/>
+                    </a:prstGeom>
+                  </pic:spPr>
+                </pic:pic>
+              </a:graphicData>
+            </a:graphic>
+            <wp14:sizeRelH relativeFrom="margin">
+              <wp14:pctWidth>0</wp14:pctWidth>
+            </wp14:sizeRelH>
+            <wp14:sizeRelV relativeFrom="margin">
+              <wp14:pctHeight>0</wp14:pctHeight>
+            </wp14:sizeRelV>
+          </wp:anchor>
+        </w:drawing>
+      </w:r>
       <w:r>
         <w:rPr>
           <w:noProof/>

</xml_diff>